<commit_message>
vault backup: 2026-06-16 16:58:14, Nombre de fichiers envoyés : 4, Fichiers envoyés : M .obsidian/workspace.json Projets/En cours/Apix Analytics/.~lock.Rapport de stage.docx# Projets/En cours/Apix Analytics/Rapport de stage.docx Projets/En cours/Apix Analytics/Rapport de stage.md
</commit_message>
<xml_diff>
--- a/Projets/En cours/Apix Analytics/Rapport de stage.docx
+++ b/Projets/En cours/Apix Analytics/Rapport de stage.docx
@@ -112,7 +112,7 @@
           <w:szCs w:val="23"/>
           <w:rFonts w:ascii="Times New Roman" w:cs="Times New Roman" w:eastAsia="Times New Roman" w:hAnsi="Times New Roman"/>
         </w:rPr>
-        <w:t xml:space="preserve">Année Universitaire : 2026</w:t>
+        <w:t xml:space="preserve">Année Universitaire : 2025-2026</w:t>
       </w:r>
       <w:r>
         <w:br/>
@@ -211,7 +211,7 @@
           <w:szCs w:val="23"/>
           <w:rFonts w:ascii="Times New Roman" w:cs="Times New Roman" w:eastAsia="Times New Roman" w:hAnsi="Times New Roman"/>
         </w:rPr>
-        <w:t xml:space="preserve">Jean Dupont</w:t>
+        <w:t xml:space="preserve">Thomas Venouil</w:t>
       </w:r>
       <w:r>
         <w:rPr>
@@ -413,7 +413,7 @@
           <w:szCs w:val="23"/>
           <w:rFonts w:ascii="Times New Roman" w:cs="Times New Roman" w:eastAsia="Times New Roman" w:hAnsi="Times New Roman"/>
         </w:rPr>
-        <w:t xml:space="preserve">Du 23 mars au 27 juin 2026, j'ai réalisé mon stage de fin d'études au sein d'APIX Analytics, une PME grenobloise spécialisée dans la conception, la fabrication et la commercialisation d'analyseurs de gaz chromatographiques industriels. Déployés sur des sites industriels critiques, ces analyseurs communiquent avec les systèmes de leurs clients via le protocole Modbus, un standard de communication industriel. La configuration de cette communication repose sur deux fichiers de paramètres au format JSON, </w:t>
+        <w:t xml:space="preserve">Du 23 mars au 27 juin 2026, j'ai réalisé mon stage de fin d'études au sein d'APIX Analytics, une PME (petite et moyenne entreprise) grenobloise spécialisée dans la conception, la fabrication et la commercialisation d'analyseurs de gaz chromatographiques industriels. Déployés sur des sites industriels critiques, ces analyseurs communiquent avec les systèmes de leurs clients via le protocole Modbus (cf. glossaire), un standard de communication industriel. La configuration de cette communication repose sur deux fichiers de paramètres au format JSON, </w:t>
       </w:r>
       <w:r>
         <w:rPr>
@@ -577,79 +577,43 @@
           <w:szCs w:val="23"/>
           <w:rFonts w:ascii="Times New Roman" w:cs="Times New Roman" w:eastAsia="Times New Roman" w:hAnsi="Times New Roman"/>
         </w:rPr>
-        <w:t xml:space="preserve">APIX Analytics est une entreprise grenobloise spécialisée dans la conception, la fabrication et la commercialisation d'analyseurs de gaz chromatographiques industriels. Sa particularité tient à une intégration verticale complète : elle maîtrise à la fois le matériel — l'analyseur et son détecteur chromatographique — et le logiciel qui le pilote, l'ensemble de la PixL Suite étant développé en interne. Ce développement conjoint par la même équipe constitue un atout différenciant : il permet une intégration poussée et une grande réactivité pour adapter le logiciel aux évolutions de l'analyseur.</w:t>
-      </w:r>
-    </w:p>
-    <w:p>
-      <w:pPr>
-        <w:spacing w:after="200"/>
-      </w:pPr>
-      <w:r>
-        <w:rPr>
-          <w:b w:val="false"/>
-          <w:bCs w:val="false"/>
-          <w:i w:val="false"/>
-          <w:iCs w:val="false"/>
-          <w:color w:val="1b1c22"/>
-          <w:sz w:val="23"/>
-          <w:szCs w:val="23"/>
-          <w:rFonts w:ascii="Times New Roman" w:cs="Times New Roman" w:eastAsia="Times New Roman" w:hAnsi="Times New Roman"/>
-        </w:rPr>
-        <w:t xml:space="preserve">Il s'agit d'une PME à taille humaine, dont l'équipe de développement compte moins de cinq personnes. Cette taille réduite implique une forte polyvalence : chaque développeur intervient sur l'ensemble de la pile logicielle, du bas niveau embarqué jusqu'aux interfaces web, et change régulièrement de sujet — une diversité à la fois formatrice et exigeante en capacités d'adaptation.</w:t>
-      </w:r>
-    </w:p>
-    <w:p>
-      <w:pPr>
-        <w:spacing w:after="200"/>
-      </w:pPr>
-      <w:r>
-        <w:rPr>
-          <w:b w:val="false"/>
-          <w:bCs w:val="false"/>
-          <w:i w:val="false"/>
-          <w:iCs w:val="false"/>
-          <w:color w:val="1b1c22"/>
-          <w:sz w:val="23"/>
-          <w:szCs w:val="23"/>
-          <w:rFonts w:ascii="Times New Roman" w:cs="Times New Roman" w:eastAsia="Times New Roman" w:hAnsi="Times New Roman"/>
-        </w:rPr>
-        <w:t xml:space="preserve">L'activité de l'entreprise répond à un besoin précis : déterminer en continu et avec précision la composition d'un mélange gazeux directement sur le terrain. Cette mesure trouve plusieurs applications. La principale est l'analyse du gaz naturel sur les réseaux de transport et de distribution, où la composition du gaz détermine sa valeur énergétique — pouvoir calorifique, indice de Wobbe — dont dépend directement la facturation, ce qui en fait une exigence à la fois commerciale et réglementaire. À cela s'ajoute le contrôle qualité des gaz renouvelables, biométhane et biogaz, avant leur injection dans le réseau : une application en pleine croissance, portée par la transition énergétique et adressée par la gamme dédiée GREENPIX. Plus largement, les analyseurs servent aussi à la surveillance de procédés industriels nécessitant un suivi de composition gazeuse en ligne.</w:t>
-      </w:r>
-    </w:p>
-    <w:p>
-      <w:pPr>
-        <w:spacing w:after="200"/>
-      </w:pPr>
-      <w:r>
-        <w:rPr>
-          <w:b w:val="false"/>
-          <w:bCs w:val="false"/>
-          <w:i w:val="false"/>
-          <w:iCs w:val="false"/>
-          <w:color w:val="1b1c22"/>
-          <w:sz w:val="23"/>
-          <w:szCs w:val="23"/>
-          <w:rFonts w:ascii="Times New Roman" w:cs="Times New Roman" w:eastAsia="Times New Roman" w:hAnsi="Times New Roman"/>
-        </w:rPr>
-        <w:t xml:space="preserve">Dans tous les cas, ces analyseurs sont déployés sur des sites industriels critiques, où ils fonctionnent en continu et dans des environnements parfois difficiles ; la fiabilité, la précision et la continuité de service n'y sont pas négociables, car une erreur de mesure ou une défaillance peut avoir des conséquences directes sur la facturation, la sécurité ou la conformité réglementaire. Les clients d'APIX sont ainsi principalement des opérateurs de réseaux de transport et de distribution de gaz naturel, des producteurs et injecteurs de gaz renouvelables (biométhane, biogaz), ainsi que des industriels exploitant des procédés qui nécessitent un suivi en ligne de la composition gazeuse.</w:t>
-      </w:r>
-    </w:p>
-    <w:p>
-      <w:pPr>
-        <w:spacing w:after="200"/>
-      </w:pPr>
-      <w:r>
-        <w:rPr>
-          <w:b w:val="false"/>
-          <w:bCs w:val="false"/>
-          <w:i w:val="false"/>
-          <w:iCs w:val="false"/>
-          <w:color w:val="1b1c22"/>
-          <w:sz w:val="23"/>
-          <w:szCs w:val="23"/>
-          <w:rFonts w:ascii="Times New Roman" w:cs="Times New Roman" w:eastAsia="Times New Roman" w:hAnsi="Times New Roman"/>
-        </w:rPr>
-        <w:t xml:space="preserve">Le marché de l'analyse de gaz par chromatographie en ligne est historiquement occupé par de grands groupes généralistes de l'instrumentation industrielle, qui proposent ces analyseurs au sein de catalogues très étendus. Face à eux, APIX Analytics se positionne comme un acteur spécialisé et agile, dont les principaux facteurs de différenciation sont la maîtrise intégrée du matériel et du logiciel, la capacité à faire évoluer rapidement ses produits et l'investissement sur les gaz renouvelables.</w:t>
+        <w:t xml:space="preserve">APIX Analytics est une entreprise grenobloise spécialisée dans la conception, la fabrication et la commercialisation d'analyseurs de gaz chromatographiques industriels. Sa particularité tient à une intégration verticale complète : elle maîtrise à la fois le matériel — l'analyseur et son détecteur chromatographique — et le logiciel qui le pilote, l'ensemble de la PixL Suite étant développé en interne. PME à taille humaine (moins de cinq développeurs), elle impose une forte polyvalence : chacun intervient sur toute la pile logicielle, du bas niveau embarqué jusqu'aux interfaces web — une diversité à la fois formatrice et exigeante.</w:t>
+      </w:r>
+    </w:p>
+    <w:p>
+      <w:pPr>
+        <w:spacing w:after="200"/>
+      </w:pPr>
+      <w:r>
+        <w:rPr>
+          <w:b w:val="false"/>
+          <w:bCs w:val="false"/>
+          <w:i w:val="false"/>
+          <w:iCs w:val="false"/>
+          <w:color w:val="1b1c22"/>
+          <w:sz w:val="23"/>
+          <w:szCs w:val="23"/>
+          <w:rFonts w:ascii="Times New Roman" w:cs="Times New Roman" w:eastAsia="Times New Roman" w:hAnsi="Times New Roman"/>
+        </w:rPr>
+        <w:t xml:space="preserve">L'activité répond à un besoin précis : déterminer en continu et avec précision la composition d'un mélange gazeux directement sur le terrain. L'application principale est l'analyse du gaz naturel sur les réseaux de transport et de distribution, où la composition détermine la valeur énergétique du gaz (pouvoir calorifique, indice de Wobbe) dont dépend la facturation — une exigence à la fois commerciale et réglementaire. S'y ajoutent le contrôle qualité des gaz renouvelables (biométhane, biogaz) avant injection dans le réseau, porté par la gamme GREENPIX et par la transition énergétique, ainsi que la surveillance de procédés industriels. Dans tous les cas, ces analyseurs équipent des sites industriels critiques, où la fiabilité, la précision et la continuité de service ne sont pas négociables : une erreur de mesure peut avoir des conséquences directes sur la facturation, la sécurité ou la conformité réglementaire.</w:t>
+      </w:r>
+    </w:p>
+    <w:p>
+      <w:pPr>
+        <w:spacing w:after="200"/>
+      </w:pPr>
+      <w:r>
+        <w:rPr>
+          <w:b w:val="false"/>
+          <w:bCs w:val="false"/>
+          <w:i w:val="false"/>
+          <w:iCs w:val="false"/>
+          <w:color w:val="1b1c22"/>
+          <w:sz w:val="23"/>
+          <w:szCs w:val="23"/>
+          <w:rFonts w:ascii="Times New Roman" w:cs="Times New Roman" w:eastAsia="Times New Roman" w:hAnsi="Times New Roman"/>
+        </w:rPr>
+        <w:t xml:space="preserve">Sur un marché historiquement occupé par de grands groupes généralistes de l'instrumentation, APIX se positionne comme un acteur spécialisé et agile, dont les facteurs de différenciation sont la maîtrise intégrée du matériel et du logiciel, la réactivité produit et l'investissement sur les gaz renouvelables.</w:t>
       </w:r>
     </w:p>
     <w:p/>
@@ -1089,7 +1053,7 @@
           <w:szCs w:val="23"/>
           <w:rFonts w:ascii="Times New Roman" w:cs="Times New Roman" w:eastAsia="Times New Roman" w:hAnsi="Times New Roman"/>
         </w:rPr>
-        <w:t xml:space="preserve">Figure 1 — Architecture de la PixL Suite : PixL Modbus, PixL Core, PixL API et la base PixL DB communiquent entre eux ; PixL Expert (en jaune), l'interface Vue.js, constitue le périmètre du stage.</w:t>
+        <w:t xml:space="preserve">Figure 1 : Architecture de la PixL Suite : PixL Modbus, PixL Core, PixL API et la base PixL DB communiquent entre eux ; PixL Expert (en jaune), l'interface Vue.js, constitue le périmètre du stage.</w:t>
       </w:r>
     </w:p>
     <w:p>
@@ -1131,7 +1095,7 @@
           <w:szCs w:val="23"/>
           <w:rFonts w:ascii="Times New Roman" w:cs="Times New Roman" w:eastAsia="Times New Roman" w:hAnsi="Times New Roman"/>
         </w:rPr>
-        <w:t xml:space="preserve"> est un ensemble de logiciels interdépendants qui pilotent intégralement les analyseurs APIX. Elle couvre l'intégralité de la chaîne de traitement, depuis l'acquisition des signaux physiques bruts produits par le détecteur chromatographique, jusqu'à la présentation des résultats aux opérateurs et à la communication avec les systèmes industriels environnants.</w:t>
+        <w:t xml:space="preserve"> (voir Figure 1) est un ensemble de logiciels interdépendants qui pilotent intégralement les analyseurs APIX. Elle couvre l'intégralité de la chaîne de traitement, depuis l'acquisition des signaux physiques bruts produits par le détecteur chromatographique, jusqu'à la présentation des résultats aux opérateurs et à la communication avec les systèmes industriels environnants.</w:t>
       </w:r>
     </w:p>
     <w:p>
@@ -1173,7 +1137,7 @@
           <w:szCs w:val="23"/>
           <w:rFonts w:ascii="Times New Roman" w:cs="Times New Roman" w:eastAsia="Times New Roman" w:hAnsi="Times New Roman"/>
         </w:rPr>
-        <w:t xml:space="preserve"> dédié, sur lequel tournent simultanément tous les composants logiciels. Ces composants sont déployés sous forme de conteneurs Docker, ce qui garantit leur isolation et simplifie les mises à jour sans redémarrage complet du système. Une base de données PostgreSQL assure la persistance des mesures et des configurations.</w:t>
+        <w:t xml:space="preserve"> dédié, sur lequel tournent simultanément tous les composants logiciels. Ces composants sont déployés sous forme de conteneurs Docker (cf. glossaire), ce qui garantit leur isolation et simplifie les mises à jour sans redémarrage complet du système. Une base de données PostgreSQL assure la persistance des mesures et des configurations.</w:t>
       </w:r>
     </w:p>
     <w:p>
@@ -1453,25 +1417,25 @@
           <w:szCs w:val="23"/>
           <w:rFonts w:ascii="Times New Roman" w:cs="Times New Roman" w:eastAsia="Times New Roman" w:hAnsi="Times New Roman"/>
         </w:rPr>
-        <w:t xml:space="preserve">L'équipe de développement compte moins de cinq personnes, dont un alternant qui travaille en parallèle sur le nouveau PixL Expert. Chaque membre y porte une responsabilité large, et la communication est continue et directe.</w:t>
-      </w:r>
-    </w:p>
-    <w:p>
-      <w:pPr>
-        <w:spacing w:after="200"/>
-      </w:pPr>
-      <w:r>
-        <w:rPr>
-          <w:b w:val="false"/>
-          <w:bCs w:val="false"/>
-          <w:i w:val="false"/>
-          <w:iCs w:val="false"/>
-          <w:color w:val="1b1c22"/>
-          <w:sz w:val="23"/>
-          <w:szCs w:val="23"/>
-          <w:rFonts w:ascii="Times New Roman" w:cs="Times New Roman" w:eastAsia="Times New Roman" w:hAnsi="Times New Roman"/>
-        </w:rPr>
-        <w:t xml:space="preserve">Ma tutrice de stage est </w:t>
+        <w:t xml:space="preserve">L'équipe compte notamment un alternant qui travaille en parallèle sur le nouveau PixL Expert. Chaque membre y porte une responsabilité large, et la communication est continue et directe.</w:t>
+      </w:r>
+    </w:p>
+    <w:p>
+      <w:pPr>
+        <w:spacing w:after="200"/>
+      </w:pPr>
+      <w:r>
+        <w:rPr>
+          <w:b w:val="false"/>
+          <w:bCs w:val="false"/>
+          <w:i w:val="false"/>
+          <w:iCs w:val="false"/>
+          <w:color w:val="1b1c22"/>
+          <w:sz w:val="23"/>
+          <w:szCs w:val="23"/>
+          <w:rFonts w:ascii="Times New Roman" w:cs="Times New Roman" w:eastAsia="Times New Roman" w:hAnsi="Times New Roman"/>
+        </w:rPr>
+        <w:t xml:space="preserve">Ma tutrice de stage, </w:t>
       </w:r>
       <w:r>
         <w:rPr>
@@ -1482,20 +1446,20 @@
           <w:szCs w:val="23"/>
           <w:rFonts w:ascii="Times New Roman" w:cs="Times New Roman" w:eastAsia="Times New Roman" w:hAnsi="Times New Roman"/>
         </w:rPr>
-        <w:t xml:space="preserve">Élodie Baral-Baron</w:t>
-      </w:r>
-      <w:r>
-        <w:rPr>
-          <w:b w:val="false"/>
-          <w:bCs w:val="false"/>
-          <w:i w:val="false"/>
-          <w:iCs w:val="false"/>
-          <w:color w:val="1b1c22"/>
-          <w:sz w:val="23"/>
-          <w:szCs w:val="23"/>
-          <w:rFonts w:ascii="Times New Roman" w:cs="Times New Roman" w:eastAsia="Times New Roman" w:hAnsi="Times New Roman"/>
-        </w:rPr>
-        <w:t xml:space="preserve">, qui a assuré un suivi actif tout au long du stage. Plutôt que de me laisser seul face aux difficultés, elle m'a expliqué au fil de l'eau les aspects techniques du projet : le protocole Modbus, la structure des fichiers de configuration, la signification des attributs des registres, les conventions de la codebase d'APIX, et surtout les règles de cohérence métier — absentes de toute documentation formelle mais indispensables pour concevoir une interface correcte. J'ai également bénéficié du soutien de </w:t>
+        <w:t xml:space="preserve">Mme Baral-Baron</w:t>
+      </w:r>
+      <w:r>
+        <w:rPr>
+          <w:b w:val="false"/>
+          <w:bCs w:val="false"/>
+          <w:i w:val="false"/>
+          <w:iCs w:val="false"/>
+          <w:color w:val="1b1c22"/>
+          <w:sz w:val="23"/>
+          <w:szCs w:val="23"/>
+          <w:rFonts w:ascii="Times New Roman" w:cs="Times New Roman" w:eastAsia="Times New Roman" w:hAnsi="Times New Roman"/>
+        </w:rPr>
+        <w:t xml:space="preserve">, a assuré un suivi actif tout au long du stage. Plutôt que de me laisser seul face aux difficultés, elle m'a expliqué au fil de l'eau les aspects techniques du projet : le protocole Modbus, la structure des fichiers de configuration, la signification des attributs des registres, les conventions de la codebase d'APIX, et surtout les règles de cohérence métier — absentes de toute documentation formelle mais indispensables pour concevoir une interface correcte. J'ai également bénéficié du soutien du </w:t>
       </w:r>
       <w:r>
         <w:rPr>
@@ -1506,20 +1470,20 @@
           <w:szCs w:val="23"/>
           <w:rFonts w:ascii="Times New Roman" w:cs="Times New Roman" w:eastAsia="Times New Roman" w:hAnsi="Times New Roman"/>
         </w:rPr>
-        <w:t xml:space="preserve">Sébastien Rattier</w:t>
-      </w:r>
-      <w:r>
-        <w:rPr>
-          <w:b w:val="false"/>
-          <w:bCs w:val="false"/>
-          <w:i w:val="false"/>
-          <w:iCs w:val="false"/>
-          <w:color w:val="1b1c22"/>
-          <w:sz w:val="23"/>
-          <w:szCs w:val="23"/>
-          <w:rFonts w:ascii="Times New Roman" w:cs="Times New Roman" w:eastAsia="Times New Roman" w:hAnsi="Times New Roman"/>
-        </w:rPr>
-        <w:t xml:space="preserve">, chef de produit, notamment pour comprendre les besoins fonctionnels et les attentes des utilisateurs.</w:t>
+        <w:t xml:space="preserve">chef de produit</w:t>
+      </w:r>
+      <w:r>
+        <w:rPr>
+          <w:b w:val="false"/>
+          <w:bCs w:val="false"/>
+          <w:i w:val="false"/>
+          <w:iCs w:val="false"/>
+          <w:color w:val="1b1c22"/>
+          <w:sz w:val="23"/>
+          <w:szCs w:val="23"/>
+          <w:rFonts w:ascii="Times New Roman" w:cs="Times New Roman" w:eastAsia="Times New Roman" w:hAnsi="Times New Roman"/>
+        </w:rPr>
+        <w:t xml:space="preserve">, notamment pour comprendre les besoins fonctionnels et les attentes des utilisateurs.</w:t>
       </w:r>
     </w:p>
     <w:p>
@@ -1617,7 +1581,7 @@
           <w:szCs w:val="23"/>
           <w:rFonts w:ascii="Times New Roman" w:cs="Times New Roman" w:eastAsia="Times New Roman" w:hAnsi="Times New Roman"/>
         </w:rPr>
-        <w:t xml:space="preserve">, un standard largement répandu dans l'industrie pour l'échange de données entre équipements. Ce protocole, supporté à la fois en mode série et en mode TCP/IP, permet à des automates ou des systèmes industriels tiers d'interroger l'analyseur et de récupérer ses mesures en temps réel.</w:t>
+        <w:t xml:space="preserve">, un standard largement répandu dans l'industrie pour l'échange de données entre équipements. Ce protocole, supporté à la fois en mode série et en mode TCP/IP (Transmission Control Protocol / Internet Protocol, la pile de protocoles standard des réseaux), permet à des automates ou des systèmes industriels tiers d'interroger l'analyseur et de récupérer ses mesures en temps réel.</w:t>
       </w:r>
     </w:p>
     <w:p>
@@ -2013,7 +1977,7 @@
           <w:szCs w:val="23"/>
           <w:rFonts w:ascii="Times New Roman" w:cs="Times New Roman" w:eastAsia="Times New Roman" w:hAnsi="Times New Roman"/>
         </w:rPr>
-        <w:t xml:space="preserve"> Le backend repose sur un système de sérialisation/désérialisation développé en interne, appelé </w:t>
+        <w:t xml:space="preserve"> Le backend repose sur un système de sérialisation/désérialisation (cf. glossaire) développé en interne, appelé </w:t>
       </w:r>
       <w:r>
         <w:rPr>
@@ -2289,7 +2253,7 @@
           <w:szCs w:val="23"/>
           <w:rFonts w:ascii="Times New Roman" w:cs="Times New Roman" w:eastAsia="Times New Roman" w:hAnsi="Times New Roman"/>
         </w:rPr>
-        <w:t xml:space="preserve">. Django est l'un des frameworks web Python les plus répandus : il fournit une structure d'application claire, un système de routage des requêtes HTTP, et de nombreux outils prêts à l'emploi pour la gestion des données et des utilisateurs. Django REST Framework complète Django pour la construction d'API REST, en simplifiant la sérialisation des données et la gestion des formats de réponse. Les modifications portaient sur trois dépôts distincts : </w:t>
+        <w:t xml:space="preserve"> (DRF, cf. glossaire). Django est l'un des frameworks web Python les plus répandus : il fournit une structure d'application claire, un système de routage des requêtes HTTP (HyperText Transfer Protocol, le protocole d'échange de données du web), et de nombreux outils prêts à l'emploi pour la gestion des données et des utilisateurs. Django REST Framework complète Django pour la construction d'API REST, en simplifiant la sérialisation des données et la gestion des formats de réponse. Les modifications portaient sur trois dépôts distincts : </w:t>
       </w:r>
       <w:r>
         <w:rPr>
@@ -2696,7 +2660,7 @@
           <w:szCs w:val="23"/>
           <w:rFonts w:ascii="Times New Roman" w:cs="Times New Roman" w:eastAsia="Times New Roman" w:hAnsi="Times New Roman"/>
         </w:rPr>
-        <w:t xml:space="preserve"> (intégration et déploiement continus) : à chaque push, le pipeline compile le projet et exécute les tests, mais la production des artefacts de déploiement (wheels Python, archives ZIP) n'est déclenchée que par la </w:t>
+        <w:t xml:space="preserve"> (intégration et déploiement continus ; cf. glossaire) : à chaque push, le pipeline compile le projet et exécute les tests, mais la production des artefacts de déploiement (wheels Python, archives ZIP) n'est déclenchée que par la </w:t>
       </w:r>
       <w:r>
         <w:rPr>
@@ -2986,7 +2950,7 @@
           <w:szCs w:val="23"/>
           <w:rFonts w:ascii="Times New Roman" w:cs="Times New Roman" w:eastAsia="Times New Roman" w:hAnsi="Times New Roman"/>
         </w:rPr>
-        <w:t xml:space="preserve">Figure 2 — Architecture Modbus TCP chez APIX : le serveur APIX (esclave) répond aux requêtes du client automate (maître). Les Input Registers sont en lecture seule, les Holding Registers en lecture/écriture ; une valeur float32 occupe deux registres consécutifs.</w:t>
+        <w:t xml:space="preserve">Figure 2 : Architecture Modbus TCP chez APIX : le serveur APIX (esclave) répond aux requêtes du client automate (maître). Les Input Registers sont en lecture seule, les Holding Registers en lecture/écriture ; une valeur float32 occupe deux registres consécutifs.</w:t>
       </w:r>
     </w:p>
     <w:p>
@@ -3033,7 +2997,7 @@
           <w:szCs w:val="23"/>
           <w:rFonts w:ascii="Times New Roman" w:cs="Times New Roman" w:eastAsia="Times New Roman" w:hAnsi="Times New Roman"/>
         </w:rPr>
-        <w:t xml:space="preserve"> Modbus repose sur un modèle maître/esclave : seul le maître initie les échanges, les esclaves se contentant de répondre à ses requêtes. Dans le contexte d'APIX, un automate industriel joue le rôle de maître et interroge régulièrement l'analyseur — l'esclave — pour récupérer ses mesures ; l'analyseur ne transmet jamais de données de façon spontanée.</w:t>
+        <w:t xml:space="preserve"> Modbus repose sur un modèle maître/esclave (voir Figure 8, en annexe A) : seul le maître initie les échanges, les esclaves se contentant de répondre à ses requêtes. Dans le contexte d'APIX, un automate industriel joue le rôle de maître et interroge régulièrement l'analyseur — l'esclave — pour récupérer ses mesures ; l'analyseur ne transmet jamais de données de façon spontanée.</w:t>
       </w:r>
     </w:p>
     <w:p>
@@ -3062,7 +3026,7 @@
           <w:szCs w:val="23"/>
           <w:rFonts w:ascii="Times New Roman" w:cs="Times New Roman" w:eastAsia="Times New Roman" w:hAnsi="Times New Roman"/>
         </w:rPr>
-        <w:t xml:space="preserve"> Les échanges se font à travers des registres, des cases mémoire numérotées situées dans l'esclave, chacune identifiée par une adresse unique et contenant une valeur numérique. On en distingue deux types selon la donnée :</w:t>
+        <w:t xml:space="preserve"> Les échanges se font à travers des registres, des cases mémoire numérotées situées dans l'esclave, chacune identifiée par une adresse unique et contenant une valeur numérique (voir Figure 2). On en distingue deux types selon la donnée (cf. glossaire) :</w:t>
       </w:r>
     </w:p>
     <w:p>
@@ -3169,7 +3133,7 @@
           <w:szCs w:val="23"/>
           <w:rFonts w:ascii="Times New Roman" w:cs="Times New Roman" w:eastAsia="Times New Roman" w:hAnsi="Times New Roman"/>
         </w:rPr>
-        <w:t xml:space="preserve"> Modbus fonctionne sur deux types de liaisons : Modbus RTU (liaison série RS-485, trames binaires compactes) et Modbus TCP (mêmes trames encapsulées dans des paquets réseau Ethernet). L'analyseur APIX supporte les deux simultanément, chacun étant configurable via </w:t>
+        <w:t xml:space="preserve"> Modbus fonctionne sur deux types de liaisons : Modbus RTU (Remote Terminal Unit, liaison série sur bus RS-485 — une norme de transmission série différentielle —, trames binaires compactes) et Modbus TCP (mêmes trames encapsulées dans des paquets réseau Ethernet). L'analyseur APIX supporte les deux simultanément, chacun étant configurable via </w:t>
       </w:r>
       <w:r>
         <w:rPr>
@@ -3222,7 +3186,7 @@
           <w:szCs w:val="23"/>
           <w:rFonts w:ascii="Times New Roman" w:cs="Times New Roman" w:eastAsia="Times New Roman" w:hAnsi="Times New Roman"/>
         </w:rPr>
-        <w:t xml:space="preserve"> Un registre étant encodé sur 16 bits, représenter des types plus précis impose d'en utiliser plusieurs consécutifs : un flottant Float32 (IEEE 754) occupe ainsi deux registres. Certaines valeurs nécessitent par ailleurs un facteur de conversion (</w:t>
+        <w:t xml:space="preserve"> Un registre étant encodé sur 16 bits, représenter des types plus précis impose d'en utiliser plusieurs consécutifs : un flottant Float32 (norme IEEE 754, le standard de représentation des nombres à virgule flottante) occupe ainsi deux registres. Certaines valeurs nécessitent par ailleurs un facteur de conversion (</w:t>
       </w:r>
       <w:r>
         <w:rPr>
@@ -3408,7 +3372,7 @@
           <w:szCs w:val="23"/>
           <w:rFonts w:ascii="Times New Roman" w:cs="Times New Roman" w:eastAsia="Times New Roman" w:hAnsi="Times New Roman"/>
         </w:rPr>
-        <w:t xml:space="preserve"> Ce module constitue le socle partagé du projet. Il contient les classes Python communes utilisées par l'ensemble des composants de la PixL Suite : les modèles de données, les utilitaires de sérialisation et notamment le système ModelMother. Apix Tools est distribué sous forme de wheel Python — un format d'empaquetage standard qui permet d'installer une bibliothèque Python comme n'importe quel paquet tiers, via la commande </w:t>
+        <w:t xml:space="preserve"> Ce module constitue le socle partagé du projet. Il contient les classes Python communes utilisées par l'ensemble des composants de la PixL Suite : les modèles de données, les utilitaires de sérialisation et notamment le système ModelMother. Apix Tools est distribué sous forme de wheel Python (cf. glossaire) — un format d'empaquetage standard qui permet d'installer une bibliothèque Python comme n'importe quel paquet tiers, via la commande </w:t>
       </w:r>
       <w:r>
         <w:rPr>
@@ -3737,7 +3701,7 @@
           <w:szCs w:val="23"/>
           <w:rFonts w:ascii="Times New Roman" w:cs="Times New Roman" w:eastAsia="Times New Roman" w:hAnsi="Times New Roman"/>
         </w:rPr>
-        <w:t xml:space="preserve">, qui décrit l'ensemble des registres exposés par l'analyseur — leur adresse, leur type, leur format et leur facteur de conversion. Ces deux fichiers ont fait l'objet d'une analyse approfondie dès les premiers jours du stage, car ils constituent le point central autour duquel s'articule toute l'interface de configuration à développer. JSON (JavaScript Object Notation) est un format textuel d'échange de données, extrêmement répandu en développement web et dans les API REST. Il représente les données sous forme de paires clé/valeur, de listes ordonnées et de structures imbriquées.</w:t>
+        <w:t xml:space="preserve">, qui décrit l'ensemble des registres exposés par l'analyseur — leur adresse, leur type, leur format et leur facteur de conversion. Ces deux fichiers ont fait l'objet d'une analyse approfondie dès les premiers jours du stage, car ils constituent le point central autour duquel s'articule toute l'interface de configuration à développer. JSON (JavaScript Object Notation, cf. glossaire) est un format textuel d'échange de données, extrêmement répandu en développement web et dans les API REST. Il représente les données sous forme de paires clé/valeur, de listes ordonnées et de structures imbriquées.</w:t>
       </w:r>
     </w:p>
     <w:p>
@@ -4047,7 +4011,7 @@
           <w:szCs w:val="23"/>
           <w:rFonts w:ascii="Times New Roman" w:cs="Times New Roman" w:eastAsia="Times New Roman" w:hAnsi="Times New Roman"/>
         </w:rPr>
-        <w:t xml:space="preserve">ModelMother est une classe de base définie dans </w:t>
+        <w:t xml:space="preserve">ModelMother (cf. glossaire) est une classe de base définie dans </w:t>
       </w:r>
       <w:r>
         <w:rPr>
@@ -6018,25 +5982,25 @@
           <w:szCs w:val="23"/>
           <w:rFonts w:ascii="Times New Roman" w:cs="Times New Roman" w:eastAsia="Times New Roman" w:hAnsi="Times New Roman"/>
         </w:rPr>
-        <w:t xml:space="preserve">Figure 3 — Hiérarchie des classes de modèles : ModelMother est la classe de base dont héritent NetworkParameters (network.json) et ProtocolParameters (protocol.json), elles-mêmes décomposées en sous-objets typés.</w:t>
-      </w:r>
-    </w:p>
-    <w:p>
-      <w:pPr>
-        <w:spacing w:after="200"/>
-      </w:pPr>
-      <w:r>
-        <w:rPr>
-          <w:b w:val="false"/>
-          <w:bCs w:val="false"/>
-          <w:i w:val="false"/>
-          <w:iCs w:val="false"/>
-          <w:color w:val="1b1c22"/>
-          <w:sz w:val="23"/>
-          <w:szCs w:val="23"/>
-          <w:rFonts w:ascii="Times New Roman" w:cs="Times New Roman" w:eastAsia="Times New Roman" w:hAnsi="Times New Roman"/>
-        </w:rPr>
-        <w:t xml:space="preserve">La hiérarchie des classes reflète directement la structure des fichiers JSON, organisée autour de trois classes de conteneurs :</w:t>
+        <w:t xml:space="preserve">Figure 3 : Hiérarchie des classes de modèles : ModelMother est la classe de base dont héritent NetworkParameters (network.json) et ProtocolParameters (protocol.json), elles-mêmes décomposées en sous-objets typés.</w:t>
+      </w:r>
+    </w:p>
+    <w:p>
+      <w:pPr>
+        <w:spacing w:after="200"/>
+      </w:pPr>
+      <w:r>
+        <w:rPr>
+          <w:b w:val="false"/>
+          <w:bCs w:val="false"/>
+          <w:i w:val="false"/>
+          <w:iCs w:val="false"/>
+          <w:color w:val="1b1c22"/>
+          <w:sz w:val="23"/>
+          <w:szCs w:val="23"/>
+          <w:rFonts w:ascii="Times New Roman" w:cs="Times New Roman" w:eastAsia="Times New Roman" w:hAnsi="Times New Roman"/>
+        </w:rPr>
+        <w:t xml:space="preserve">La hiérarchie des classes (voir Figure 3) reflète directement la structure des fichiers JSON, organisée autour de trois classes de conteneurs :</w:t>
       </w:r>
     </w:p>
     <w:p>
@@ -6141,7 +6105,7 @@
           <w:iCs w:val="false"/>
           <w:rFonts w:ascii="Times New Roman" w:cs="Times New Roman" w:eastAsia="Times New Roman" w:hAnsi="Times New Roman"/>
         </w:rPr>
-        <w:t xml:space="preserve"> : conteneur pour les dictionnaires JSON keyed by name, convertis en listes Python (</w:t>
+        <w:t xml:space="preserve"> : conteneur pour les dictionnaires JSON indexés par nom, convertis en listes Python (</w:t>
       </w:r>
       <w:r>
         <w:rPr>
@@ -6213,254 +6177,7 @@
           <w:szCs w:val="23"/>
           <w:rFonts w:ascii="Times New Roman" w:cs="Times New Roman" w:eastAsia="Times New Roman" w:hAnsi="Times New Roman"/>
         </w:rPr>
-        <w:t xml:space="preserve">Voici la hiérarchie concrète des classes de modèles du projet :</w:t>
-      </w:r>
-    </w:p>
-    <w:p>
-      <w:pPr>
-        <w:pStyle w:val="SourceCode"/>
-        <w:shd w:fill="D3D3D3" w:color="auto" w:val="clear"/>
-        <w:spacing/>
-      </w:pPr>
-      <w:r>
-        <w:rPr>
-          <w:color w:val="1b1c22"/>
-          <w:sz w:val="23"/>
-          <w:szCs w:val="23"/>
-          <w:rFonts w:ascii="Courier New" w:cs="Courier New" w:eastAsia="Courier New" w:hAnsi="Courier New"/>
-        </w:rPr>
-        <w:t xml:space="preserve">ModelMother</w:t>
-      </w:r>
-      <w:r>
-        <w:br/>
-      </w:r>
-      <w:r>
-        <w:rPr>
-          <w:color w:val="1b1c22"/>
-          <w:sz w:val="23"/>
-          <w:szCs w:val="23"/>
-          <w:rFonts w:ascii="Courier New" w:cs="Courier New" w:eastAsia="Courier New" w:hAnsi="Courier New"/>
-        </w:rPr>
-        <w:t xml:space="preserve">├── NetworkParameters          ← paramètres réseau complets (network.json)</w:t>
-      </w:r>
-      <w:r>
-        <w:br/>
-      </w:r>
-      <w:r>
-        <w:rPr>
-          <w:color w:val="1b1c22"/>
-          <w:sz w:val="23"/>
-          <w:szCs w:val="23"/>
-          <w:rFonts w:ascii="Courier New" w:cs="Courier New" w:eastAsia="Courier New" w:hAnsi="Courier New"/>
-        </w:rPr>
-        <w:t xml:space="preserve">│   ├── TcpParameters          ← port TCP, flag enabled</w:t>
-      </w:r>
-      <w:r>
-        <w:br/>
-      </w:r>
-      <w:r>
-        <w:rPr>
-          <w:color w:val="1b1c22"/>
-          <w:sz w:val="23"/>
-          <w:szCs w:val="23"/>
-          <w:rFonts w:ascii="Courier New" w:cs="Courier New" w:eastAsia="Courier New" w:hAnsi="Courier New"/>
-        </w:rPr>
-        <w:t xml:space="preserve">│   └── SerialParametersList   ← liste de ports série (ModelListMother)</w:t>
-      </w:r>
-      <w:r>
-        <w:br/>
-      </w:r>
-      <w:r>
-        <w:rPr>
-          <w:color w:val="1b1c22"/>
-          <w:sz w:val="23"/>
-          <w:szCs w:val="23"/>
-          <w:rFonts w:ascii="Courier New" w:cs="Courier New" w:eastAsia="Courier New" w:hAnsi="Courier New"/>
-        </w:rPr>
-        <w:t xml:space="preserve">│       └── SerialParameters   ← un port série (bauds, parité, bits de stop…)</w:t>
-      </w:r>
-      <w:r>
-        <w:br/>
-      </w:r>
-      <w:r>
-        <w:rPr>
-          <w:color w:val="1b1c22"/>
-          <w:sz w:val="23"/>
-          <w:szCs w:val="23"/>
-          <w:rFonts w:ascii="Courier New" w:cs="Courier New" w:eastAsia="Courier New" w:hAnsi="Courier New"/>
-        </w:rPr>
-        <w:t xml:space="preserve">└── ProtocolParameters         ← protocole complet (protocol.json)</w:t>
-      </w:r>
-      <w:r>
-        <w:br/>
-      </w:r>
-      <w:r>
-        <w:rPr>
-          <w:color w:val="1b1c22"/>
-          <w:sz w:val="23"/>
-          <w:szCs w:val="23"/>
-          <w:rFonts w:ascii="Courier New" w:cs="Courier New" w:eastAsia="Courier New" w:hAnsi="Courier New"/>
-        </w:rPr>
-        <w:t xml:space="preserve">		├── HoldingRegisterParameters</w:t>
-      </w:r>
-      <w:r>
-        <w:br/>
-      </w:r>
-      <w:r>
-        <w:rPr>
-          <w:color w:val="1b1c22"/>
-          <w:sz w:val="23"/>
-          <w:szCs w:val="23"/>
-          <w:rFonts w:ascii="Courier New" w:cs="Courier New" w:eastAsia="Courier New" w:hAnsi="Courier New"/>
-        </w:rPr>
-        <w:t xml:space="preserve">		│   └── MeasureParameters</w:t>
-      </w:r>
-      <w:r>
-        <w:br/>
-      </w:r>
-      <w:r>
-        <w:rPr>
-          <w:color w:val="1b1c22"/>
-          <w:sz w:val="23"/>
-          <w:szCs w:val="23"/>
-          <w:rFonts w:ascii="Courier New" w:cs="Courier New" w:eastAsia="Courier New" w:hAnsi="Courier New"/>
-        </w:rPr>
-        <w:t xml:space="preserve">		│       ├── ElementsDetailedList  (ModelDictToListMother)</w:t>
-      </w:r>
-      <w:r>
-        <w:br/>
-      </w:r>
-      <w:r>
-        <w:rPr>
-          <w:color w:val="1b1c22"/>
-          <w:sz w:val="23"/>
-          <w:szCs w:val="23"/>
-          <w:rFonts w:ascii="Courier New" w:cs="Courier New" w:eastAsia="Courier New" w:hAnsi="Courier New"/>
-        </w:rPr>
-        <w:t xml:space="preserve">		│       │   └── ElementDetailParameters  ← un élément détaillé</w:t>
-      </w:r>
-      <w:r>
-        <w:br/>
-      </w:r>
-      <w:r>
-        <w:rPr>
-          <w:color w:val="1b1c22"/>
-          <w:sz w:val="23"/>
-          <w:szCs w:val="23"/>
-          <w:rFonts w:ascii="Courier New" w:cs="Courier New" w:eastAsia="Courier New" w:hAnsi="Courier New"/>
-        </w:rPr>
-        <w:t xml:space="preserve">		│       │       └── ElementPropertyParameters  ← raw_value, normalized_value…</w:t>
-      </w:r>
-      <w:r>
-        <w:br/>
-      </w:r>
-      <w:r>
-        <w:rPr>
-          <w:color w:val="1b1c22"/>
-          <w:sz w:val="23"/>
-          <w:szCs w:val="23"/>
-          <w:rFonts w:ascii="Courier New" w:cs="Courier New" w:eastAsia="Courier New" w:hAnsi="Courier New"/>
-        </w:rPr>
-        <w:t xml:space="preserve">		│       └── ElementList           (ModelDictToListMother)</w:t>
-      </w:r>
-      <w:r>
-        <w:br/>
-      </w:r>
-      <w:r>
-        <w:rPr>
-          <w:color w:val="1b1c22"/>
-          <w:sz w:val="23"/>
-          <w:szCs w:val="23"/>
-          <w:rFonts w:ascii="Courier New" w:cs="Courier New" w:eastAsia="Courier New" w:hAnsi="Courier New"/>
-        </w:rPr>
-        <w:t xml:space="preserve">		│           └── ElementParameters ← un élément simple</w:t>
-      </w:r>
-      <w:r>
-        <w:br/>
-      </w:r>
-      <w:r>
-        <w:rPr>
-          <w:color w:val="1b1c22"/>
-          <w:sz w:val="23"/>
-          <w:szCs w:val="23"/>
-          <w:rFonts w:ascii="Courier New" w:cs="Courier New" w:eastAsia="Courier New" w:hAnsi="Courier New"/>
-        </w:rPr>
-        <w:t xml:space="preserve">		└── InputRegisterParameters</w:t>
-      </w:r>
-      <w:r>
-        <w:br/>
-      </w:r>
-      <w:r>
-        <w:rPr>
-          <w:color w:val="1b1c22"/>
-          <w:sz w:val="23"/>
-          <w:szCs w:val="23"/>
-          <w:rFonts w:ascii="Courier New" w:cs="Courier New" w:eastAsia="Courier New" w:hAnsi="Courier New"/>
-        </w:rPr>
-        <w:t xml:space="preserve">				├── AlarmParametersList       (ModelDictToListMother)</w:t>
-      </w:r>
-      <w:r>
-        <w:br/>
-      </w:r>
-      <w:r>
-        <w:rPr>
-          <w:color w:val="1b1c22"/>
-          <w:sz w:val="23"/>
-          <w:szCs w:val="23"/>
-          <w:rFonts w:ascii="Courier New" w:cs="Courier New" w:eastAsia="Courier New" w:hAnsi="Courier New"/>
-        </w:rPr>
-        <w:t xml:space="preserve">				│   └── AlarmEntryParameters  ← une alarme</w:t>
-      </w:r>
-      <w:r>
-        <w:br/>
-      </w:r>
-      <w:r>
-        <w:rPr>
-          <w:color w:val="1b1c22"/>
-          <w:sz w:val="23"/>
-          <w:szCs w:val="23"/>
-          <w:rFonts w:ascii="Courier New" w:cs="Courier New" w:eastAsia="Courier New" w:hAnsi="Courier New"/>
-        </w:rPr>
-        <w:t xml:space="preserve">				├── MeasureParameters</w:t>
-      </w:r>
-      <w:r>
-        <w:br/>
-      </w:r>
-      <w:r>
-        <w:rPr>
-          <w:color w:val="1b1c22"/>
-          <w:sz w:val="23"/>
-          <w:szCs w:val="23"/>
-          <w:rFonts w:ascii="Courier New" w:cs="Courier New" w:eastAsia="Courier New" w:hAnsi="Courier New"/>
-        </w:rPr>
-        <w:t xml:space="preserve">				├── InformationParameters</w:t>
-      </w:r>
-      <w:r>
-        <w:br/>
-      </w:r>
-      <w:r>
-        <w:rPr>
-          <w:color w:val="1b1c22"/>
-          <w:sz w:val="23"/>
-          <w:szCs w:val="23"/>
-          <w:rFonts w:ascii="Courier New" w:cs="Courier New" w:eastAsia="Courier New" w:hAnsi="Courier New"/>
-        </w:rPr>
-        <w:t xml:space="preserve">				├── SystemParameters</w:t>
-      </w:r>
-      <w:r>
-        <w:br/>
-      </w:r>
-      <w:r>
-        <w:rPr>
-          <w:color w:val="1b1c22"/>
-          <w:sz w:val="23"/>
-          <w:szCs w:val="23"/>
-          <w:rFonts w:ascii="Courier New" w:cs="Courier New" w:eastAsia="Courier New" w:hAnsi="Courier New"/>
-        </w:rPr>
-        <w:t xml:space="preserve">				└── CommandParameters</w:t>
-      </w:r>
-      <w:r>
-        <w:br/>
+        <w:t xml:space="preserve">La hiérarchie concrète des classes de modèles du projet est détaillée, sous forme d'arbre, en annexe B (voir Annexe B).</w:t>
       </w:r>
     </w:p>
     <w:p>
@@ -6836,1061 +6553,20 @@
     </w:p>
     <w:p>
       <w:pPr>
-        <w:pStyle w:val="SourceCode"/>
-        <w:shd w:fill="D3D3D3" w:color="auto" w:val="clear"/>
-        <w:spacing/>
-      </w:pPr>
-      <w:r>
-        <w:rPr>
-          <w:i/>
-          <w:iCs/>
-          <w:color w:val="888880"/>
-          <w:sz w:val="21"/>
-          <w:szCs w:val="21"/>
-        </w:rPr>
-        <w:t xml:space="preserve">json</w:t>
-      </w:r>
-      <w:r>
-        <w:br/>
-        <w:br/>
-      </w:r>
-      <w:r>
-        <w:rPr>
-          <w:color w:val="545664"/>
-          <w:sz w:val="23"/>
-          <w:szCs w:val="23"/>
-          <w:rFonts w:ascii="Courier New" w:cs="Courier New" w:eastAsia="Courier New" w:hAnsi="Courier New"/>
-        </w:rPr>
-        <w:t xml:space="preserve">{</w:t>
-      </w:r>
-      <w:r>
-        <w:br/>
-      </w:r>
-      <w:r>
-        <w:rPr>
-          <w:color w:val="545664"/>
-          <w:sz w:val="23"/>
-          <w:szCs w:val="23"/>
-          <w:rFonts w:ascii="Courier New" w:cs="Courier New" w:eastAsia="Courier New" w:hAnsi="Courier New"/>
-        </w:rPr>
-        <w:t xml:space="preserve">		</w:t>
-      </w:r>
-      <w:r>
-        <w:rPr>
-          <w:color w:val="16a6ab"/>
-          <w:sz w:val="23"/>
-          <w:szCs w:val="23"/>
-          <w:rFonts w:ascii="Courier New" w:cs="Courier New" w:eastAsia="Courier New" w:hAnsi="Courier New"/>
-        </w:rPr>
-        <w:t xml:space="preserve">"data"</w:t>
-      </w:r>
-      <w:r>
-        <w:rPr>
-          <w:color w:val="dd2c38"/>
-          <w:sz w:val="23"/>
-          <w:szCs w:val="23"/>
-          <w:rFonts w:ascii="Courier New" w:cs="Courier New" w:eastAsia="Courier New" w:hAnsi="Courier New"/>
-        </w:rPr>
-        <w:t xml:space="preserve">:</w:t>
-      </w:r>
-      <w:r>
-        <w:rPr>
-          <w:color w:val="545664"/>
-          <w:sz w:val="23"/>
-          <w:szCs w:val="23"/>
-          <w:rFonts w:ascii="Courier New" w:cs="Courier New" w:eastAsia="Courier New" w:hAnsi="Courier New"/>
-        </w:rPr>
-        <w:t xml:space="preserve"> </w:t>
-      </w:r>
-      <w:r>
-        <w:rPr>
-          <w:color w:val="545664"/>
-          <w:sz w:val="23"/>
-          <w:szCs w:val="23"/>
-          <w:rFonts w:ascii="Courier New" w:cs="Courier New" w:eastAsia="Courier New" w:hAnsi="Courier New"/>
-        </w:rPr>
-        <w:t xml:space="preserve">{</w:t>
-      </w:r>
-      <w:r>
-        <w:br/>
-      </w:r>
-      <w:r>
-        <w:rPr>
-          <w:color w:val="545664"/>
-          <w:sz w:val="23"/>
-          <w:szCs w:val="23"/>
-          <w:rFonts w:ascii="Courier New" w:cs="Courier New" w:eastAsia="Courier New" w:hAnsi="Courier New"/>
-        </w:rPr>
-        <w:t xml:space="preserve">				</w:t>
-      </w:r>
-      <w:r>
-        <w:rPr>
-          <w:color w:val="16a6ab"/>
-          <w:sz w:val="23"/>
-          <w:szCs w:val="23"/>
-          <w:rFonts w:ascii="Courier New" w:cs="Courier New" w:eastAsia="Courier New" w:hAnsi="Courier New"/>
-        </w:rPr>
-        <w:t xml:space="preserve">"slave_id"</w:t>
-      </w:r>
-      <w:r>
-        <w:rPr>
-          <w:color w:val="dd2c38"/>
-          <w:sz w:val="23"/>
-          <w:szCs w:val="23"/>
-          <w:rFonts w:ascii="Courier New" w:cs="Courier New" w:eastAsia="Courier New" w:hAnsi="Courier New"/>
-        </w:rPr>
-        <w:t xml:space="preserve">:</w:t>
-      </w:r>
-      <w:r>
-        <w:rPr>
-          <w:color w:val="545664"/>
-          <w:sz w:val="23"/>
-          <w:szCs w:val="23"/>
-          <w:rFonts w:ascii="Courier New" w:cs="Courier New" w:eastAsia="Courier New" w:hAnsi="Courier New"/>
-        </w:rPr>
-        <w:t xml:space="preserve"> </w:t>
-      </w:r>
-      <w:r>
-        <w:rPr>
-          <w:color w:val="8f47e1"/>
-          <w:sz w:val="23"/>
-          <w:szCs w:val="23"/>
-          <w:rFonts w:ascii="Courier New" w:cs="Courier New" w:eastAsia="Courier New" w:hAnsi="Courier New"/>
-        </w:rPr>
-        <w:t xml:space="preserve">1</w:t>
-      </w:r>
-      <w:r>
-        <w:rPr>
-          <w:color w:val="545664"/>
-          <w:sz w:val="23"/>
-          <w:szCs w:val="23"/>
-          <w:rFonts w:ascii="Courier New" w:cs="Courier New" w:eastAsia="Courier New" w:hAnsi="Courier New"/>
-        </w:rPr>
-        <w:t xml:space="preserve">,</w:t>
-      </w:r>
-      <w:r>
-        <w:br/>
-      </w:r>
-      <w:r>
-        <w:rPr>
-          <w:color w:val="545664"/>
-          <w:sz w:val="23"/>
-          <w:szCs w:val="23"/>
-          <w:rFonts w:ascii="Courier New" w:cs="Courier New" w:eastAsia="Courier New" w:hAnsi="Courier New"/>
-        </w:rPr>
-        <w:t xml:space="preserve">				</w:t>
-      </w:r>
-      <w:r>
-        <w:rPr>
-          <w:color w:val="16a6ab"/>
-          <w:sz w:val="23"/>
-          <w:szCs w:val="23"/>
-          <w:rFonts w:ascii="Courier New" w:cs="Courier New" w:eastAsia="Courier New" w:hAnsi="Courier New"/>
-        </w:rPr>
-        <w:t xml:space="preserve">"tcp"</w:t>
-      </w:r>
-      <w:r>
-        <w:rPr>
-          <w:color w:val="dd2c38"/>
-          <w:sz w:val="23"/>
-          <w:szCs w:val="23"/>
-          <w:rFonts w:ascii="Courier New" w:cs="Courier New" w:eastAsia="Courier New" w:hAnsi="Courier New"/>
-        </w:rPr>
-        <w:t xml:space="preserve">:</w:t>
-      </w:r>
-      <w:r>
-        <w:rPr>
-          <w:color w:val="545664"/>
-          <w:sz w:val="23"/>
-          <w:szCs w:val="23"/>
-          <w:rFonts w:ascii="Courier New" w:cs="Courier New" w:eastAsia="Courier New" w:hAnsi="Courier New"/>
-        </w:rPr>
-        <w:t xml:space="preserve"> </w:t>
-      </w:r>
-      <w:r>
-        <w:rPr>
-          <w:color w:val="545664"/>
-          <w:sz w:val="23"/>
-          <w:szCs w:val="23"/>
-          <w:rFonts w:ascii="Courier New" w:cs="Courier New" w:eastAsia="Courier New" w:hAnsi="Courier New"/>
-        </w:rPr>
-        <w:t xml:space="preserve">{</w:t>
-      </w:r>
-      <w:r>
-        <w:rPr>
-          <w:color w:val="545664"/>
-          <w:sz w:val="23"/>
-          <w:szCs w:val="23"/>
-          <w:rFonts w:ascii="Courier New" w:cs="Courier New" w:eastAsia="Courier New" w:hAnsi="Courier New"/>
-        </w:rPr>
-        <w:t xml:space="preserve"> </w:t>
-      </w:r>
-      <w:r>
-        <w:rPr>
-          <w:color w:val="16a6ab"/>
-          <w:sz w:val="23"/>
-          <w:szCs w:val="23"/>
-          <w:rFonts w:ascii="Courier New" w:cs="Courier New" w:eastAsia="Courier New" w:hAnsi="Courier New"/>
-        </w:rPr>
-        <w:t xml:space="preserve">"enabled"</w:t>
-      </w:r>
-      <w:r>
-        <w:rPr>
-          <w:color w:val="dd2c38"/>
-          <w:sz w:val="23"/>
-          <w:szCs w:val="23"/>
-          <w:rFonts w:ascii="Courier New" w:cs="Courier New" w:eastAsia="Courier New" w:hAnsi="Courier New"/>
-        </w:rPr>
-        <w:t xml:space="preserve">:</w:t>
-      </w:r>
-      <w:r>
-        <w:rPr>
-          <w:color w:val="545664"/>
-          <w:sz w:val="23"/>
-          <w:szCs w:val="23"/>
-          <w:rFonts w:ascii="Courier New" w:cs="Courier New" w:eastAsia="Courier New" w:hAnsi="Courier New"/>
-        </w:rPr>
-        <w:t xml:space="preserve"> </w:t>
-      </w:r>
-      <w:r>
-        <w:rPr>
-          <w:color w:val="8f47e1"/>
-          <w:sz w:val="23"/>
-          <w:szCs w:val="23"/>
-          <w:rFonts w:ascii="Courier New" w:cs="Courier New" w:eastAsia="Courier New" w:hAnsi="Courier New"/>
-        </w:rPr>
-        <w:t xml:space="preserve">true</w:t>
-      </w:r>
-      <w:r>
-        <w:rPr>
-          <w:color w:val="545664"/>
-          <w:sz w:val="23"/>
-          <w:szCs w:val="23"/>
-          <w:rFonts w:ascii="Courier New" w:cs="Courier New" w:eastAsia="Courier New" w:hAnsi="Courier New"/>
-        </w:rPr>
-        <w:t xml:space="preserve">,</w:t>
-      </w:r>
-      <w:r>
-        <w:rPr>
-          <w:color w:val="545664"/>
-          <w:sz w:val="23"/>
-          <w:szCs w:val="23"/>
-          <w:rFonts w:ascii="Courier New" w:cs="Courier New" w:eastAsia="Courier New" w:hAnsi="Courier New"/>
-        </w:rPr>
-        <w:t xml:space="preserve"> </w:t>
-      </w:r>
-      <w:r>
-        <w:rPr>
-          <w:color w:val="16a6ab"/>
-          <w:sz w:val="23"/>
-          <w:szCs w:val="23"/>
-          <w:rFonts w:ascii="Courier New" w:cs="Courier New" w:eastAsia="Courier New" w:hAnsi="Courier New"/>
-        </w:rPr>
-        <w:t xml:space="preserve">"port"</w:t>
-      </w:r>
-      <w:r>
-        <w:rPr>
-          <w:color w:val="dd2c38"/>
-          <w:sz w:val="23"/>
-          <w:szCs w:val="23"/>
-          <w:rFonts w:ascii="Courier New" w:cs="Courier New" w:eastAsia="Courier New" w:hAnsi="Courier New"/>
-        </w:rPr>
-        <w:t xml:space="preserve">:</w:t>
-      </w:r>
-      <w:r>
-        <w:rPr>
-          <w:color w:val="545664"/>
-          <w:sz w:val="23"/>
-          <w:szCs w:val="23"/>
-          <w:rFonts w:ascii="Courier New" w:cs="Courier New" w:eastAsia="Courier New" w:hAnsi="Courier New"/>
-        </w:rPr>
-        <w:t xml:space="preserve"> </w:t>
-      </w:r>
-      <w:r>
-        <w:rPr>
-          <w:color w:val="8f47e1"/>
-          <w:sz w:val="23"/>
-          <w:szCs w:val="23"/>
-          <w:rFonts w:ascii="Courier New" w:cs="Courier New" w:eastAsia="Courier New" w:hAnsi="Courier New"/>
-        </w:rPr>
-        <w:t xml:space="preserve">502</w:t>
-      </w:r>
-      <w:r>
-        <w:rPr>
-          <w:color w:val="545664"/>
-          <w:sz w:val="23"/>
-          <w:szCs w:val="23"/>
-          <w:rFonts w:ascii="Courier New" w:cs="Courier New" w:eastAsia="Courier New" w:hAnsi="Courier New"/>
-        </w:rPr>
-        <w:t xml:space="preserve"> </w:t>
-      </w:r>
-      <w:r>
-        <w:rPr>
-          <w:color w:val="545664"/>
-          <w:sz w:val="23"/>
-          <w:szCs w:val="23"/>
-          <w:rFonts w:ascii="Courier New" w:cs="Courier New" w:eastAsia="Courier New" w:hAnsi="Courier New"/>
-        </w:rPr>
-        <w:t xml:space="preserve">}</w:t>
-      </w:r>
-      <w:r>
-        <w:rPr>
-          <w:color w:val="545664"/>
-          <w:sz w:val="23"/>
-          <w:szCs w:val="23"/>
-          <w:rFonts w:ascii="Courier New" w:cs="Courier New" w:eastAsia="Courier New" w:hAnsi="Courier New"/>
-        </w:rPr>
-        <w:t xml:space="preserve">,</w:t>
-      </w:r>
-      <w:r>
-        <w:br/>
-      </w:r>
-      <w:r>
-        <w:rPr>
-          <w:color w:val="545664"/>
-          <w:sz w:val="23"/>
-          <w:szCs w:val="23"/>
-          <w:rFonts w:ascii="Courier New" w:cs="Courier New" w:eastAsia="Courier New" w:hAnsi="Courier New"/>
-        </w:rPr>
-        <w:t xml:space="preserve">				</w:t>
-      </w:r>
-      <w:r>
-        <w:rPr>
-          <w:color w:val="16a6ab"/>
-          <w:sz w:val="23"/>
-          <w:szCs w:val="23"/>
-          <w:rFonts w:ascii="Courier New" w:cs="Courier New" w:eastAsia="Courier New" w:hAnsi="Courier New"/>
-        </w:rPr>
-        <w:t xml:space="preserve">"serial"</w:t>
-      </w:r>
-      <w:r>
-        <w:rPr>
-          <w:color w:val="dd2c38"/>
-          <w:sz w:val="23"/>
-          <w:szCs w:val="23"/>
-          <w:rFonts w:ascii="Courier New" w:cs="Courier New" w:eastAsia="Courier New" w:hAnsi="Courier New"/>
-        </w:rPr>
-        <w:t xml:space="preserve">:</w:t>
-      </w:r>
-      <w:r>
-        <w:rPr>
-          <w:color w:val="545664"/>
-          <w:sz w:val="23"/>
-          <w:szCs w:val="23"/>
-          <w:rFonts w:ascii="Courier New" w:cs="Courier New" w:eastAsia="Courier New" w:hAnsi="Courier New"/>
-        </w:rPr>
-        <w:t xml:space="preserve"> </w:t>
-      </w:r>
-      <w:r>
-        <w:rPr>
-          <w:color w:val="545664"/>
-          <w:sz w:val="23"/>
-          <w:szCs w:val="23"/>
-          <w:rFonts w:ascii="Courier New" w:cs="Courier New" w:eastAsia="Courier New" w:hAnsi="Courier New"/>
-        </w:rPr>
-        <w:t xml:space="preserve">[</w:t>
-      </w:r>
-      <w:r>
-        <w:br/>
-      </w:r>
-      <w:r>
-        <w:rPr>
-          <w:color w:val="545664"/>
-          <w:sz w:val="23"/>
-          <w:szCs w:val="23"/>
-          <w:rFonts w:ascii="Courier New" w:cs="Courier New" w:eastAsia="Courier New" w:hAnsi="Courier New"/>
-        </w:rPr>
-        <w:t xml:space="preserve">						</w:t>
-      </w:r>
-      <w:r>
-        <w:rPr>
-          <w:color w:val="545664"/>
-          <w:sz w:val="23"/>
-          <w:szCs w:val="23"/>
-          <w:rFonts w:ascii="Courier New" w:cs="Courier New" w:eastAsia="Courier New" w:hAnsi="Courier New"/>
-        </w:rPr>
-        <w:t xml:space="preserve">{</w:t>
-      </w:r>
-      <w:r>
-        <w:br/>
-      </w:r>
-      <w:r>
-        <w:rPr>
-          <w:color w:val="545664"/>
-          <w:sz w:val="23"/>
-          <w:szCs w:val="23"/>
-          <w:rFonts w:ascii="Courier New" w:cs="Courier New" w:eastAsia="Courier New" w:hAnsi="Courier New"/>
-        </w:rPr>
-        <w:t xml:space="preserve">								</w:t>
-      </w:r>
-      <w:r>
-        <w:rPr>
-          <w:color w:val="16a6ab"/>
-          <w:sz w:val="23"/>
-          <w:szCs w:val="23"/>
-          <w:rFonts w:ascii="Courier New" w:cs="Courier New" w:eastAsia="Courier New" w:hAnsi="Courier New"/>
-        </w:rPr>
-        <w:t xml:space="preserve">"port"</w:t>
-      </w:r>
-      <w:r>
-        <w:rPr>
-          <w:color w:val="dd2c38"/>
-          <w:sz w:val="23"/>
-          <w:szCs w:val="23"/>
-          <w:rFonts w:ascii="Courier New" w:cs="Courier New" w:eastAsia="Courier New" w:hAnsi="Courier New"/>
-        </w:rPr>
-        <w:t xml:space="preserve">:</w:t>
-      </w:r>
-      <w:r>
-        <w:rPr>
-          <w:color w:val="545664"/>
-          <w:sz w:val="23"/>
-          <w:szCs w:val="23"/>
-          <w:rFonts w:ascii="Courier New" w:cs="Courier New" w:eastAsia="Courier New" w:hAnsi="Courier New"/>
-        </w:rPr>
-        <w:t xml:space="preserve"> </w:t>
-      </w:r>
-      <w:r>
-        <w:rPr>
-          <w:color w:val="1da51d"/>
-          <w:sz w:val="23"/>
-          <w:szCs w:val="23"/>
-          <w:rFonts w:ascii="Courier New" w:cs="Courier New" w:eastAsia="Courier New" w:hAnsi="Courier New"/>
-        </w:rPr>
-        <w:t xml:space="preserve">"/dev/ttyS0"</w:t>
-      </w:r>
-      <w:r>
-        <w:rPr>
-          <w:color w:val="545664"/>
-          <w:sz w:val="23"/>
-          <w:szCs w:val="23"/>
-          <w:rFonts w:ascii="Courier New" w:cs="Courier New" w:eastAsia="Courier New" w:hAnsi="Courier New"/>
-        </w:rPr>
-        <w:t xml:space="preserve">,</w:t>
-      </w:r>
-      <w:r>
-        <w:rPr>
-          <w:color w:val="545664"/>
-          <w:sz w:val="23"/>
-          <w:szCs w:val="23"/>
-          <w:rFonts w:ascii="Courier New" w:cs="Courier New" w:eastAsia="Courier New" w:hAnsi="Courier New"/>
-        </w:rPr>
-        <w:t xml:space="preserve"> </w:t>
-      </w:r>
-      <w:r>
-        <w:rPr>
-          <w:color w:val="16a6ab"/>
-          <w:sz w:val="23"/>
-          <w:szCs w:val="23"/>
-          <w:rFonts w:ascii="Courier New" w:cs="Courier New" w:eastAsia="Courier New" w:hAnsi="Courier New"/>
-        </w:rPr>
-        <w:t xml:space="preserve">"bauds"</w:t>
-      </w:r>
-      <w:r>
-        <w:rPr>
-          <w:color w:val="dd2c38"/>
-          <w:sz w:val="23"/>
-          <w:szCs w:val="23"/>
-          <w:rFonts w:ascii="Courier New" w:cs="Courier New" w:eastAsia="Courier New" w:hAnsi="Courier New"/>
-        </w:rPr>
-        <w:t xml:space="preserve">:</w:t>
-      </w:r>
-      <w:r>
-        <w:rPr>
-          <w:color w:val="545664"/>
-          <w:sz w:val="23"/>
-          <w:szCs w:val="23"/>
-          <w:rFonts w:ascii="Courier New" w:cs="Courier New" w:eastAsia="Courier New" w:hAnsi="Courier New"/>
-        </w:rPr>
-        <w:t xml:space="preserve"> </w:t>
-      </w:r>
-      <w:r>
-        <w:rPr>
-          <w:color w:val="8f47e1"/>
-          <w:sz w:val="23"/>
-          <w:szCs w:val="23"/>
-          <w:rFonts w:ascii="Courier New" w:cs="Courier New" w:eastAsia="Courier New" w:hAnsi="Courier New"/>
-        </w:rPr>
-        <w:t xml:space="preserve">9600</w:t>
-      </w:r>
-      <w:r>
-        <w:rPr>
-          <w:color w:val="545664"/>
-          <w:sz w:val="23"/>
-          <w:szCs w:val="23"/>
-          <w:rFonts w:ascii="Courier New" w:cs="Courier New" w:eastAsia="Courier New" w:hAnsi="Courier New"/>
-        </w:rPr>
-        <w:t xml:space="preserve">,</w:t>
-      </w:r>
-      <w:r>
-        <w:rPr>
-          <w:color w:val="545664"/>
-          <w:sz w:val="23"/>
-          <w:szCs w:val="23"/>
-          <w:rFonts w:ascii="Courier New" w:cs="Courier New" w:eastAsia="Courier New" w:hAnsi="Courier New"/>
-        </w:rPr>
-        <w:t xml:space="preserve"> </w:t>
-      </w:r>
-      <w:r>
-        <w:rPr>
-          <w:color w:val="16a6ab"/>
-          <w:sz w:val="23"/>
-          <w:szCs w:val="23"/>
-          <w:rFonts w:ascii="Courier New" w:cs="Courier New" w:eastAsia="Courier New" w:hAnsi="Courier New"/>
-        </w:rPr>
-        <w:t xml:space="preserve">"bits"</w:t>
-      </w:r>
-      <w:r>
-        <w:rPr>
-          <w:color w:val="dd2c38"/>
-          <w:sz w:val="23"/>
-          <w:szCs w:val="23"/>
-          <w:rFonts w:ascii="Courier New" w:cs="Courier New" w:eastAsia="Courier New" w:hAnsi="Courier New"/>
-        </w:rPr>
-        <w:t xml:space="preserve">:</w:t>
-      </w:r>
-      <w:r>
-        <w:rPr>
-          <w:color w:val="545664"/>
-          <w:sz w:val="23"/>
-          <w:szCs w:val="23"/>
-          <w:rFonts w:ascii="Courier New" w:cs="Courier New" w:eastAsia="Courier New" w:hAnsi="Courier New"/>
-        </w:rPr>
-        <w:t xml:space="preserve"> </w:t>
-      </w:r>
-      <w:r>
-        <w:rPr>
-          <w:color w:val="8f47e1"/>
-          <w:sz w:val="23"/>
-          <w:szCs w:val="23"/>
-          <w:rFonts w:ascii="Courier New" w:cs="Courier New" w:eastAsia="Courier New" w:hAnsi="Courier New"/>
-        </w:rPr>
-        <w:t xml:space="preserve">8</w:t>
-      </w:r>
-      <w:r>
-        <w:rPr>
-          <w:color w:val="545664"/>
-          <w:sz w:val="23"/>
-          <w:szCs w:val="23"/>
-          <w:rFonts w:ascii="Courier New" w:cs="Courier New" w:eastAsia="Courier New" w:hAnsi="Courier New"/>
-        </w:rPr>
-        <w:t xml:space="preserve">,</w:t>
-      </w:r>
-      <w:r>
-        <w:br/>
-      </w:r>
-      <w:r>
-        <w:rPr>
-          <w:color w:val="545664"/>
-          <w:sz w:val="23"/>
-          <w:szCs w:val="23"/>
-          <w:rFonts w:ascii="Courier New" w:cs="Courier New" w:eastAsia="Courier New" w:hAnsi="Courier New"/>
-        </w:rPr>
-        <w:t xml:space="preserve">								</w:t>
-      </w:r>
-      <w:r>
-        <w:rPr>
-          <w:color w:val="16a6ab"/>
-          <w:sz w:val="23"/>
-          <w:szCs w:val="23"/>
-          <w:rFonts w:ascii="Courier New" w:cs="Courier New" w:eastAsia="Courier New" w:hAnsi="Courier New"/>
-        </w:rPr>
-        <w:t xml:space="preserve">"parity"</w:t>
-      </w:r>
-      <w:r>
-        <w:rPr>
-          <w:color w:val="dd2c38"/>
-          <w:sz w:val="23"/>
-          <w:szCs w:val="23"/>
-          <w:rFonts w:ascii="Courier New" w:cs="Courier New" w:eastAsia="Courier New" w:hAnsi="Courier New"/>
-        </w:rPr>
-        <w:t xml:space="preserve">:</w:t>
-      </w:r>
-      <w:r>
-        <w:rPr>
-          <w:color w:val="545664"/>
-          <w:sz w:val="23"/>
-          <w:szCs w:val="23"/>
-          <w:rFonts w:ascii="Courier New" w:cs="Courier New" w:eastAsia="Courier New" w:hAnsi="Courier New"/>
-        </w:rPr>
-        <w:t xml:space="preserve"> </w:t>
-      </w:r>
-      <w:r>
-        <w:rPr>
-          <w:color w:val="1da51d"/>
-          <w:sz w:val="23"/>
-          <w:szCs w:val="23"/>
-          <w:rFonts w:ascii="Courier New" w:cs="Courier New" w:eastAsia="Courier New" w:hAnsi="Courier New"/>
-        </w:rPr>
-        <w:t xml:space="preserve">"N"</w:t>
-      </w:r>
-      <w:r>
-        <w:rPr>
-          <w:color w:val="545664"/>
-          <w:sz w:val="23"/>
-          <w:szCs w:val="23"/>
-          <w:rFonts w:ascii="Courier New" w:cs="Courier New" w:eastAsia="Courier New" w:hAnsi="Courier New"/>
-        </w:rPr>
-        <w:t xml:space="preserve">,</w:t>
-      </w:r>
-      <w:r>
-        <w:rPr>
-          <w:color w:val="545664"/>
-          <w:sz w:val="23"/>
-          <w:szCs w:val="23"/>
-          <w:rFonts w:ascii="Courier New" w:cs="Courier New" w:eastAsia="Courier New" w:hAnsi="Courier New"/>
-        </w:rPr>
-        <w:t xml:space="preserve"> </w:t>
-      </w:r>
-      <w:r>
-        <w:rPr>
-          <w:color w:val="16a6ab"/>
-          <w:sz w:val="23"/>
-          <w:szCs w:val="23"/>
-          <w:rFonts w:ascii="Courier New" w:cs="Courier New" w:eastAsia="Courier New" w:hAnsi="Courier New"/>
-        </w:rPr>
-        <w:t xml:space="preserve">"stops"</w:t>
-      </w:r>
-      <w:r>
-        <w:rPr>
-          <w:color w:val="dd2c38"/>
-          <w:sz w:val="23"/>
-          <w:szCs w:val="23"/>
-          <w:rFonts w:ascii="Courier New" w:cs="Courier New" w:eastAsia="Courier New" w:hAnsi="Courier New"/>
-        </w:rPr>
-        <w:t xml:space="preserve">:</w:t>
-      </w:r>
-      <w:r>
-        <w:rPr>
-          <w:color w:val="545664"/>
-          <w:sz w:val="23"/>
-          <w:szCs w:val="23"/>
-          <w:rFonts w:ascii="Courier New" w:cs="Courier New" w:eastAsia="Courier New" w:hAnsi="Courier New"/>
-        </w:rPr>
-        <w:t xml:space="preserve"> </w:t>
-      </w:r>
-      <w:r>
-        <w:rPr>
-          <w:color w:val="8f47e1"/>
-          <w:sz w:val="23"/>
-          <w:szCs w:val="23"/>
-          <w:rFonts w:ascii="Courier New" w:cs="Courier New" w:eastAsia="Courier New" w:hAnsi="Courier New"/>
-        </w:rPr>
-        <w:t xml:space="preserve">1</w:t>
-      </w:r>
-      <w:r>
-        <w:rPr>
-          <w:color w:val="545664"/>
-          <w:sz w:val="23"/>
-          <w:szCs w:val="23"/>
-          <w:rFonts w:ascii="Courier New" w:cs="Courier New" w:eastAsia="Courier New" w:hAnsi="Courier New"/>
-        </w:rPr>
-        <w:t xml:space="preserve">,</w:t>
-      </w:r>
-      <w:r>
-        <w:rPr>
-          <w:color w:val="545664"/>
-          <w:sz w:val="23"/>
-          <w:szCs w:val="23"/>
-          <w:rFonts w:ascii="Courier New" w:cs="Courier New" w:eastAsia="Courier New" w:hAnsi="Courier New"/>
-        </w:rPr>
-        <w:t xml:space="preserve"> </w:t>
-      </w:r>
-      <w:r>
-        <w:rPr>
-          <w:color w:val="16a6ab"/>
-          <w:sz w:val="23"/>
-          <w:szCs w:val="23"/>
-          <w:rFonts w:ascii="Courier New" w:cs="Courier New" w:eastAsia="Courier New" w:hAnsi="Courier New"/>
-        </w:rPr>
-        <w:t xml:space="preserve">"method"</w:t>
-      </w:r>
-      <w:r>
-        <w:rPr>
-          <w:color w:val="dd2c38"/>
-          <w:sz w:val="23"/>
-          <w:szCs w:val="23"/>
-          <w:rFonts w:ascii="Courier New" w:cs="Courier New" w:eastAsia="Courier New" w:hAnsi="Courier New"/>
-        </w:rPr>
-        <w:t xml:space="preserve">:</w:t>
-      </w:r>
-      <w:r>
-        <w:rPr>
-          <w:color w:val="545664"/>
-          <w:sz w:val="23"/>
-          <w:szCs w:val="23"/>
-          <w:rFonts w:ascii="Courier New" w:cs="Courier New" w:eastAsia="Courier New" w:hAnsi="Courier New"/>
-        </w:rPr>
-        <w:t xml:space="preserve"> </w:t>
-      </w:r>
-      <w:r>
-        <w:rPr>
-          <w:color w:val="1da51d"/>
-          <w:sz w:val="23"/>
-          <w:szCs w:val="23"/>
-          <w:rFonts w:ascii="Courier New" w:cs="Courier New" w:eastAsia="Courier New" w:hAnsi="Courier New"/>
-        </w:rPr>
-        <w:t xml:space="preserve">"rtu"</w:t>
-      </w:r>
-      <w:r>
-        <w:rPr>
-          <w:color w:val="545664"/>
-          <w:sz w:val="23"/>
-          <w:szCs w:val="23"/>
-          <w:rFonts w:ascii="Courier New" w:cs="Courier New" w:eastAsia="Courier New" w:hAnsi="Courier New"/>
-        </w:rPr>
-        <w:t xml:space="preserve">,</w:t>
-      </w:r>
-      <w:r>
-        <w:br/>
-      </w:r>
-      <w:r>
-        <w:rPr>
-          <w:color w:val="545664"/>
-          <w:sz w:val="23"/>
-          <w:szCs w:val="23"/>
-          <w:rFonts w:ascii="Courier New" w:cs="Courier New" w:eastAsia="Courier New" w:hAnsi="Courier New"/>
-        </w:rPr>
-        <w:t xml:space="preserve">								</w:t>
-      </w:r>
-      <w:r>
-        <w:rPr>
-          <w:color w:val="16a6ab"/>
-          <w:sz w:val="23"/>
-          <w:szCs w:val="23"/>
-          <w:rFonts w:ascii="Courier New" w:cs="Courier New" w:eastAsia="Courier New" w:hAnsi="Courier New"/>
-        </w:rPr>
-        <w:t xml:space="preserve">"timeout"</w:t>
-      </w:r>
-      <w:r>
-        <w:rPr>
-          <w:color w:val="dd2c38"/>
-          <w:sz w:val="23"/>
-          <w:szCs w:val="23"/>
-          <w:rFonts w:ascii="Courier New" w:cs="Courier New" w:eastAsia="Courier New" w:hAnsi="Courier New"/>
-        </w:rPr>
-        <w:t xml:space="preserve">:</w:t>
-      </w:r>
-      <w:r>
-        <w:rPr>
-          <w:color w:val="545664"/>
-          <w:sz w:val="23"/>
-          <w:szCs w:val="23"/>
-          <w:rFonts w:ascii="Courier New" w:cs="Courier New" w:eastAsia="Courier New" w:hAnsi="Courier New"/>
-        </w:rPr>
-        <w:t xml:space="preserve"> </w:t>
-      </w:r>
-      <w:r>
-        <w:rPr>
-          <w:color w:val="8f47e1"/>
-          <w:sz w:val="23"/>
-          <w:szCs w:val="23"/>
-          <w:rFonts w:ascii="Courier New" w:cs="Courier New" w:eastAsia="Courier New" w:hAnsi="Courier New"/>
-        </w:rPr>
-        <w:t xml:space="preserve">0.15</w:t>
-      </w:r>
-      <w:r>
-        <w:rPr>
-          <w:color w:val="545664"/>
-          <w:sz w:val="23"/>
-          <w:szCs w:val="23"/>
-          <w:rFonts w:ascii="Courier New" w:cs="Courier New" w:eastAsia="Courier New" w:hAnsi="Courier New"/>
-        </w:rPr>
-        <w:t xml:space="preserve">,</w:t>
-      </w:r>
-      <w:r>
-        <w:rPr>
-          <w:color w:val="545664"/>
-          <w:sz w:val="23"/>
-          <w:szCs w:val="23"/>
-          <w:rFonts w:ascii="Courier New" w:cs="Courier New" w:eastAsia="Courier New" w:hAnsi="Courier New"/>
-        </w:rPr>
-        <w:t xml:space="preserve"> </w:t>
-      </w:r>
-      <w:r>
-        <w:rPr>
-          <w:color w:val="16a6ab"/>
-          <w:sz w:val="23"/>
-          <w:szCs w:val="23"/>
-          <w:rFonts w:ascii="Courier New" w:cs="Courier New" w:eastAsia="Courier New" w:hAnsi="Courier New"/>
-        </w:rPr>
-        <w:t xml:space="preserve">"enabled"</w:t>
-      </w:r>
-      <w:r>
-        <w:rPr>
-          <w:color w:val="dd2c38"/>
-          <w:sz w:val="23"/>
-          <w:szCs w:val="23"/>
-          <w:rFonts w:ascii="Courier New" w:cs="Courier New" w:eastAsia="Courier New" w:hAnsi="Courier New"/>
-        </w:rPr>
-        <w:t xml:space="preserve">:</w:t>
-      </w:r>
-      <w:r>
-        <w:rPr>
-          <w:color w:val="545664"/>
-          <w:sz w:val="23"/>
-          <w:szCs w:val="23"/>
-          <w:rFonts w:ascii="Courier New" w:cs="Courier New" w:eastAsia="Courier New" w:hAnsi="Courier New"/>
-        </w:rPr>
-        <w:t xml:space="preserve"> </w:t>
-      </w:r>
-      <w:r>
-        <w:rPr>
-          <w:color w:val="8f47e1"/>
-          <w:sz w:val="23"/>
-          <w:szCs w:val="23"/>
-          <w:rFonts w:ascii="Courier New" w:cs="Courier New" w:eastAsia="Courier New" w:hAnsi="Courier New"/>
-        </w:rPr>
-        <w:t xml:space="preserve">false</w:t>
-      </w:r>
-      <w:r>
-        <w:br/>
-      </w:r>
-      <w:r>
-        <w:rPr>
-          <w:color w:val="545664"/>
-          <w:sz w:val="23"/>
-          <w:szCs w:val="23"/>
-          <w:rFonts w:ascii="Courier New" w:cs="Courier New" w:eastAsia="Courier New" w:hAnsi="Courier New"/>
-        </w:rPr>
-        <w:t xml:space="preserve">						</w:t>
-      </w:r>
-      <w:r>
-        <w:rPr>
-          <w:color w:val="545664"/>
-          <w:sz w:val="23"/>
-          <w:szCs w:val="23"/>
-          <w:rFonts w:ascii="Courier New" w:cs="Courier New" w:eastAsia="Courier New" w:hAnsi="Courier New"/>
-        </w:rPr>
-        <w:t xml:space="preserve">}</w:t>
-      </w:r>
-      <w:r>
-        <w:br/>
-      </w:r>
-      <w:r>
-        <w:rPr>
-          <w:color w:val="545664"/>
-          <w:sz w:val="23"/>
-          <w:szCs w:val="23"/>
-          <w:rFonts w:ascii="Courier New" w:cs="Courier New" w:eastAsia="Courier New" w:hAnsi="Courier New"/>
-        </w:rPr>
-        <w:t xml:space="preserve">				</w:t>
-      </w:r>
-      <w:r>
-        <w:rPr>
-          <w:color w:val="545664"/>
-          <w:sz w:val="23"/>
-          <w:szCs w:val="23"/>
-          <w:rFonts w:ascii="Courier New" w:cs="Courier New" w:eastAsia="Courier New" w:hAnsi="Courier New"/>
-        </w:rPr>
-        <w:t xml:space="preserve">]</w:t>
-      </w:r>
-      <w:r>
-        <w:rPr>
-          <w:color w:val="545664"/>
-          <w:sz w:val="23"/>
-          <w:szCs w:val="23"/>
-          <w:rFonts w:ascii="Courier New" w:cs="Courier New" w:eastAsia="Courier New" w:hAnsi="Courier New"/>
-        </w:rPr>
-        <w:t xml:space="preserve">,</w:t>
-      </w:r>
-      <w:r>
-        <w:br/>
-      </w:r>
-      <w:r>
-        <w:rPr>
-          <w:color w:val="545664"/>
-          <w:sz w:val="23"/>
-          <w:szCs w:val="23"/>
-          <w:rFonts w:ascii="Courier New" w:cs="Courier New" w:eastAsia="Courier New" w:hAnsi="Courier New"/>
-        </w:rPr>
-        <w:t xml:space="preserve">				</w:t>
-      </w:r>
-      <w:r>
-        <w:rPr>
-          <w:color w:val="16a6ab"/>
-          <w:sz w:val="23"/>
-          <w:szCs w:val="23"/>
-          <w:rFonts w:ascii="Courier New" w:cs="Courier New" w:eastAsia="Courier New" w:hAnsi="Courier New"/>
-        </w:rPr>
-        <w:t xml:space="preserve">"zmq_command_port"</w:t>
-      </w:r>
-      <w:r>
-        <w:rPr>
-          <w:color w:val="dd2c38"/>
-          <w:sz w:val="23"/>
-          <w:szCs w:val="23"/>
-          <w:rFonts w:ascii="Courier New" w:cs="Courier New" w:eastAsia="Courier New" w:hAnsi="Courier New"/>
-        </w:rPr>
-        <w:t xml:space="preserve">:</w:t>
-      </w:r>
-      <w:r>
-        <w:rPr>
-          <w:color w:val="545664"/>
-          <w:sz w:val="23"/>
-          <w:szCs w:val="23"/>
-          <w:rFonts w:ascii="Courier New" w:cs="Courier New" w:eastAsia="Courier New" w:hAnsi="Courier New"/>
-        </w:rPr>
-        <w:t xml:space="preserve"> </w:t>
-      </w:r>
-      <w:r>
-        <w:rPr>
-          <w:color w:val="8f47e1"/>
-          <w:sz w:val="23"/>
-          <w:szCs w:val="23"/>
-          <w:rFonts w:ascii="Courier New" w:cs="Courier New" w:eastAsia="Courier New" w:hAnsi="Courier New"/>
-        </w:rPr>
-        <w:t xml:space="preserve">5557</w:t>
-      </w:r>
-      <w:r>
-        <w:rPr>
-          <w:color w:val="545664"/>
-          <w:sz w:val="23"/>
-          <w:szCs w:val="23"/>
-          <w:rFonts w:ascii="Courier New" w:cs="Courier New" w:eastAsia="Courier New" w:hAnsi="Courier New"/>
-        </w:rPr>
-        <w:t xml:space="preserve">,</w:t>
-      </w:r>
-      <w:r>
-        <w:br/>
-      </w:r>
-      <w:r>
-        <w:rPr>
-          <w:color w:val="545664"/>
-          <w:sz w:val="23"/>
-          <w:szCs w:val="23"/>
-          <w:rFonts w:ascii="Courier New" w:cs="Courier New" w:eastAsia="Courier New" w:hAnsi="Courier New"/>
-        </w:rPr>
-        <w:t xml:space="preserve">				</w:t>
-      </w:r>
-      <w:r>
-        <w:rPr>
-          <w:color w:val="16a6ab"/>
-          <w:sz w:val="23"/>
-          <w:szCs w:val="23"/>
-          <w:rFonts w:ascii="Courier New" w:cs="Courier New" w:eastAsia="Courier New" w:hAnsi="Courier New"/>
-        </w:rPr>
-        <w:t xml:space="preserve">"zmq_data_port"</w:t>
-      </w:r>
-      <w:r>
-        <w:rPr>
-          <w:color w:val="dd2c38"/>
-          <w:sz w:val="23"/>
-          <w:szCs w:val="23"/>
-          <w:rFonts w:ascii="Courier New" w:cs="Courier New" w:eastAsia="Courier New" w:hAnsi="Courier New"/>
-        </w:rPr>
-        <w:t xml:space="preserve">:</w:t>
-      </w:r>
-      <w:r>
-        <w:rPr>
-          <w:color w:val="545664"/>
-          <w:sz w:val="23"/>
-          <w:szCs w:val="23"/>
-          <w:rFonts w:ascii="Courier New" w:cs="Courier New" w:eastAsia="Courier New" w:hAnsi="Courier New"/>
-        </w:rPr>
-        <w:t xml:space="preserve"> </w:t>
-      </w:r>
-      <w:r>
-        <w:rPr>
-          <w:color w:val="8f47e1"/>
-          <w:sz w:val="23"/>
-          <w:szCs w:val="23"/>
-          <w:rFonts w:ascii="Courier New" w:cs="Courier New" w:eastAsia="Courier New" w:hAnsi="Courier New"/>
-        </w:rPr>
-        <w:t xml:space="preserve">5556</w:t>
-      </w:r>
-      <w:r>
-        <w:rPr>
-          <w:color w:val="545664"/>
-          <w:sz w:val="23"/>
-          <w:szCs w:val="23"/>
-          <w:rFonts w:ascii="Courier New" w:cs="Courier New" w:eastAsia="Courier New" w:hAnsi="Courier New"/>
-        </w:rPr>
-        <w:t xml:space="preserve">,</w:t>
-      </w:r>
-      <w:r>
-        <w:br/>
-      </w:r>
-      <w:r>
-        <w:rPr>
-          <w:color w:val="545664"/>
-          <w:sz w:val="23"/>
-          <w:szCs w:val="23"/>
-          <w:rFonts w:ascii="Courier New" w:cs="Courier New" w:eastAsia="Courier New" w:hAnsi="Courier New"/>
-        </w:rPr>
-        <w:t xml:space="preserve">				</w:t>
-      </w:r>
-      <w:r>
-        <w:rPr>
-          <w:color w:val="16a6ab"/>
-          <w:sz w:val="23"/>
-          <w:szCs w:val="23"/>
-          <w:rFonts w:ascii="Courier New" w:cs="Courier New" w:eastAsia="Courier New" w:hAnsi="Courier New"/>
-        </w:rPr>
-        <w:t xml:space="preserve">"zmq_ip"</w:t>
-      </w:r>
-      <w:r>
-        <w:rPr>
-          <w:color w:val="dd2c38"/>
-          <w:sz w:val="23"/>
-          <w:szCs w:val="23"/>
-          <w:rFonts w:ascii="Courier New" w:cs="Courier New" w:eastAsia="Courier New" w:hAnsi="Courier New"/>
-        </w:rPr>
-        <w:t xml:space="preserve">:</w:t>
-      </w:r>
-      <w:r>
-        <w:rPr>
-          <w:color w:val="545664"/>
-          <w:sz w:val="23"/>
-          <w:szCs w:val="23"/>
-          <w:rFonts w:ascii="Courier New" w:cs="Courier New" w:eastAsia="Courier New" w:hAnsi="Courier New"/>
-        </w:rPr>
-        <w:t xml:space="preserve"> </w:t>
-      </w:r>
-      <w:r>
-        <w:rPr>
-          <w:color w:val="1da51d"/>
-          <w:sz w:val="23"/>
-          <w:szCs w:val="23"/>
-          <w:rFonts w:ascii="Courier New" w:cs="Courier New" w:eastAsia="Courier New" w:hAnsi="Courier New"/>
-        </w:rPr>
-        <w:t xml:space="preserve">"localhost"</w:t>
-      </w:r>
-      <w:r>
-        <w:br/>
-      </w:r>
-      <w:r>
-        <w:rPr>
-          <w:color w:val="545664"/>
-          <w:sz w:val="23"/>
-          <w:szCs w:val="23"/>
-          <w:rFonts w:ascii="Courier New" w:cs="Courier New" w:eastAsia="Courier New" w:hAnsi="Courier New"/>
-        </w:rPr>
-        <w:t xml:space="preserve">		</w:t>
-      </w:r>
-      <w:r>
-        <w:rPr>
-          <w:color w:val="545664"/>
-          <w:sz w:val="23"/>
-          <w:szCs w:val="23"/>
-          <w:rFonts w:ascii="Courier New" w:cs="Courier New" w:eastAsia="Courier New" w:hAnsi="Courier New"/>
-        </w:rPr>
-        <w:t xml:space="preserve">}</w:t>
-      </w:r>
-      <w:r>
-        <w:br/>
-      </w:r>
-      <w:r>
-        <w:rPr>
-          <w:color w:val="545664"/>
-          <w:sz w:val="23"/>
-          <w:szCs w:val="23"/>
-          <w:rFonts w:ascii="Courier New" w:cs="Courier New" w:eastAsia="Courier New" w:hAnsi="Courier New"/>
-        </w:rPr>
-        <w:t xml:space="preserve">}</w:t>
-      </w:r>
-      <w:r>
-        <w:br/>
+        <w:spacing w:after="200"/>
+      </w:pPr>
+      <w:r>
+        <w:rPr>
+          <w:b w:val="false"/>
+          <w:bCs w:val="false"/>
+          <w:i w:val="false"/>
+          <w:iCs w:val="false"/>
+          <w:color w:val="1b1c22"/>
+          <w:sz w:val="23"/>
+          <w:szCs w:val="23"/>
+          <w:rFonts w:ascii="Times New Roman" w:cs="Times New Roman" w:eastAsia="Times New Roman" w:hAnsi="Times New Roman"/>
+        </w:rPr>
+        <w:t xml:space="preserve">Un exemple complet illustrant ces quatre sections est fourni en annexe C (voir Annexe C).</w:t>
       </w:r>
     </w:p>
     <w:p/>
@@ -8233,7 +6909,7 @@
           <w:szCs w:val="23"/>
           <w:rFonts w:ascii="Times New Roman" w:cs="Times New Roman" w:eastAsia="Times New Roman" w:hAnsi="Times New Roman"/>
         </w:rPr>
-        <w:t xml:space="preserve">Figure 4 — Éditeur network.json (ModbusPart.vue) : configuration du port TCP et des ports série, chaque port série étant géré dans un onglet dynamique (baud rate, bits de données, parité, bits de stop, méthode RTU/ASCII, timeout).</w:t>
+        <w:t xml:space="preserve">Figure 4 : Éditeur network.json (ModbusPart.vue) : configuration du port TCP et des ports série, chaque port série étant géré dans un onglet dynamique (baud rate, bits de données, parité, bits de stop, méthode RTU/ASCII, timeout).</w:t>
       </w:r>
     </w:p>
     <w:p>
@@ -8299,7 +6975,7 @@
           <w:szCs w:val="23"/>
           <w:rFonts w:ascii="Times New Roman" w:cs="Times New Roman" w:eastAsia="Times New Roman" w:hAnsi="Times New Roman"/>
         </w:rPr>
-        <w:t xml:space="preserve">, intégré dans la section Remote Access des paramètres généraux de PixL Expert.</w:t>
+        <w:t xml:space="preserve"> (voir Figure 4), intégré dans la section Remote Access des paramètres généraux de PixL Expert.</w:t>
       </w:r>
     </w:p>
     <w:p>
@@ -9307,7 +7983,7 @@
           <w:iCs w:val="false"/>
           <w:rFonts w:ascii="Times New Roman" w:cs="Times New Roman" w:eastAsia="Times New Roman" w:hAnsi="Times New Roman"/>
         </w:rPr>
-        <w:t xml:space="preserve"> : un dictionnaire keyed par le nom du composant (ex. </w:t>
+        <w:t xml:space="preserve"> : un dictionnaire indexé par le nom du composant (ex. </w:t>
       </w:r>
       <w:r>
         <w:rPr>
@@ -9469,7 +8145,7 @@
           <w:szCs w:val="23"/>
           <w:rFonts w:ascii="Times New Roman" w:cs="Times New Roman" w:eastAsia="Times New Roman" w:hAnsi="Times New Roman"/>
         </w:rPr>
-        <w:t xml:space="preserve">Les autres sous-sections suivent la même logique de dictionnaire keyed par nom. Dans </w:t>
+        <w:t xml:space="preserve">Les autres sous-sections suivent la même logique de dictionnaire indexé par nom. Dans </w:t>
       </w:r>
       <w:r>
         <w:rPr>
@@ -10377,7 +9053,7 @@
           <w:szCs w:val="23"/>
           <w:rFonts w:ascii="Times New Roman" w:cs="Times New Roman" w:eastAsia="Times New Roman" w:hAnsi="Times New Roman"/>
         </w:rPr>
-        <w:t xml:space="preserve">Figure 5 — Éditeur protocol.json (RegisterMapPart.vue) : tableau AG Grid listant les registres (type HR/IR, adresse, source, nom, format, facteur), avec tri, filtres et réordonnancement par glisser-déposer.</w:t>
+        <w:t xml:space="preserve">Figure 5 : Éditeur protocol.json (RegisterMapPart.vue) : tableau AG Grid listant les registres (type HR/IR, adresse, source, nom, format, facteur), avec tri, filtres et réordonnancement par glisser-déposer.</w:t>
       </w:r>
     </w:p>
     <w:p>
@@ -10436,7 +9112,7 @@
           <w:szCs w:val="23"/>
           <w:rFonts w:ascii="Times New Roman" w:cs="Times New Roman" w:eastAsia="Times New Roman" w:hAnsi="Times New Roman"/>
         </w:rPr>
-        <w:t xml:space="preserve">Figure 6 — Fenêtre modale d'ajout/édition d'un registre : le formulaire s'adapte dynamiquement à la sous-section choisie (ici un Measure → Elements Detailed), avec un aperçu en direct du nom généré.</w:t>
+        <w:t xml:space="preserve">Figure 6 : Fenêtre modale d'ajout/édition d'un registre : le formulaire s'adapte dynamiquement à la sous-section choisie (ici un Measure → Elements Detailed), avec un aperçu en direct du nom généré.</w:t>
       </w:r>
     </w:p>
     <w:p>
@@ -10502,7 +9178,7 @@
           <w:szCs w:val="23"/>
           <w:rFonts w:ascii="Times New Roman" w:cs="Times New Roman" w:eastAsia="Times New Roman" w:hAnsi="Times New Roman"/>
         </w:rPr>
-        <w:t xml:space="preserve">. La complexité de ce composant est significativement plus élevée que </w:t>
+        <w:t xml:space="preserve"> (voir Figure 5). La complexité de ce composant est significativement plus élevée que </w:t>
       </w:r>
       <w:r>
         <w:rPr>
@@ -10656,7 +9332,7 @@
           <w:szCs w:val="23"/>
           <w:rFonts w:ascii="Times New Roman" w:cs="Times New Roman" w:eastAsia="Times New Roman" w:hAnsi="Times New Roman"/>
         </w:rPr>
-        <w:t xml:space="preserve"> Le cœur de l'interface est un tableau interactif réalisé avec AG Grid, une bibliothèque JavaScript spécialisée dans les tableaux de données complexes. Chaque ligne du tableau représente un registre ou un groupe de registres, avec les colonnes suivantes : le type de registre (Register : holding ou input), l'adresse (Address), la source (Source : la sous-section </w:t>
+        <w:t xml:space="preserve"> Le cœur de l'interface est un tableau interactif réalisé avec AG Grid (cf. glossaire), une bibliothèque JavaScript spécialisée dans les tableaux de données complexes. Chaque ligne du tableau représente un registre ou un groupe de registres, avec les colonnes suivantes : le type de registre (Register : holding ou input), l'adresse (Address), la source (Source : la sous-section </w:t>
       </w:r>
       <w:r>
         <w:rPr>
@@ -10751,7 +9427,7 @@
           <w:szCs w:val="23"/>
           <w:rFonts w:ascii="Times New Roman" w:cs="Times New Roman" w:eastAsia="Times New Roman" w:hAnsi="Times New Roman"/>
         </w:rPr>
-        <w:t xml:space="preserve"> L'ajout d'une nouvelle entrée ou la modification d'une entrée existante (via un bouton Edit en fin de ligne) ouvre une fenêtre modale contenant un formulaire dynamique. Ce formulaire est dit dynamique car son contenu varie selon la sous-section sélectionnée par l'utilisateur, pilotée par la configuration retournée par la route </w:t>
+        <w:t xml:space="preserve"> L'ajout d'une nouvelle entrée ou la modification d'une entrée existante (via un bouton Edit en fin de ligne) ouvre une fenêtre modale contenant un formulaire dynamique (voir Figure 6). Ce formulaire est dit dynamique car son contenu varie selon la sous-section sélectionnée par l'utilisateur, pilotée par la configuration retournée par la route </w:t>
       </w:r>
       <w:r>
         <w:rPr>
@@ -11292,7 +9968,7 @@
           <w:szCs w:val="23"/>
           <w:rFonts w:ascii="Times New Roman" w:cs="Times New Roman" w:eastAsia="Times New Roman" w:hAnsi="Times New Roman"/>
         </w:rPr>
-        <w:t xml:space="preserve">), et enfin à reconstruire les dictionnaires keyed by name attendus par le backend. La structure reconstruite est ensuite envoyée via </w:t>
+        <w:t xml:space="preserve">), et enfin à reconstruire les dictionnaires indexés par nom attendus par le backend. La structure reconstruite est ensuite envoyée via </w:t>
       </w:r>
       <w:r>
         <w:rPr>
@@ -12575,7 +11251,7 @@
           <w:szCs w:val="23"/>
           <w:rFonts w:ascii="Times New Roman" w:cs="Times New Roman" w:eastAsia="Times New Roman" w:hAnsi="Times New Roman"/>
         </w:rPr>
-        <w:t xml:space="preserve"> (Secure Shell). SSH est un protocole réseau chiffré qui permet d'ouvrir un terminal de commande sur une machine distante comme si l'on était physiquement devant elle. Concrètement, une fois connecté en SSH, le développeur tape des commandes Linux qui s'exécutent sur le serveur de production, à plusieurs centaines de kilomètres de son poste.</w:t>
+        <w:t xml:space="preserve"> (Secure Shell ; SSH et SCP, cf. glossaire). SSH est un protocole réseau chiffré qui permet d'ouvrir un terminal de commande sur une machine distante comme si l'on était physiquement devant elle. Concrètement, une fois connecté en SSH, le développeur tape des commandes Linux qui s'exécutent sur le serveur de production, à plusieurs centaines de kilomètres de son poste.</w:t>
       </w:r>
     </w:p>
     <w:p>
@@ -13100,25 +11776,25 @@
           <w:szCs w:val="23"/>
           <w:rFonts w:ascii="Times New Roman" w:cs="Times New Roman" w:eastAsia="Times New Roman" w:hAnsi="Times New Roman"/>
         </w:rPr>
-        <w:t xml:space="preserve">Figure 7 — Flux de déploiement : depuis le poste Windows, le code et les fichiers de déploiement sont transférés par SCP/SSH (MobaXTerm) vers le serveur Linux/Debian, puis docker compose up démarre l'ensemble des conteneurs (orchestrateur, PixLAPI, module Modbus, interface web, PostgreSQL).</w:t>
-      </w:r>
-    </w:p>
-    <w:p>
-      <w:pPr>
-        <w:spacing w:after="200"/>
-      </w:pPr>
-      <w:r>
-        <w:rPr>
-          <w:b w:val="false"/>
-          <w:bCs w:val="false"/>
-          <w:i w:val="false"/>
-          <w:iCs w:val="false"/>
-          <w:color w:val="1b1c22"/>
-          <w:sz w:val="23"/>
-          <w:szCs w:val="23"/>
-          <w:rFonts w:ascii="Times New Roman" w:cs="Times New Roman" w:eastAsia="Times New Roman" w:hAnsi="Times New Roman"/>
-        </w:rPr>
-        <w:t xml:space="preserve">Le déploiement d'une nouvelle version se déroule en plusieurs étapes successives et ordonnées. Chaque étape doit être validée avant de passer à la suivante, car une erreur non détectée peut se propager et rendre le diagnostic plus difficile.</w:t>
+        <w:t xml:space="preserve">Figure 7 : Flux de déploiement : depuis le poste Windows, le code et les fichiers de déploiement sont transférés par SCP/SSH (MobaXTerm) vers le serveur Linux/Debian, puis docker compose up démarre l'ensemble des conteneurs (orchestrateur, PixLAPI, module Modbus, interface web, PostgreSQL).</w:t>
+      </w:r>
+    </w:p>
+    <w:p>
+      <w:pPr>
+        <w:spacing w:after="200"/>
+      </w:pPr>
+      <w:r>
+        <w:rPr>
+          <w:b w:val="false"/>
+          <w:bCs w:val="false"/>
+          <w:i w:val="false"/>
+          <w:iCs w:val="false"/>
+          <w:color w:val="1b1c22"/>
+          <w:sz w:val="23"/>
+          <w:szCs w:val="23"/>
+          <w:rFonts w:ascii="Times New Roman" w:cs="Times New Roman" w:eastAsia="Times New Roman" w:hAnsi="Times New Roman"/>
+        </w:rPr>
+        <w:t xml:space="preserve">Le déploiement d'une nouvelle version se déroule en plusieurs étapes successives et ordonnées (voir Figure 7). Chaque étape doit être validée avant de passer à la suivante, car une erreur non détectée peut se propager et rendre le diagnostic plus difficile.</w:t>
       </w:r>
     </w:p>
     <w:p>
@@ -13973,7 +12649,7 @@
           <w:szCs w:val="23"/>
           <w:rFonts w:ascii="Times New Roman" w:cs="Times New Roman" w:eastAsia="Times New Roman" w:hAnsi="Times New Roman"/>
         </w:rPr>
-        <w:t xml:space="preserve">, un outil qui permet de définir et de gérer plusieurs conteneurs comme un ensemble cohérent à l'aide d'un unique fichier de configuration : </w:t>
+        <w:t xml:space="preserve"> (cf. glossaire), un outil qui permet de définir et de gérer plusieurs conteneurs comme un ensemble cohérent à l'aide d'un unique fichier de configuration : </w:t>
       </w:r>
       <w:r>
         <w:rPr>
@@ -15872,6 +14548,24 @@
           <w:szCs w:val="23"/>
           <w:rFonts w:ascii="Times New Roman" w:cs="Times New Roman" w:eastAsia="Times New Roman" w:hAnsi="Times New Roman"/>
         </w:rPr>
+        <w:t xml:space="preserve">Ce stage a également prolongé et mis en pratique, dans un contexte professionnel réel, les compétences développées au cours du BUT Informatique. Le développement full-stack de l'outil a directement mobilisé la compétence « Réaliser un développement d'application », tant côté backend que frontend. La manipulation et la validation des fichiers de configuration structurés ont fait appel aux compétences « Gérer des données de l'information » et « Optimiser des applications ». La phase de déploiement par conteneurs sur un serveur Linux distant a prolongé les enseignements de systèmes et réseaux, en lien avec la compétence « Administrer des systèmes informatiques communicants complexes ». Enfin, l'organisation itérative du projet et le travail au sein d'une petite équipe ont concrétisé les compétences « Conduire un projet » et « Travailler dans une équipe informatique ». Ce stage a ainsi constitué une application intégrée de l'ensemble du référentiel de compétences du BUT3.</w:t>
+      </w:r>
+    </w:p>
+    <w:p>
+      <w:pPr>
+        <w:spacing w:after="200"/>
+      </w:pPr>
+      <w:r>
+        <w:rPr>
+          <w:b w:val="false"/>
+          <w:bCs w:val="false"/>
+          <w:i w:val="false"/>
+          <w:iCs w:val="false"/>
+          <w:color w:val="1b1c22"/>
+          <w:sz w:val="23"/>
+          <w:szCs w:val="23"/>
+          <w:rFonts w:ascii="Times New Roman" w:cs="Times New Roman" w:eastAsia="Times New Roman" w:hAnsi="Times New Roman"/>
+        </w:rPr>
         <w:t xml:space="preserve">Au-delà des compétences acquises, ce stage a confirmé mon intérêt pour le développement logiciel appliqué à des problématiques industrielles concrètes, où la fiabilité et la rigueur ne sont pas négociables. L'outil développé constitue une base extensible : il pourra être enrichi de nouveaux types de registres, de validations supplémentaires ou d'une ergonomie affinée à mesure que les besoins des utilisateurs évolueront.</w:t>
       </w:r>
     </w:p>
@@ -15994,17 +14688,7 @@
           <w:bCs/>
           <w:rFonts w:ascii="Times New Roman" w:cs="Times New Roman" w:eastAsia="Times New Roman" w:hAnsi="Times New Roman"/>
         </w:rPr>
-        <w:t xml:space="preserve">Registre (holding / input)</w:t>
-      </w:r>
-      <w:r>
-        <w:rPr>
-          <w:b w:val="false"/>
-          <w:bCs w:val="false"/>
-          <w:i w:val="false"/>
-          <w:iCs w:val="false"/>
-          <w:rFonts w:ascii="Times New Roman" w:cs="Times New Roman" w:eastAsia="Times New Roman" w:hAnsi="Times New Roman"/>
-        </w:rPr>
-        <w:t xml:space="preserve"> — case mémoire adressable exposée par un équipement Modbus. Les </w:t>
+        <w:t xml:space="preserve">RTU</w:t>
       </w:r>
       <w:r>
         <w:rPr>
@@ -16012,35 +14696,17 @@
           <w:iCs/>
           <w:rFonts w:ascii="Times New Roman" w:cs="Times New Roman" w:eastAsia="Times New Roman" w:hAnsi="Times New Roman"/>
         </w:rPr>
-        <w:t xml:space="preserve">holding registers</w:t>
-      </w:r>
-      <w:r>
-        <w:rPr>
-          <w:b w:val="false"/>
-          <w:bCs w:val="false"/>
-          <w:i w:val="false"/>
-          <w:iCs w:val="false"/>
-          <w:rFonts w:ascii="Times New Roman" w:cs="Times New Roman" w:eastAsia="Times New Roman" w:hAnsi="Times New Roman"/>
-        </w:rPr>
-        <w:t xml:space="preserve"> sont accessibles en lecture/écriture, les </w:t>
-      </w:r>
-      <w:r>
-        <w:rPr>
-          <w:i/>
-          <w:iCs/>
-          <w:rFonts w:ascii="Times New Roman" w:cs="Times New Roman" w:eastAsia="Times New Roman" w:hAnsi="Times New Roman"/>
-        </w:rPr>
-        <w:t xml:space="preserve">input registers</w:t>
-      </w:r>
-      <w:r>
-        <w:rPr>
-          <w:b w:val="false"/>
-          <w:bCs w:val="false"/>
-          <w:i w:val="false"/>
-          <w:iCs w:val="false"/>
-          <w:rFonts w:ascii="Times New Roman" w:cs="Times New Roman" w:eastAsia="Times New Roman" w:hAnsi="Times New Roman"/>
-        </w:rPr>
-        <w:t xml:space="preserve"> en lecture seule.</w:t>
+        <w:t xml:space="preserve">(Remote Terminal Unit)</w:t>
+      </w:r>
+      <w:r>
+        <w:rPr>
+          <w:b w:val="false"/>
+          <w:bCs w:val="false"/>
+          <w:i w:val="false"/>
+          <w:iCs w:val="false"/>
+          <w:rFonts w:ascii="Times New Roman" w:cs="Times New Roman" w:eastAsia="Times New Roman" w:hAnsi="Times New Roman"/>
+        </w:rPr>
+        <w:t xml:space="preserve"> — mode série de Modbus, transmettant des trames binaires compactes, généralement sur un bus RS-485.</w:t>
       </w:r>
     </w:p>
     <w:p>
@@ -16059,17 +14725,17 @@
           <w:bCs/>
           <w:rFonts w:ascii="Times New Roman" w:cs="Times New Roman" w:eastAsia="Times New Roman" w:hAnsi="Times New Roman"/>
         </w:rPr>
-        <w:t xml:space="preserve">Sérialisation / désérialisation</w:t>
-      </w:r>
-      <w:r>
-        <w:rPr>
-          <w:b w:val="false"/>
-          <w:bCs w:val="false"/>
-          <w:i w:val="false"/>
-          <w:iCs w:val="false"/>
-          <w:rFonts w:ascii="Times New Roman" w:cs="Times New Roman" w:eastAsia="Times New Roman" w:hAnsi="Times New Roman"/>
-        </w:rPr>
-        <w:t xml:space="preserve"> — conversion d'un objet en mémoire vers un format textuel persistant (ici JSON), et inversement.</w:t>
+        <w:t xml:space="preserve">RS-485</w:t>
+      </w:r>
+      <w:r>
+        <w:rPr>
+          <w:b w:val="false"/>
+          <w:bCs w:val="false"/>
+          <w:i w:val="false"/>
+          <w:iCs w:val="false"/>
+          <w:rFonts w:ascii="Times New Roman" w:cs="Times New Roman" w:eastAsia="Times New Roman" w:hAnsi="Times New Roman"/>
+        </w:rPr>
+        <w:t xml:space="preserve"> — norme de transmission série différentielle multipoints, support physique du Modbus série.</w:t>
       </w:r>
     </w:p>
     <w:p>
@@ -16088,7 +14754,7 @@
           <w:bCs/>
           <w:rFonts w:ascii="Times New Roman" w:cs="Times New Roman" w:eastAsia="Times New Roman" w:hAnsi="Times New Roman"/>
         </w:rPr>
-        <w:t xml:space="preserve">JSON</w:t>
+        <w:t xml:space="preserve">TCP/IP</w:t>
       </w:r>
       <w:r>
         <w:rPr>
@@ -16096,17 +14762,17 @@
           <w:iCs/>
           <w:rFonts w:ascii="Times New Roman" w:cs="Times New Roman" w:eastAsia="Times New Roman" w:hAnsi="Times New Roman"/>
         </w:rPr>
-        <w:t xml:space="preserve">(JavaScript Object Notation)</w:t>
-      </w:r>
-      <w:r>
-        <w:rPr>
-          <w:b w:val="false"/>
-          <w:bCs w:val="false"/>
-          <w:i w:val="false"/>
-          <w:iCs w:val="false"/>
-          <w:rFonts w:ascii="Times New Roman" w:cs="Times New Roman" w:eastAsia="Times New Roman" w:hAnsi="Times New Roman"/>
-        </w:rPr>
-        <w:t xml:space="preserve"> — format textuel d'échange de données structuré en paires clé/valeur, listes et objets imbriqués.</w:t>
+        <w:t xml:space="preserve">(Transmission Control Protocol / Internet Protocol)</w:t>
+      </w:r>
+      <w:r>
+        <w:rPr>
+          <w:b w:val="false"/>
+          <w:bCs w:val="false"/>
+          <w:i w:val="false"/>
+          <w:iCs w:val="false"/>
+          <w:rFonts w:ascii="Times New Roman" w:cs="Times New Roman" w:eastAsia="Times New Roman" w:hAnsi="Times New Roman"/>
+        </w:rPr>
+        <w:t xml:space="preserve"> — pile de protocoles standard des réseaux informatiques, support du Modbus TCP.</w:t>
       </w:r>
     </w:p>
     <w:p>
@@ -16125,17 +14791,25 @@
           <w:bCs/>
           <w:rFonts w:ascii="Times New Roman" w:cs="Times New Roman" w:eastAsia="Times New Roman" w:hAnsi="Times New Roman"/>
         </w:rPr>
-        <w:t xml:space="preserve">ModelMother</w:t>
-      </w:r>
-      <w:r>
-        <w:rPr>
-          <w:b w:val="false"/>
-          <w:bCs w:val="false"/>
-          <w:i w:val="false"/>
-          <w:iCs w:val="false"/>
-          <w:rFonts w:ascii="Times New Roman" w:cs="Times New Roman" w:eastAsia="Times New Roman" w:hAnsi="Times New Roman"/>
-        </w:rPr>
-        <w:t xml:space="preserve"> — classe de base du framework interne d'APIX assurant la sérialisation/désérialisation récursive des modèles Python.</w:t>
+        <w:t xml:space="preserve">HTTP</w:t>
+      </w:r>
+      <w:r>
+        <w:rPr>
+          <w:i/>
+          <w:iCs/>
+          <w:rFonts w:ascii="Times New Roman" w:cs="Times New Roman" w:eastAsia="Times New Roman" w:hAnsi="Times New Roman"/>
+        </w:rPr>
+        <w:t xml:space="preserve">(HyperText Transfer Protocol)</w:t>
+      </w:r>
+      <w:r>
+        <w:rPr>
+          <w:b w:val="false"/>
+          <w:bCs w:val="false"/>
+          <w:i w:val="false"/>
+          <w:iCs w:val="false"/>
+          <w:rFonts w:ascii="Times New Roman" w:cs="Times New Roman" w:eastAsia="Times New Roman" w:hAnsi="Times New Roman"/>
+        </w:rPr>
+        <w:t xml:space="preserve"> — protocole d'échange de données du web, utilisé par les API REST.</w:t>
       </w:r>
     </w:p>
     <w:p>
@@ -16154,17 +14828,35 @@
           <w:bCs/>
           <w:rFonts w:ascii="Times New Roman" w:cs="Times New Roman" w:eastAsia="Times New Roman" w:hAnsi="Times New Roman"/>
         </w:rPr>
-        <w:t xml:space="preserve">Wheel (.whl)</w:t>
-      </w:r>
-      <w:r>
-        <w:rPr>
-          <w:b w:val="false"/>
-          <w:bCs w:val="false"/>
-          <w:i w:val="false"/>
-          <w:iCs w:val="false"/>
-          <w:rFonts w:ascii="Times New Roman" w:cs="Times New Roman" w:eastAsia="Times New Roman" w:hAnsi="Times New Roman"/>
-        </w:rPr>
-        <w:t xml:space="preserve"> — format d'archive de distribution d'un paquet Python prêt à être installé.</w:t>
+        <w:t xml:space="preserve">IEEE 754</w:t>
+      </w:r>
+      <w:r>
+        <w:rPr>
+          <w:b w:val="false"/>
+          <w:bCs w:val="false"/>
+          <w:i w:val="false"/>
+          <w:iCs w:val="false"/>
+          <w:rFonts w:ascii="Times New Roman" w:cs="Times New Roman" w:eastAsia="Times New Roman" w:hAnsi="Times New Roman"/>
+        </w:rPr>
+        <w:t xml:space="preserve"> — norme standard de représentation des nombres à virgule flottante en informatique (ici le format </w:t>
+      </w:r>
+      <w:r>
+        <w:rPr>
+          <w:rStyle w:val="SourceCode"/>
+          <w:rFonts w:ascii="Courier New" w:cs="Courier New" w:eastAsia="Courier New" w:hAnsi="Courier New"/>
+          <w:shd w:fill="D3D3D3" w:color="auto" w:val="clear"/>
+        </w:rPr>
+        <w:t xml:space="preserve">float32</w:t>
+      </w:r>
+      <w:r>
+        <w:rPr>
+          <w:b w:val="false"/>
+          <w:bCs w:val="false"/>
+          <w:i w:val="false"/>
+          <w:iCs w:val="false"/>
+          <w:rFonts w:ascii="Times New Roman" w:cs="Times New Roman" w:eastAsia="Times New Roman" w:hAnsi="Times New Roman"/>
+        </w:rPr>
+        <w:t xml:space="preserve">).</w:t>
       </w:r>
     </w:p>
     <w:p>
@@ -16183,17 +14875,25 @@
           <w:bCs/>
           <w:rFonts w:ascii="Times New Roman" w:cs="Times New Roman" w:eastAsia="Times New Roman" w:hAnsi="Times New Roman"/>
         </w:rPr>
-        <w:t xml:space="preserve">Conteneur / Docker</w:t>
-      </w:r>
-      <w:r>
-        <w:rPr>
-          <w:b w:val="false"/>
-          <w:bCs w:val="false"/>
-          <w:i w:val="false"/>
-          <w:iCs w:val="false"/>
-          <w:rFonts w:ascii="Times New Roman" w:cs="Times New Roman" w:eastAsia="Times New Roman" w:hAnsi="Times New Roman"/>
-        </w:rPr>
-        <w:t xml:space="preserve"> — environnement d'exécution isolé embarquant une application et ses dépendances, indépendamment du système hôte.</w:t>
+        <w:t xml:space="preserve">PME</w:t>
+      </w:r>
+      <w:r>
+        <w:rPr>
+          <w:i/>
+          <w:iCs/>
+          <w:rFonts w:ascii="Times New Roman" w:cs="Times New Roman" w:eastAsia="Times New Roman" w:hAnsi="Times New Roman"/>
+        </w:rPr>
+        <w:t xml:space="preserve">(petite et moyenne entreprise)</w:t>
+      </w:r>
+      <w:r>
+        <w:rPr>
+          <w:b w:val="false"/>
+          <w:bCs w:val="false"/>
+          <w:i w:val="false"/>
+          <w:iCs w:val="false"/>
+          <w:rFonts w:ascii="Times New Roman" w:cs="Times New Roman" w:eastAsia="Times New Roman" w:hAnsi="Times New Roman"/>
+        </w:rPr>
+        <w:t xml:space="preserve"> — entreprise de moins de 250 salariés.</w:t>
       </w:r>
     </w:p>
     <w:p>
@@ -16212,35 +14912,53 @@
           <w:bCs/>
           <w:rFonts w:ascii="Times New Roman" w:cs="Times New Roman" w:eastAsia="Times New Roman" w:hAnsi="Times New Roman"/>
         </w:rPr>
-        <w:t xml:space="preserve">Docker Compose</w:t>
-      </w:r>
-      <w:r>
-        <w:rPr>
-          <w:b w:val="false"/>
-          <w:bCs w:val="false"/>
-          <w:i w:val="false"/>
-          <w:iCs w:val="false"/>
-          <w:rFonts w:ascii="Times New Roman" w:cs="Times New Roman" w:eastAsia="Times New Roman" w:hAnsi="Times New Roman"/>
-        </w:rPr>
-        <w:t xml:space="preserve"> — outil d'orchestration de plusieurs conteneurs décrits dans un fichier </w:t>
-      </w:r>
-      <w:r>
-        <w:rPr>
-          <w:rStyle w:val="SourceCode"/>
-          <w:rFonts w:ascii="Courier New" w:cs="Courier New" w:eastAsia="Courier New" w:hAnsi="Courier New"/>
-          <w:shd w:fill="D3D3D3" w:color="auto" w:val="clear"/>
-        </w:rPr>
-        <w:t xml:space="preserve">docker-compose.yml</w:t>
-      </w:r>
-      <w:r>
-        <w:rPr>
-          <w:b w:val="false"/>
-          <w:bCs w:val="false"/>
-          <w:i w:val="false"/>
-          <w:iCs w:val="false"/>
-          <w:rFonts w:ascii="Times New Roman" w:cs="Times New Roman" w:eastAsia="Times New Roman" w:hAnsi="Times New Roman"/>
-        </w:rPr>
-        <w:t xml:space="preserve">.</w:t>
+        <w:t xml:space="preserve">Registre (holding / input)</w:t>
+      </w:r>
+      <w:r>
+        <w:rPr>
+          <w:b w:val="false"/>
+          <w:bCs w:val="false"/>
+          <w:i w:val="false"/>
+          <w:iCs w:val="false"/>
+          <w:rFonts w:ascii="Times New Roman" w:cs="Times New Roman" w:eastAsia="Times New Roman" w:hAnsi="Times New Roman"/>
+        </w:rPr>
+        <w:t xml:space="preserve"> — case mémoire adressable exposée par un équipement Modbus. Les </w:t>
+      </w:r>
+      <w:r>
+        <w:rPr>
+          <w:i/>
+          <w:iCs/>
+          <w:rFonts w:ascii="Times New Roman" w:cs="Times New Roman" w:eastAsia="Times New Roman" w:hAnsi="Times New Roman"/>
+        </w:rPr>
+        <w:t xml:space="preserve">holding registers</w:t>
+      </w:r>
+      <w:r>
+        <w:rPr>
+          <w:b w:val="false"/>
+          <w:bCs w:val="false"/>
+          <w:i w:val="false"/>
+          <w:iCs w:val="false"/>
+          <w:rFonts w:ascii="Times New Roman" w:cs="Times New Roman" w:eastAsia="Times New Roman" w:hAnsi="Times New Roman"/>
+        </w:rPr>
+        <w:t xml:space="preserve"> sont accessibles en lecture/écriture, les </w:t>
+      </w:r>
+      <w:r>
+        <w:rPr>
+          <w:i/>
+          <w:iCs/>
+          <w:rFonts w:ascii="Times New Roman" w:cs="Times New Roman" w:eastAsia="Times New Roman" w:hAnsi="Times New Roman"/>
+        </w:rPr>
+        <w:t xml:space="preserve">input registers</w:t>
+      </w:r>
+      <w:r>
+        <w:rPr>
+          <w:b w:val="false"/>
+          <w:bCs w:val="false"/>
+          <w:i w:val="false"/>
+          <w:iCs w:val="false"/>
+          <w:rFonts w:ascii="Times New Roman" w:cs="Times New Roman" w:eastAsia="Times New Roman" w:hAnsi="Times New Roman"/>
+        </w:rPr>
+        <w:t xml:space="preserve"> en lecture seule.</w:t>
       </w:r>
     </w:p>
     <w:p>
@@ -16259,17 +14977,17 @@
           <w:bCs/>
           <w:rFonts w:ascii="Times New Roman" w:cs="Times New Roman" w:eastAsia="Times New Roman" w:hAnsi="Times New Roman"/>
         </w:rPr>
-        <w:t xml:space="preserve">CI/CD</w:t>
-      </w:r>
-      <w:r>
-        <w:rPr>
-          <w:b w:val="false"/>
-          <w:bCs w:val="false"/>
-          <w:i w:val="false"/>
-          <w:iCs w:val="false"/>
-          <w:rFonts w:ascii="Times New Roman" w:cs="Times New Roman" w:eastAsia="Times New Roman" w:hAnsi="Times New Roman"/>
-        </w:rPr>
-        <w:t xml:space="preserve"> — intégration et livraison continues : automatisation du build, des tests et du packaging à chaque modification du code.</w:t>
+        <w:t xml:space="preserve">Sérialisation / désérialisation</w:t>
+      </w:r>
+      <w:r>
+        <w:rPr>
+          <w:b w:val="false"/>
+          <w:bCs w:val="false"/>
+          <w:i w:val="false"/>
+          <w:iCs w:val="false"/>
+          <w:rFonts w:ascii="Times New Roman" w:cs="Times New Roman" w:eastAsia="Times New Roman" w:hAnsi="Times New Roman"/>
+        </w:rPr>
+        <w:t xml:space="preserve"> — conversion d'un objet en mémoire vers un format textuel persistant (ici JSON), et inversement.</w:t>
       </w:r>
     </w:p>
     <w:p>
@@ -16288,17 +15006,25 @@
           <w:bCs/>
           <w:rFonts w:ascii="Times New Roman" w:cs="Times New Roman" w:eastAsia="Times New Roman" w:hAnsi="Times New Roman"/>
         </w:rPr>
-        <w:t xml:space="preserve">SSH / SCP</w:t>
-      </w:r>
-      <w:r>
-        <w:rPr>
-          <w:b w:val="false"/>
-          <w:bCs w:val="false"/>
-          <w:i w:val="false"/>
-          <w:iCs w:val="false"/>
-          <w:rFonts w:ascii="Times New Roman" w:cs="Times New Roman" w:eastAsia="Times New Roman" w:hAnsi="Times New Roman"/>
-        </w:rPr>
-        <w:t xml:space="preserve"> — protocoles d'accès distant sécurisé à un serveur (SSH) et de copie de fichiers chiffrée (SCP).</w:t>
+        <w:t xml:space="preserve">JSON</w:t>
+      </w:r>
+      <w:r>
+        <w:rPr>
+          <w:i/>
+          <w:iCs/>
+          <w:rFonts w:ascii="Times New Roman" w:cs="Times New Roman" w:eastAsia="Times New Roman" w:hAnsi="Times New Roman"/>
+        </w:rPr>
+        <w:t xml:space="preserve">(JavaScript Object Notation)</w:t>
+      </w:r>
+      <w:r>
+        <w:rPr>
+          <w:b w:val="false"/>
+          <w:bCs w:val="false"/>
+          <w:i w:val="false"/>
+          <w:iCs w:val="false"/>
+          <w:rFonts w:ascii="Times New Roman" w:cs="Times New Roman" w:eastAsia="Times New Roman" w:hAnsi="Times New Roman"/>
+        </w:rPr>
+        <w:t xml:space="preserve"> — format textuel d'échange de données structuré en paires clé/valeur, listes et objets imbriqués.</w:t>
       </w:r>
     </w:p>
     <w:p>
@@ -16317,17 +15043,17 @@
           <w:bCs/>
           <w:rFonts w:ascii="Times New Roman" w:cs="Times New Roman" w:eastAsia="Times New Roman" w:hAnsi="Times New Roman"/>
         </w:rPr>
-        <w:t xml:space="preserve">AG Grid</w:t>
-      </w:r>
-      <w:r>
-        <w:rPr>
-          <w:b w:val="false"/>
-          <w:bCs w:val="false"/>
-          <w:i w:val="false"/>
-          <w:iCs w:val="false"/>
-          <w:rFonts w:ascii="Times New Roman" w:cs="Times New Roman" w:eastAsia="Times New Roman" w:hAnsi="Times New Roman"/>
-        </w:rPr>
-        <w:t xml:space="preserve"> — bibliothèque JavaScript de tableaux de données interactifs (tri, filtres, glisser-déposer) utilisée côté frontend.</w:t>
+        <w:t xml:space="preserve">ModelMother</w:t>
+      </w:r>
+      <w:r>
+        <w:rPr>
+          <w:b w:val="false"/>
+          <w:bCs w:val="false"/>
+          <w:i w:val="false"/>
+          <w:iCs w:val="false"/>
+          <w:rFonts w:ascii="Times New Roman" w:cs="Times New Roman" w:eastAsia="Times New Roman" w:hAnsi="Times New Roman"/>
+        </w:rPr>
+        <w:t xml:space="preserve"> — classe de base du framework interne d'APIX assurant la sérialisation/désérialisation récursive des modèles Python.</w:t>
       </w:r>
     </w:p>
     <w:p>
@@ -16346,6 +15072,198 @@
           <w:bCs/>
           <w:rFonts w:ascii="Times New Roman" w:cs="Times New Roman" w:eastAsia="Times New Roman" w:hAnsi="Times New Roman"/>
         </w:rPr>
+        <w:t xml:space="preserve">Wheel (.whl)</w:t>
+      </w:r>
+      <w:r>
+        <w:rPr>
+          <w:b w:val="false"/>
+          <w:bCs w:val="false"/>
+          <w:i w:val="false"/>
+          <w:iCs w:val="false"/>
+          <w:rFonts w:ascii="Times New Roman" w:cs="Times New Roman" w:eastAsia="Times New Roman" w:hAnsi="Times New Roman"/>
+        </w:rPr>
+        <w:t xml:space="preserve"> — format d'archive de distribution d'un paquet Python prêt à être installé.</w:t>
+      </w:r>
+    </w:p>
+    <w:p>
+      <w:pPr>
+        <w:pStyle w:val="ListParagraph"/>
+        <w:numPr>
+          <w:ilvl w:val="0"/>
+          <w:numId w:val="1"/>
+        </w:numPr>
+        <w:spacing w:after="100"/>
+        <w:ind w:left="0"/>
+      </w:pPr>
+      <w:r>
+        <w:rPr>
+          <w:b/>
+          <w:bCs/>
+          <w:rFonts w:ascii="Times New Roman" w:cs="Times New Roman" w:eastAsia="Times New Roman" w:hAnsi="Times New Roman"/>
+        </w:rPr>
+        <w:t xml:space="preserve">Conteneur / Docker</w:t>
+      </w:r>
+      <w:r>
+        <w:rPr>
+          <w:b w:val="false"/>
+          <w:bCs w:val="false"/>
+          <w:i w:val="false"/>
+          <w:iCs w:val="false"/>
+          <w:rFonts w:ascii="Times New Roman" w:cs="Times New Roman" w:eastAsia="Times New Roman" w:hAnsi="Times New Roman"/>
+        </w:rPr>
+        <w:t xml:space="preserve"> — environnement d'exécution isolé embarquant une application et ses dépendances, indépendamment du système hôte.</w:t>
+      </w:r>
+    </w:p>
+    <w:p>
+      <w:pPr>
+        <w:pStyle w:val="ListParagraph"/>
+        <w:numPr>
+          <w:ilvl w:val="0"/>
+          <w:numId w:val="1"/>
+        </w:numPr>
+        <w:spacing w:after="100"/>
+        <w:ind w:left="0"/>
+      </w:pPr>
+      <w:r>
+        <w:rPr>
+          <w:b/>
+          <w:bCs/>
+          <w:rFonts w:ascii="Times New Roman" w:cs="Times New Roman" w:eastAsia="Times New Roman" w:hAnsi="Times New Roman"/>
+        </w:rPr>
+        <w:t xml:space="preserve">Docker Compose</w:t>
+      </w:r>
+      <w:r>
+        <w:rPr>
+          <w:b w:val="false"/>
+          <w:bCs w:val="false"/>
+          <w:i w:val="false"/>
+          <w:iCs w:val="false"/>
+          <w:rFonts w:ascii="Times New Roman" w:cs="Times New Roman" w:eastAsia="Times New Roman" w:hAnsi="Times New Roman"/>
+        </w:rPr>
+        <w:t xml:space="preserve"> — outil d'orchestration de plusieurs conteneurs décrits dans un fichier </w:t>
+      </w:r>
+      <w:r>
+        <w:rPr>
+          <w:rStyle w:val="SourceCode"/>
+          <w:rFonts w:ascii="Courier New" w:cs="Courier New" w:eastAsia="Courier New" w:hAnsi="Courier New"/>
+          <w:shd w:fill="D3D3D3" w:color="auto" w:val="clear"/>
+        </w:rPr>
+        <w:t xml:space="preserve">docker-compose.yml</w:t>
+      </w:r>
+      <w:r>
+        <w:rPr>
+          <w:b w:val="false"/>
+          <w:bCs w:val="false"/>
+          <w:i w:val="false"/>
+          <w:iCs w:val="false"/>
+          <w:rFonts w:ascii="Times New Roman" w:cs="Times New Roman" w:eastAsia="Times New Roman" w:hAnsi="Times New Roman"/>
+        </w:rPr>
+        <w:t xml:space="preserve">.</w:t>
+      </w:r>
+    </w:p>
+    <w:p>
+      <w:pPr>
+        <w:pStyle w:val="ListParagraph"/>
+        <w:numPr>
+          <w:ilvl w:val="0"/>
+          <w:numId w:val="1"/>
+        </w:numPr>
+        <w:spacing w:after="100"/>
+        <w:ind w:left="0"/>
+      </w:pPr>
+      <w:r>
+        <w:rPr>
+          <w:b/>
+          <w:bCs/>
+          <w:rFonts w:ascii="Times New Roman" w:cs="Times New Roman" w:eastAsia="Times New Roman" w:hAnsi="Times New Roman"/>
+        </w:rPr>
+        <w:t xml:space="preserve">CI/CD</w:t>
+      </w:r>
+      <w:r>
+        <w:rPr>
+          <w:b w:val="false"/>
+          <w:bCs w:val="false"/>
+          <w:i w:val="false"/>
+          <w:iCs w:val="false"/>
+          <w:rFonts w:ascii="Times New Roman" w:cs="Times New Roman" w:eastAsia="Times New Roman" w:hAnsi="Times New Roman"/>
+        </w:rPr>
+        <w:t xml:space="preserve"> — intégration et livraison continues : automatisation du build, des tests et du packaging à chaque modification du code.</w:t>
+      </w:r>
+    </w:p>
+    <w:p>
+      <w:pPr>
+        <w:pStyle w:val="ListParagraph"/>
+        <w:numPr>
+          <w:ilvl w:val="0"/>
+          <w:numId w:val="1"/>
+        </w:numPr>
+        <w:spacing w:after="100"/>
+        <w:ind w:left="0"/>
+      </w:pPr>
+      <w:r>
+        <w:rPr>
+          <w:b/>
+          <w:bCs/>
+          <w:rFonts w:ascii="Times New Roman" w:cs="Times New Roman" w:eastAsia="Times New Roman" w:hAnsi="Times New Roman"/>
+        </w:rPr>
+        <w:t xml:space="preserve">SSH / SCP</w:t>
+      </w:r>
+      <w:r>
+        <w:rPr>
+          <w:b w:val="false"/>
+          <w:bCs w:val="false"/>
+          <w:i w:val="false"/>
+          <w:iCs w:val="false"/>
+          <w:rFonts w:ascii="Times New Roman" w:cs="Times New Roman" w:eastAsia="Times New Roman" w:hAnsi="Times New Roman"/>
+        </w:rPr>
+        <w:t xml:space="preserve"> — protocoles d'accès distant sécurisé à un serveur (SSH) et de copie de fichiers chiffrée (SCP).</w:t>
+      </w:r>
+    </w:p>
+    <w:p>
+      <w:pPr>
+        <w:pStyle w:val="ListParagraph"/>
+        <w:numPr>
+          <w:ilvl w:val="0"/>
+          <w:numId w:val="1"/>
+        </w:numPr>
+        <w:spacing w:after="100"/>
+        <w:ind w:left="0"/>
+      </w:pPr>
+      <w:r>
+        <w:rPr>
+          <w:b/>
+          <w:bCs/>
+          <w:rFonts w:ascii="Times New Roman" w:cs="Times New Roman" w:eastAsia="Times New Roman" w:hAnsi="Times New Roman"/>
+        </w:rPr>
+        <w:t xml:space="preserve">AG Grid</w:t>
+      </w:r>
+      <w:r>
+        <w:rPr>
+          <w:b w:val="false"/>
+          <w:bCs w:val="false"/>
+          <w:i w:val="false"/>
+          <w:iCs w:val="false"/>
+          <w:rFonts w:ascii="Times New Roman" w:cs="Times New Roman" w:eastAsia="Times New Roman" w:hAnsi="Times New Roman"/>
+        </w:rPr>
+        <w:t xml:space="preserve"> — bibliothèque JavaScript de tableaux de données interactifs (tri, filtres, glisser-déposer) utilisée côté frontend.</w:t>
+      </w:r>
+    </w:p>
+    <w:p>
+      <w:pPr>
+        <w:pStyle w:val="ListParagraph"/>
+        <w:numPr>
+          <w:ilvl w:val="0"/>
+          <w:numId w:val="1"/>
+        </w:numPr>
+        <w:spacing w:after="100"/>
+        <w:ind w:left="0"/>
+      </w:pPr>
+      <w:r>
+        <w:rPr>
+          <w:b/>
+          <w:bCs/>
+          <w:rFonts w:ascii="Times New Roman" w:cs="Times New Roman" w:eastAsia="Times New Roman" w:hAnsi="Times New Roman"/>
+        </w:rPr>
         <w:t xml:space="preserve">DRF</w:t>
       </w:r>
       <w:r>
@@ -16427,7 +15345,7 @@
         </w:rPr>
         <w:t xml:space="preserve"> [en ligne]. Disponible sur : </w:t>
       </w:r>
-      <w:hyperlink w:history="1" r:id="rId5xzo2wbybgc5oqoafdzmf">
+      <w:hyperlink w:history="1" r:id="rId1f7ey16xcr8mh5hhbqybs">
         <w:r>
           <w:rPr>
             <w:u w:val="single"/>
@@ -16491,7 +15409,7 @@
         </w:rPr>
         <w:t xml:space="preserve"> [en ligne]. Disponible sur : </w:t>
       </w:r>
-      <w:hyperlink w:history="1" r:id="rIdzk-oszpt1ges_agv8atqs">
+      <w:hyperlink w:history="1" r:id="rIdpthxz2-wkbi35nqzdlrqi">
         <w:r>
           <w:rPr>
             <w:u w:val="single"/>
@@ -16555,7 +15473,7 @@
         </w:rPr>
         <w:t xml:space="preserve"> [en ligne]. Disponible sur : </w:t>
       </w:r>
-      <w:hyperlink w:history="1" r:id="rIdcygczt6mzv0h6eosb-kmh">
+      <w:hyperlink w:history="1" r:id="rIdabysc6wpfamh2c76ovbzw">
         <w:r>
           <w:rPr>
             <w:u w:val="single"/>
@@ -16619,7 +15537,7 @@
         </w:rPr>
         <w:t xml:space="preserve"> [en ligne]. Disponible sur : </w:t>
       </w:r>
-      <w:hyperlink w:history="1" r:id="rIdehithubulsr_qotrcsnoj">
+      <w:hyperlink w:history="1" r:id="rIdmslrqpjra-5pdtxiiuysr">
         <w:r>
           <w:rPr>
             <w:u w:val="single"/>
@@ -16683,7 +15601,7 @@
         </w:rPr>
         <w:t xml:space="preserve"> [en ligne]. Disponible sur : </w:t>
       </w:r>
-      <w:hyperlink w:history="1" r:id="rIdygjqtf1j_79onjmdggsud">
+      <w:hyperlink w:history="1" r:id="rIduxtxeyr7nl-lea_zekpmp">
         <w:r>
           <w:rPr>
             <w:u w:val="single"/>
@@ -16747,7 +15665,7 @@
         </w:rPr>
         <w:t xml:space="preserve"> [en ligne]. Disponible sur : </w:t>
       </w:r>
-      <w:hyperlink w:history="1" r:id="rId1x5edumdxfwhkeoaif0lj">
+      <w:hyperlink w:history="1" r:id="rIdoqu3e_p0bjibczxiil-2i">
         <w:r>
           <w:rPr>
             <w:u w:val="single"/>
@@ -16852,7 +15770,7 @@
         </w:rPr>
         <w:t xml:space="preserve"> [en ligne]. Disponible sur : </w:t>
       </w:r>
-      <w:hyperlink w:history="1" r:id="rIdqw6isb_hqycpbfpcjb0rt">
+      <w:hyperlink w:history="1" r:id="rIdni9kahrdipi2ab2_iqfg2">
         <w:r>
           <w:rPr>
             <w:u w:val="single"/>
@@ -16970,7 +15888,1394 @@
           <w:szCs w:val="23"/>
           <w:rFonts w:ascii="Times New Roman" w:cs="Times New Roman" w:eastAsia="Times New Roman" w:hAnsi="Times New Roman"/>
         </w:rPr>
-        <w:t xml:space="preserve">Figure 8 — Modèle de communication Modbus maître/esclave : l'automate maître envoie une requête, l'analyseur APIX (esclave) y répond. L'esclave ne transmet jamais de données spontanément.</w:t>
+        <w:t xml:space="preserve">Figure 8 : Modèle de communication Modbus maître/esclave : l'automate maître envoie une requête, l'analyseur APIX (esclave) y répond. L'esclave ne transmet jamais de données spontanément.</w:t>
+      </w:r>
+    </w:p>
+    <w:p/>
+    <w:p>
+      <w:pPr>
+        <w:spacing w:after="150"/>
+      </w:pPr>
+      <w:r>
+        <w:rPr>
+          <w:b/>
+          <w:bCs/>
+          <w:i w:val="false"/>
+          <w:iCs w:val="false"/>
+          <w:color w:val="1b1c22"/>
+          <w:sz w:val="30"/>
+          <w:szCs w:val="30"/>
+          <w:rFonts w:ascii="Times New Roman" w:cs="Times New Roman" w:eastAsia="Times New Roman" w:hAnsi="Times New Roman"/>
+        </w:rPr>
+        <w:t xml:space="preserve">Annexe B — Hiérarchie complète des classes de modèles</w:t>
+      </w:r>
+    </w:p>
+    <w:p>
+      <w:pPr>
+        <w:spacing w:after="200"/>
+      </w:pPr>
+      <w:r>
+        <w:rPr>
+          <w:i/>
+          <w:iCs/>
+          <w:color w:val="de7417"/>
+          <w:sz w:val="23"/>
+          <w:szCs w:val="23"/>
+          <w:rFonts w:ascii="Times New Roman" w:cs="Times New Roman" w:eastAsia="Times New Roman" w:hAnsi="Times New Roman"/>
+        </w:rPr>
+        <w:t xml:space="preserve">Arbre complet des classes de modèles du projet, complément de la Figure 3 (cf. IV.2.d). Chaque feuille hérite de ModelMother et bénéficie automatiquement des mécanismes de sérialisation.</w:t>
+      </w:r>
+    </w:p>
+    <w:p>
+      <w:pPr>
+        <w:pStyle w:val="SourceCode"/>
+        <w:shd w:fill="D3D3D3" w:color="auto" w:val="clear"/>
+        <w:spacing/>
+      </w:pPr>
+      <w:r>
+        <w:rPr>
+          <w:color w:val="1b1c22"/>
+          <w:sz w:val="23"/>
+          <w:szCs w:val="23"/>
+          <w:rFonts w:ascii="Courier New" w:cs="Courier New" w:eastAsia="Courier New" w:hAnsi="Courier New"/>
+        </w:rPr>
+        <w:t xml:space="preserve">ModelMother</w:t>
+      </w:r>
+      <w:r>
+        <w:br/>
+      </w:r>
+      <w:r>
+        <w:rPr>
+          <w:color w:val="1b1c22"/>
+          <w:sz w:val="23"/>
+          <w:szCs w:val="23"/>
+          <w:rFonts w:ascii="Courier New" w:cs="Courier New" w:eastAsia="Courier New" w:hAnsi="Courier New"/>
+        </w:rPr>
+        <w:t xml:space="preserve">├── NetworkParameters              ← paramètres réseau complets (network.json)</w:t>
+      </w:r>
+      <w:r>
+        <w:br/>
+      </w:r>
+      <w:r>
+        <w:rPr>
+          <w:color w:val="1b1c22"/>
+          <w:sz w:val="23"/>
+          <w:szCs w:val="23"/>
+          <w:rFonts w:ascii="Courier New" w:cs="Courier New" w:eastAsia="Courier New" w:hAnsi="Courier New"/>
+        </w:rPr>
+        <w:t xml:space="preserve">│   ├── TcpParameters              ← port TCP, flag enabled</w:t>
+      </w:r>
+      <w:r>
+        <w:br/>
+      </w:r>
+      <w:r>
+        <w:rPr>
+          <w:color w:val="1b1c22"/>
+          <w:sz w:val="23"/>
+          <w:szCs w:val="23"/>
+          <w:rFonts w:ascii="Courier New" w:cs="Courier New" w:eastAsia="Courier New" w:hAnsi="Courier New"/>
+        </w:rPr>
+        <w:t xml:space="preserve">│   └── SerialParametersList       ← liste de ports série (ModelListMother)</w:t>
+      </w:r>
+      <w:r>
+        <w:br/>
+      </w:r>
+      <w:r>
+        <w:rPr>
+          <w:color w:val="1b1c22"/>
+          <w:sz w:val="23"/>
+          <w:szCs w:val="23"/>
+          <w:rFonts w:ascii="Courier New" w:cs="Courier New" w:eastAsia="Courier New" w:hAnsi="Courier New"/>
+        </w:rPr>
+        <w:t xml:space="preserve">│       └── SerialParameters       ← un port série (bauds, parité, bits de stop…)</w:t>
+      </w:r>
+      <w:r>
+        <w:br/>
+      </w:r>
+      <w:r>
+        <w:rPr>
+          <w:color w:val="1b1c22"/>
+          <w:sz w:val="23"/>
+          <w:szCs w:val="23"/>
+          <w:rFonts w:ascii="Courier New" w:cs="Courier New" w:eastAsia="Courier New" w:hAnsi="Courier New"/>
+        </w:rPr>
+        <w:t xml:space="preserve">└── ProtocolParameters             ← protocole complet (protocol.json)</w:t>
+      </w:r>
+      <w:r>
+        <w:br/>
+      </w:r>
+      <w:r>
+        <w:rPr>
+          <w:color w:val="1b1c22"/>
+          <w:sz w:val="23"/>
+          <w:szCs w:val="23"/>
+          <w:rFonts w:ascii="Courier New" w:cs="Courier New" w:eastAsia="Courier New" w:hAnsi="Courier New"/>
+        </w:rPr>
+        <w:t xml:space="preserve">    ├── HoldingRegisterParameters</w:t>
+      </w:r>
+      <w:r>
+        <w:br/>
+      </w:r>
+      <w:r>
+        <w:rPr>
+          <w:color w:val="1b1c22"/>
+          <w:sz w:val="23"/>
+          <w:szCs w:val="23"/>
+          <w:rFonts w:ascii="Courier New" w:cs="Courier New" w:eastAsia="Courier New" w:hAnsi="Courier New"/>
+        </w:rPr>
+        <w:t xml:space="preserve">    │   └── MeasureParameters</w:t>
+      </w:r>
+      <w:r>
+        <w:br/>
+      </w:r>
+      <w:r>
+        <w:rPr>
+          <w:color w:val="1b1c22"/>
+          <w:sz w:val="23"/>
+          <w:szCs w:val="23"/>
+          <w:rFonts w:ascii="Courier New" w:cs="Courier New" w:eastAsia="Courier New" w:hAnsi="Courier New"/>
+        </w:rPr>
+        <w:t xml:space="preserve">    │       ├── ElementsDetailedList                (ModelDictToListMother)</w:t>
+      </w:r>
+      <w:r>
+        <w:br/>
+      </w:r>
+      <w:r>
+        <w:rPr>
+          <w:color w:val="1b1c22"/>
+          <w:sz w:val="23"/>
+          <w:szCs w:val="23"/>
+          <w:rFonts w:ascii="Courier New" w:cs="Courier New" w:eastAsia="Courier New" w:hAnsi="Courier New"/>
+        </w:rPr>
+        <w:t xml:space="preserve">    │       │   └── ElementDetailParameters         ← un élément détaillé</w:t>
+      </w:r>
+      <w:r>
+        <w:br/>
+      </w:r>
+      <w:r>
+        <w:rPr>
+          <w:color w:val="1b1c22"/>
+          <w:sz w:val="23"/>
+          <w:szCs w:val="23"/>
+          <w:rFonts w:ascii="Courier New" w:cs="Courier New" w:eastAsia="Courier New" w:hAnsi="Courier New"/>
+        </w:rPr>
+        <w:t xml:space="preserve">    │       │       └── ElementPropertyParameters   ← raw_value, normalized_value…</w:t>
+      </w:r>
+      <w:r>
+        <w:br/>
+      </w:r>
+      <w:r>
+        <w:rPr>
+          <w:color w:val="1b1c22"/>
+          <w:sz w:val="23"/>
+          <w:szCs w:val="23"/>
+          <w:rFonts w:ascii="Courier New" w:cs="Courier New" w:eastAsia="Courier New" w:hAnsi="Courier New"/>
+        </w:rPr>
+        <w:t xml:space="preserve">    │       └── ElementList                         (ModelDictToListMother)</w:t>
+      </w:r>
+      <w:r>
+        <w:br/>
+      </w:r>
+      <w:r>
+        <w:rPr>
+          <w:color w:val="1b1c22"/>
+          <w:sz w:val="23"/>
+          <w:szCs w:val="23"/>
+          <w:rFonts w:ascii="Courier New" w:cs="Courier New" w:eastAsia="Courier New" w:hAnsi="Courier New"/>
+        </w:rPr>
+        <w:t xml:space="preserve">    │           └── ElementParameters               ← un élément simple</w:t>
+      </w:r>
+      <w:r>
+        <w:br/>
+      </w:r>
+      <w:r>
+        <w:rPr>
+          <w:color w:val="1b1c22"/>
+          <w:sz w:val="23"/>
+          <w:szCs w:val="23"/>
+          <w:rFonts w:ascii="Courier New" w:cs="Courier New" w:eastAsia="Courier New" w:hAnsi="Courier New"/>
+        </w:rPr>
+        <w:t xml:space="preserve">    └── InputRegisterParameters</w:t>
+      </w:r>
+      <w:r>
+        <w:br/>
+      </w:r>
+      <w:r>
+        <w:rPr>
+          <w:color w:val="1b1c22"/>
+          <w:sz w:val="23"/>
+          <w:szCs w:val="23"/>
+          <w:rFonts w:ascii="Courier New" w:cs="Courier New" w:eastAsia="Courier New" w:hAnsi="Courier New"/>
+        </w:rPr>
+        <w:t xml:space="preserve">        ├── AlarmParametersList     (ModelDictToListMother)</w:t>
+      </w:r>
+      <w:r>
+        <w:br/>
+      </w:r>
+      <w:r>
+        <w:rPr>
+          <w:color w:val="1b1c22"/>
+          <w:sz w:val="23"/>
+          <w:szCs w:val="23"/>
+          <w:rFonts w:ascii="Courier New" w:cs="Courier New" w:eastAsia="Courier New" w:hAnsi="Courier New"/>
+        </w:rPr>
+        <w:t xml:space="preserve">        │   └── AlarmEntryParameters ← une alarme</w:t>
+      </w:r>
+      <w:r>
+        <w:br/>
+      </w:r>
+      <w:r>
+        <w:rPr>
+          <w:color w:val="1b1c22"/>
+          <w:sz w:val="23"/>
+          <w:szCs w:val="23"/>
+          <w:rFonts w:ascii="Courier New" w:cs="Courier New" w:eastAsia="Courier New" w:hAnsi="Courier New"/>
+        </w:rPr>
+        <w:t xml:space="preserve">        ├── MeasureParameters</w:t>
+      </w:r>
+      <w:r>
+        <w:br/>
+      </w:r>
+      <w:r>
+        <w:rPr>
+          <w:color w:val="1b1c22"/>
+          <w:sz w:val="23"/>
+          <w:szCs w:val="23"/>
+          <w:rFonts w:ascii="Courier New" w:cs="Courier New" w:eastAsia="Courier New" w:hAnsi="Courier New"/>
+        </w:rPr>
+        <w:t xml:space="preserve">        ├── InformationParameters</w:t>
+      </w:r>
+      <w:r>
+        <w:br/>
+      </w:r>
+      <w:r>
+        <w:rPr>
+          <w:color w:val="1b1c22"/>
+          <w:sz w:val="23"/>
+          <w:szCs w:val="23"/>
+          <w:rFonts w:ascii="Courier New" w:cs="Courier New" w:eastAsia="Courier New" w:hAnsi="Courier New"/>
+        </w:rPr>
+        <w:t xml:space="preserve">        ├── SystemParameters</w:t>
+      </w:r>
+      <w:r>
+        <w:br/>
+      </w:r>
+      <w:r>
+        <w:rPr>
+          <w:color w:val="1b1c22"/>
+          <w:sz w:val="23"/>
+          <w:szCs w:val="23"/>
+          <w:rFonts w:ascii="Courier New" w:cs="Courier New" w:eastAsia="Courier New" w:hAnsi="Courier New"/>
+        </w:rPr>
+        <w:t xml:space="preserve">        └── CommandParameters</w:t>
+      </w:r>
+      <w:r>
+        <w:br/>
+      </w:r>
+    </w:p>
+    <w:p/>
+    <w:p>
+      <w:pPr>
+        <w:spacing w:after="150"/>
+      </w:pPr>
+      <w:r>
+        <w:rPr>
+          <w:b/>
+          <w:bCs/>
+          <w:i w:val="false"/>
+          <w:iCs w:val="false"/>
+          <w:color w:val="1b1c22"/>
+          <w:sz w:val="30"/>
+          <w:szCs w:val="30"/>
+          <w:rFonts w:ascii="Times New Roman" w:cs="Times New Roman" w:eastAsia="Times New Roman" w:hAnsi="Times New Roman"/>
+        </w:rPr>
+        <w:t xml:space="preserve">Annexe C — Structure complète du fichier </w:t>
+      </w:r>
+      <w:r>
+        <w:rPr>
+          <w:color w:val="1b1c22"/>
+          <w:sz w:val="30"/>
+          <w:szCs w:val="30"/>
+          <w:rStyle w:val="SourceCode"/>
+          <w:rFonts w:ascii="Courier New" w:cs="Courier New" w:eastAsia="Courier New" w:hAnsi="Courier New"/>
+          <w:shd w:fill="D3D3D3" w:color="auto" w:val="clear"/>
+        </w:rPr>
+        <w:t xml:space="preserve">network.json</w:t>
+      </w:r>
+    </w:p>
+    <w:p>
+      <w:pPr>
+        <w:spacing w:after="200"/>
+      </w:pPr>
+      <w:r>
+        <w:rPr>
+          <w:i/>
+          <w:iCs/>
+          <w:color w:val="de7417"/>
+          <w:sz w:val="23"/>
+          <w:szCs w:val="23"/>
+          <w:rFonts w:ascii="Times New Roman" w:cs="Times New Roman" w:eastAsia="Times New Roman" w:hAnsi="Times New Roman"/>
+        </w:rPr>
+        <w:t xml:space="preserve">Exemple complet illustrant les quatre sections décrites en IV.3.a (identifiant d'esclave, configuration TCP, ports série, configuration ZMQ).</w:t>
+      </w:r>
+    </w:p>
+    <w:p>
+      <w:pPr>
+        <w:pStyle w:val="SourceCode"/>
+        <w:shd w:fill="D3D3D3" w:color="auto" w:val="clear"/>
+        <w:spacing/>
+      </w:pPr>
+      <w:r>
+        <w:rPr>
+          <w:i/>
+          <w:iCs/>
+          <w:color w:val="888880"/>
+          <w:sz w:val="21"/>
+          <w:szCs w:val="21"/>
+        </w:rPr>
+        <w:t xml:space="preserve">json</w:t>
+      </w:r>
+      <w:r>
+        <w:br/>
+        <w:br/>
+      </w:r>
+      <w:r>
+        <w:rPr>
+          <w:color w:val="545664"/>
+          <w:sz w:val="23"/>
+          <w:szCs w:val="23"/>
+          <w:rFonts w:ascii="Courier New" w:cs="Courier New" w:eastAsia="Courier New" w:hAnsi="Courier New"/>
+        </w:rPr>
+        <w:t xml:space="preserve">{</w:t>
+      </w:r>
+      <w:r>
+        <w:br/>
+      </w:r>
+      <w:r>
+        <w:rPr>
+          <w:color w:val="545664"/>
+          <w:sz w:val="23"/>
+          <w:szCs w:val="23"/>
+          <w:rFonts w:ascii="Courier New" w:cs="Courier New" w:eastAsia="Courier New" w:hAnsi="Courier New"/>
+        </w:rPr>
+        <w:t xml:space="preserve">  </w:t>
+      </w:r>
+      <w:r>
+        <w:rPr>
+          <w:color w:val="16a6ab"/>
+          <w:sz w:val="23"/>
+          <w:szCs w:val="23"/>
+          <w:rFonts w:ascii="Courier New" w:cs="Courier New" w:eastAsia="Courier New" w:hAnsi="Courier New"/>
+        </w:rPr>
+        <w:t xml:space="preserve">"data"</w:t>
+      </w:r>
+      <w:r>
+        <w:rPr>
+          <w:color w:val="dd2c38"/>
+          <w:sz w:val="23"/>
+          <w:szCs w:val="23"/>
+          <w:rFonts w:ascii="Courier New" w:cs="Courier New" w:eastAsia="Courier New" w:hAnsi="Courier New"/>
+        </w:rPr>
+        <w:t xml:space="preserve">:</w:t>
+      </w:r>
+      <w:r>
+        <w:rPr>
+          <w:color w:val="545664"/>
+          <w:sz w:val="23"/>
+          <w:szCs w:val="23"/>
+          <w:rFonts w:ascii="Courier New" w:cs="Courier New" w:eastAsia="Courier New" w:hAnsi="Courier New"/>
+        </w:rPr>
+        <w:t xml:space="preserve"> </w:t>
+      </w:r>
+      <w:r>
+        <w:rPr>
+          <w:color w:val="545664"/>
+          <w:sz w:val="23"/>
+          <w:szCs w:val="23"/>
+          <w:rFonts w:ascii="Courier New" w:cs="Courier New" w:eastAsia="Courier New" w:hAnsi="Courier New"/>
+        </w:rPr>
+        <w:t xml:space="preserve">{</w:t>
+      </w:r>
+      <w:r>
+        <w:br/>
+      </w:r>
+      <w:r>
+        <w:rPr>
+          <w:color w:val="545664"/>
+          <w:sz w:val="23"/>
+          <w:szCs w:val="23"/>
+          <w:rFonts w:ascii="Courier New" w:cs="Courier New" w:eastAsia="Courier New" w:hAnsi="Courier New"/>
+        </w:rPr>
+        <w:t xml:space="preserve">    </w:t>
+      </w:r>
+      <w:r>
+        <w:rPr>
+          <w:color w:val="16a6ab"/>
+          <w:sz w:val="23"/>
+          <w:szCs w:val="23"/>
+          <w:rFonts w:ascii="Courier New" w:cs="Courier New" w:eastAsia="Courier New" w:hAnsi="Courier New"/>
+        </w:rPr>
+        <w:t xml:space="preserve">"slave_id"</w:t>
+      </w:r>
+      <w:r>
+        <w:rPr>
+          <w:color w:val="dd2c38"/>
+          <w:sz w:val="23"/>
+          <w:szCs w:val="23"/>
+          <w:rFonts w:ascii="Courier New" w:cs="Courier New" w:eastAsia="Courier New" w:hAnsi="Courier New"/>
+        </w:rPr>
+        <w:t xml:space="preserve">:</w:t>
+      </w:r>
+      <w:r>
+        <w:rPr>
+          <w:color w:val="545664"/>
+          <w:sz w:val="23"/>
+          <w:szCs w:val="23"/>
+          <w:rFonts w:ascii="Courier New" w:cs="Courier New" w:eastAsia="Courier New" w:hAnsi="Courier New"/>
+        </w:rPr>
+        <w:t xml:space="preserve"> </w:t>
+      </w:r>
+      <w:r>
+        <w:rPr>
+          <w:color w:val="8f47e1"/>
+          <w:sz w:val="23"/>
+          <w:szCs w:val="23"/>
+          <w:rFonts w:ascii="Courier New" w:cs="Courier New" w:eastAsia="Courier New" w:hAnsi="Courier New"/>
+        </w:rPr>
+        <w:t xml:space="preserve">1</w:t>
+      </w:r>
+      <w:r>
+        <w:rPr>
+          <w:color w:val="545664"/>
+          <w:sz w:val="23"/>
+          <w:szCs w:val="23"/>
+          <w:rFonts w:ascii="Courier New" w:cs="Courier New" w:eastAsia="Courier New" w:hAnsi="Courier New"/>
+        </w:rPr>
+        <w:t xml:space="preserve">,</w:t>
+      </w:r>
+      <w:r>
+        <w:br/>
+      </w:r>
+      <w:r>
+        <w:rPr>
+          <w:color w:val="545664"/>
+          <w:sz w:val="23"/>
+          <w:szCs w:val="23"/>
+          <w:rFonts w:ascii="Courier New" w:cs="Courier New" w:eastAsia="Courier New" w:hAnsi="Courier New"/>
+        </w:rPr>
+        <w:t xml:space="preserve">    </w:t>
+      </w:r>
+      <w:r>
+        <w:rPr>
+          <w:color w:val="16a6ab"/>
+          <w:sz w:val="23"/>
+          <w:szCs w:val="23"/>
+          <w:rFonts w:ascii="Courier New" w:cs="Courier New" w:eastAsia="Courier New" w:hAnsi="Courier New"/>
+        </w:rPr>
+        <w:t xml:space="preserve">"tcp"</w:t>
+      </w:r>
+      <w:r>
+        <w:rPr>
+          <w:color w:val="dd2c38"/>
+          <w:sz w:val="23"/>
+          <w:szCs w:val="23"/>
+          <w:rFonts w:ascii="Courier New" w:cs="Courier New" w:eastAsia="Courier New" w:hAnsi="Courier New"/>
+        </w:rPr>
+        <w:t xml:space="preserve">:</w:t>
+      </w:r>
+      <w:r>
+        <w:rPr>
+          <w:color w:val="545664"/>
+          <w:sz w:val="23"/>
+          <w:szCs w:val="23"/>
+          <w:rFonts w:ascii="Courier New" w:cs="Courier New" w:eastAsia="Courier New" w:hAnsi="Courier New"/>
+        </w:rPr>
+        <w:t xml:space="preserve"> </w:t>
+      </w:r>
+      <w:r>
+        <w:rPr>
+          <w:color w:val="545664"/>
+          <w:sz w:val="23"/>
+          <w:szCs w:val="23"/>
+          <w:rFonts w:ascii="Courier New" w:cs="Courier New" w:eastAsia="Courier New" w:hAnsi="Courier New"/>
+        </w:rPr>
+        <w:t xml:space="preserve">{</w:t>
+      </w:r>
+      <w:r>
+        <w:rPr>
+          <w:color w:val="545664"/>
+          <w:sz w:val="23"/>
+          <w:szCs w:val="23"/>
+          <w:rFonts w:ascii="Courier New" w:cs="Courier New" w:eastAsia="Courier New" w:hAnsi="Courier New"/>
+        </w:rPr>
+        <w:t xml:space="preserve"> </w:t>
+      </w:r>
+      <w:r>
+        <w:rPr>
+          <w:color w:val="16a6ab"/>
+          <w:sz w:val="23"/>
+          <w:szCs w:val="23"/>
+          <w:rFonts w:ascii="Courier New" w:cs="Courier New" w:eastAsia="Courier New" w:hAnsi="Courier New"/>
+        </w:rPr>
+        <w:t xml:space="preserve">"enabled"</w:t>
+      </w:r>
+      <w:r>
+        <w:rPr>
+          <w:color w:val="dd2c38"/>
+          <w:sz w:val="23"/>
+          <w:szCs w:val="23"/>
+          <w:rFonts w:ascii="Courier New" w:cs="Courier New" w:eastAsia="Courier New" w:hAnsi="Courier New"/>
+        </w:rPr>
+        <w:t xml:space="preserve">:</w:t>
+      </w:r>
+      <w:r>
+        <w:rPr>
+          <w:color w:val="545664"/>
+          <w:sz w:val="23"/>
+          <w:szCs w:val="23"/>
+          <w:rFonts w:ascii="Courier New" w:cs="Courier New" w:eastAsia="Courier New" w:hAnsi="Courier New"/>
+        </w:rPr>
+        <w:t xml:space="preserve"> </w:t>
+      </w:r>
+      <w:r>
+        <w:rPr>
+          <w:color w:val="8f47e1"/>
+          <w:sz w:val="23"/>
+          <w:szCs w:val="23"/>
+          <w:rFonts w:ascii="Courier New" w:cs="Courier New" w:eastAsia="Courier New" w:hAnsi="Courier New"/>
+        </w:rPr>
+        <w:t xml:space="preserve">true</w:t>
+      </w:r>
+      <w:r>
+        <w:rPr>
+          <w:color w:val="545664"/>
+          <w:sz w:val="23"/>
+          <w:szCs w:val="23"/>
+          <w:rFonts w:ascii="Courier New" w:cs="Courier New" w:eastAsia="Courier New" w:hAnsi="Courier New"/>
+        </w:rPr>
+        <w:t xml:space="preserve">,</w:t>
+      </w:r>
+      <w:r>
+        <w:rPr>
+          <w:color w:val="545664"/>
+          <w:sz w:val="23"/>
+          <w:szCs w:val="23"/>
+          <w:rFonts w:ascii="Courier New" w:cs="Courier New" w:eastAsia="Courier New" w:hAnsi="Courier New"/>
+        </w:rPr>
+        <w:t xml:space="preserve"> </w:t>
+      </w:r>
+      <w:r>
+        <w:rPr>
+          <w:color w:val="16a6ab"/>
+          <w:sz w:val="23"/>
+          <w:szCs w:val="23"/>
+          <w:rFonts w:ascii="Courier New" w:cs="Courier New" w:eastAsia="Courier New" w:hAnsi="Courier New"/>
+        </w:rPr>
+        <w:t xml:space="preserve">"port"</w:t>
+      </w:r>
+      <w:r>
+        <w:rPr>
+          <w:color w:val="dd2c38"/>
+          <w:sz w:val="23"/>
+          <w:szCs w:val="23"/>
+          <w:rFonts w:ascii="Courier New" w:cs="Courier New" w:eastAsia="Courier New" w:hAnsi="Courier New"/>
+        </w:rPr>
+        <w:t xml:space="preserve">:</w:t>
+      </w:r>
+      <w:r>
+        <w:rPr>
+          <w:color w:val="545664"/>
+          <w:sz w:val="23"/>
+          <w:szCs w:val="23"/>
+          <w:rFonts w:ascii="Courier New" w:cs="Courier New" w:eastAsia="Courier New" w:hAnsi="Courier New"/>
+        </w:rPr>
+        <w:t xml:space="preserve"> </w:t>
+      </w:r>
+      <w:r>
+        <w:rPr>
+          <w:color w:val="8f47e1"/>
+          <w:sz w:val="23"/>
+          <w:szCs w:val="23"/>
+          <w:rFonts w:ascii="Courier New" w:cs="Courier New" w:eastAsia="Courier New" w:hAnsi="Courier New"/>
+        </w:rPr>
+        <w:t xml:space="preserve">502</w:t>
+      </w:r>
+      <w:r>
+        <w:rPr>
+          <w:color w:val="545664"/>
+          <w:sz w:val="23"/>
+          <w:szCs w:val="23"/>
+          <w:rFonts w:ascii="Courier New" w:cs="Courier New" w:eastAsia="Courier New" w:hAnsi="Courier New"/>
+        </w:rPr>
+        <w:t xml:space="preserve"> </w:t>
+      </w:r>
+      <w:r>
+        <w:rPr>
+          <w:color w:val="545664"/>
+          <w:sz w:val="23"/>
+          <w:szCs w:val="23"/>
+          <w:rFonts w:ascii="Courier New" w:cs="Courier New" w:eastAsia="Courier New" w:hAnsi="Courier New"/>
+        </w:rPr>
+        <w:t xml:space="preserve">}</w:t>
+      </w:r>
+      <w:r>
+        <w:rPr>
+          <w:color w:val="545664"/>
+          <w:sz w:val="23"/>
+          <w:szCs w:val="23"/>
+          <w:rFonts w:ascii="Courier New" w:cs="Courier New" w:eastAsia="Courier New" w:hAnsi="Courier New"/>
+        </w:rPr>
+        <w:t xml:space="preserve">,</w:t>
+      </w:r>
+      <w:r>
+        <w:br/>
+      </w:r>
+      <w:r>
+        <w:rPr>
+          <w:color w:val="545664"/>
+          <w:sz w:val="23"/>
+          <w:szCs w:val="23"/>
+          <w:rFonts w:ascii="Courier New" w:cs="Courier New" w:eastAsia="Courier New" w:hAnsi="Courier New"/>
+        </w:rPr>
+        <w:t xml:space="preserve">    </w:t>
+      </w:r>
+      <w:r>
+        <w:rPr>
+          <w:color w:val="16a6ab"/>
+          <w:sz w:val="23"/>
+          <w:szCs w:val="23"/>
+          <w:rFonts w:ascii="Courier New" w:cs="Courier New" w:eastAsia="Courier New" w:hAnsi="Courier New"/>
+        </w:rPr>
+        <w:t xml:space="preserve">"serial"</w:t>
+      </w:r>
+      <w:r>
+        <w:rPr>
+          <w:color w:val="dd2c38"/>
+          <w:sz w:val="23"/>
+          <w:szCs w:val="23"/>
+          <w:rFonts w:ascii="Courier New" w:cs="Courier New" w:eastAsia="Courier New" w:hAnsi="Courier New"/>
+        </w:rPr>
+        <w:t xml:space="preserve">:</w:t>
+      </w:r>
+      <w:r>
+        <w:rPr>
+          <w:color w:val="545664"/>
+          <w:sz w:val="23"/>
+          <w:szCs w:val="23"/>
+          <w:rFonts w:ascii="Courier New" w:cs="Courier New" w:eastAsia="Courier New" w:hAnsi="Courier New"/>
+        </w:rPr>
+        <w:t xml:space="preserve"> </w:t>
+      </w:r>
+      <w:r>
+        <w:rPr>
+          <w:color w:val="545664"/>
+          <w:sz w:val="23"/>
+          <w:szCs w:val="23"/>
+          <w:rFonts w:ascii="Courier New" w:cs="Courier New" w:eastAsia="Courier New" w:hAnsi="Courier New"/>
+        </w:rPr>
+        <w:t xml:space="preserve">[</w:t>
+      </w:r>
+      <w:r>
+        <w:br/>
+      </w:r>
+      <w:r>
+        <w:rPr>
+          <w:color w:val="545664"/>
+          <w:sz w:val="23"/>
+          <w:szCs w:val="23"/>
+          <w:rFonts w:ascii="Courier New" w:cs="Courier New" w:eastAsia="Courier New" w:hAnsi="Courier New"/>
+        </w:rPr>
+        <w:t xml:space="preserve">      </w:t>
+      </w:r>
+      <w:r>
+        <w:rPr>
+          <w:color w:val="545664"/>
+          <w:sz w:val="23"/>
+          <w:szCs w:val="23"/>
+          <w:rFonts w:ascii="Courier New" w:cs="Courier New" w:eastAsia="Courier New" w:hAnsi="Courier New"/>
+        </w:rPr>
+        <w:t xml:space="preserve">{</w:t>
+      </w:r>
+      <w:r>
+        <w:br/>
+      </w:r>
+      <w:r>
+        <w:rPr>
+          <w:color w:val="545664"/>
+          <w:sz w:val="23"/>
+          <w:szCs w:val="23"/>
+          <w:rFonts w:ascii="Courier New" w:cs="Courier New" w:eastAsia="Courier New" w:hAnsi="Courier New"/>
+        </w:rPr>
+        <w:t xml:space="preserve">        </w:t>
+      </w:r>
+      <w:r>
+        <w:rPr>
+          <w:color w:val="16a6ab"/>
+          <w:sz w:val="23"/>
+          <w:szCs w:val="23"/>
+          <w:rFonts w:ascii="Courier New" w:cs="Courier New" w:eastAsia="Courier New" w:hAnsi="Courier New"/>
+        </w:rPr>
+        <w:t xml:space="preserve">"port"</w:t>
+      </w:r>
+      <w:r>
+        <w:rPr>
+          <w:color w:val="dd2c38"/>
+          <w:sz w:val="23"/>
+          <w:szCs w:val="23"/>
+          <w:rFonts w:ascii="Courier New" w:cs="Courier New" w:eastAsia="Courier New" w:hAnsi="Courier New"/>
+        </w:rPr>
+        <w:t xml:space="preserve">:</w:t>
+      </w:r>
+      <w:r>
+        <w:rPr>
+          <w:color w:val="545664"/>
+          <w:sz w:val="23"/>
+          <w:szCs w:val="23"/>
+          <w:rFonts w:ascii="Courier New" w:cs="Courier New" w:eastAsia="Courier New" w:hAnsi="Courier New"/>
+        </w:rPr>
+        <w:t xml:space="preserve"> </w:t>
+      </w:r>
+      <w:r>
+        <w:rPr>
+          <w:color w:val="1da51d"/>
+          <w:sz w:val="23"/>
+          <w:szCs w:val="23"/>
+          <w:rFonts w:ascii="Courier New" w:cs="Courier New" w:eastAsia="Courier New" w:hAnsi="Courier New"/>
+        </w:rPr>
+        <w:t xml:space="preserve">"/dev/ttyS0"</w:t>
+      </w:r>
+      <w:r>
+        <w:rPr>
+          <w:color w:val="545664"/>
+          <w:sz w:val="23"/>
+          <w:szCs w:val="23"/>
+          <w:rFonts w:ascii="Courier New" w:cs="Courier New" w:eastAsia="Courier New" w:hAnsi="Courier New"/>
+        </w:rPr>
+        <w:t xml:space="preserve">,</w:t>
+      </w:r>
+      <w:r>
+        <w:rPr>
+          <w:color w:val="545664"/>
+          <w:sz w:val="23"/>
+          <w:szCs w:val="23"/>
+          <w:rFonts w:ascii="Courier New" w:cs="Courier New" w:eastAsia="Courier New" w:hAnsi="Courier New"/>
+        </w:rPr>
+        <w:t xml:space="preserve"> </w:t>
+      </w:r>
+      <w:r>
+        <w:rPr>
+          <w:color w:val="16a6ab"/>
+          <w:sz w:val="23"/>
+          <w:szCs w:val="23"/>
+          <w:rFonts w:ascii="Courier New" w:cs="Courier New" w:eastAsia="Courier New" w:hAnsi="Courier New"/>
+        </w:rPr>
+        <w:t xml:space="preserve">"bauds"</w:t>
+      </w:r>
+      <w:r>
+        <w:rPr>
+          <w:color w:val="dd2c38"/>
+          <w:sz w:val="23"/>
+          <w:szCs w:val="23"/>
+          <w:rFonts w:ascii="Courier New" w:cs="Courier New" w:eastAsia="Courier New" w:hAnsi="Courier New"/>
+        </w:rPr>
+        <w:t xml:space="preserve">:</w:t>
+      </w:r>
+      <w:r>
+        <w:rPr>
+          <w:color w:val="545664"/>
+          <w:sz w:val="23"/>
+          <w:szCs w:val="23"/>
+          <w:rFonts w:ascii="Courier New" w:cs="Courier New" w:eastAsia="Courier New" w:hAnsi="Courier New"/>
+        </w:rPr>
+        <w:t xml:space="preserve"> </w:t>
+      </w:r>
+      <w:r>
+        <w:rPr>
+          <w:color w:val="8f47e1"/>
+          <w:sz w:val="23"/>
+          <w:szCs w:val="23"/>
+          <w:rFonts w:ascii="Courier New" w:cs="Courier New" w:eastAsia="Courier New" w:hAnsi="Courier New"/>
+        </w:rPr>
+        <w:t xml:space="preserve">9600</w:t>
+      </w:r>
+      <w:r>
+        <w:rPr>
+          <w:color w:val="545664"/>
+          <w:sz w:val="23"/>
+          <w:szCs w:val="23"/>
+          <w:rFonts w:ascii="Courier New" w:cs="Courier New" w:eastAsia="Courier New" w:hAnsi="Courier New"/>
+        </w:rPr>
+        <w:t xml:space="preserve">,</w:t>
+      </w:r>
+      <w:r>
+        <w:rPr>
+          <w:color w:val="545664"/>
+          <w:sz w:val="23"/>
+          <w:szCs w:val="23"/>
+          <w:rFonts w:ascii="Courier New" w:cs="Courier New" w:eastAsia="Courier New" w:hAnsi="Courier New"/>
+        </w:rPr>
+        <w:t xml:space="preserve"> </w:t>
+      </w:r>
+      <w:r>
+        <w:rPr>
+          <w:color w:val="16a6ab"/>
+          <w:sz w:val="23"/>
+          <w:szCs w:val="23"/>
+          <w:rFonts w:ascii="Courier New" w:cs="Courier New" w:eastAsia="Courier New" w:hAnsi="Courier New"/>
+        </w:rPr>
+        <w:t xml:space="preserve">"bits"</w:t>
+      </w:r>
+      <w:r>
+        <w:rPr>
+          <w:color w:val="dd2c38"/>
+          <w:sz w:val="23"/>
+          <w:szCs w:val="23"/>
+          <w:rFonts w:ascii="Courier New" w:cs="Courier New" w:eastAsia="Courier New" w:hAnsi="Courier New"/>
+        </w:rPr>
+        <w:t xml:space="preserve">:</w:t>
+      </w:r>
+      <w:r>
+        <w:rPr>
+          <w:color w:val="545664"/>
+          <w:sz w:val="23"/>
+          <w:szCs w:val="23"/>
+          <w:rFonts w:ascii="Courier New" w:cs="Courier New" w:eastAsia="Courier New" w:hAnsi="Courier New"/>
+        </w:rPr>
+        <w:t xml:space="preserve"> </w:t>
+      </w:r>
+      <w:r>
+        <w:rPr>
+          <w:color w:val="8f47e1"/>
+          <w:sz w:val="23"/>
+          <w:szCs w:val="23"/>
+          <w:rFonts w:ascii="Courier New" w:cs="Courier New" w:eastAsia="Courier New" w:hAnsi="Courier New"/>
+        </w:rPr>
+        <w:t xml:space="preserve">8</w:t>
+      </w:r>
+      <w:r>
+        <w:rPr>
+          <w:color w:val="545664"/>
+          <w:sz w:val="23"/>
+          <w:szCs w:val="23"/>
+          <w:rFonts w:ascii="Courier New" w:cs="Courier New" w:eastAsia="Courier New" w:hAnsi="Courier New"/>
+        </w:rPr>
+        <w:t xml:space="preserve">,</w:t>
+      </w:r>
+      <w:r>
+        <w:br/>
+      </w:r>
+      <w:r>
+        <w:rPr>
+          <w:color w:val="545664"/>
+          <w:sz w:val="23"/>
+          <w:szCs w:val="23"/>
+          <w:rFonts w:ascii="Courier New" w:cs="Courier New" w:eastAsia="Courier New" w:hAnsi="Courier New"/>
+        </w:rPr>
+        <w:t xml:space="preserve">        </w:t>
+      </w:r>
+      <w:r>
+        <w:rPr>
+          <w:color w:val="16a6ab"/>
+          <w:sz w:val="23"/>
+          <w:szCs w:val="23"/>
+          <w:rFonts w:ascii="Courier New" w:cs="Courier New" w:eastAsia="Courier New" w:hAnsi="Courier New"/>
+        </w:rPr>
+        <w:t xml:space="preserve">"parity"</w:t>
+      </w:r>
+      <w:r>
+        <w:rPr>
+          <w:color w:val="dd2c38"/>
+          <w:sz w:val="23"/>
+          <w:szCs w:val="23"/>
+          <w:rFonts w:ascii="Courier New" w:cs="Courier New" w:eastAsia="Courier New" w:hAnsi="Courier New"/>
+        </w:rPr>
+        <w:t xml:space="preserve">:</w:t>
+      </w:r>
+      <w:r>
+        <w:rPr>
+          <w:color w:val="545664"/>
+          <w:sz w:val="23"/>
+          <w:szCs w:val="23"/>
+          <w:rFonts w:ascii="Courier New" w:cs="Courier New" w:eastAsia="Courier New" w:hAnsi="Courier New"/>
+        </w:rPr>
+        <w:t xml:space="preserve"> </w:t>
+      </w:r>
+      <w:r>
+        <w:rPr>
+          <w:color w:val="1da51d"/>
+          <w:sz w:val="23"/>
+          <w:szCs w:val="23"/>
+          <w:rFonts w:ascii="Courier New" w:cs="Courier New" w:eastAsia="Courier New" w:hAnsi="Courier New"/>
+        </w:rPr>
+        <w:t xml:space="preserve">"N"</w:t>
+      </w:r>
+      <w:r>
+        <w:rPr>
+          <w:color w:val="545664"/>
+          <w:sz w:val="23"/>
+          <w:szCs w:val="23"/>
+          <w:rFonts w:ascii="Courier New" w:cs="Courier New" w:eastAsia="Courier New" w:hAnsi="Courier New"/>
+        </w:rPr>
+        <w:t xml:space="preserve">,</w:t>
+      </w:r>
+      <w:r>
+        <w:rPr>
+          <w:color w:val="545664"/>
+          <w:sz w:val="23"/>
+          <w:szCs w:val="23"/>
+          <w:rFonts w:ascii="Courier New" w:cs="Courier New" w:eastAsia="Courier New" w:hAnsi="Courier New"/>
+        </w:rPr>
+        <w:t xml:space="preserve"> </w:t>
+      </w:r>
+      <w:r>
+        <w:rPr>
+          <w:color w:val="16a6ab"/>
+          <w:sz w:val="23"/>
+          <w:szCs w:val="23"/>
+          <w:rFonts w:ascii="Courier New" w:cs="Courier New" w:eastAsia="Courier New" w:hAnsi="Courier New"/>
+        </w:rPr>
+        <w:t xml:space="preserve">"stops"</w:t>
+      </w:r>
+      <w:r>
+        <w:rPr>
+          <w:color w:val="dd2c38"/>
+          <w:sz w:val="23"/>
+          <w:szCs w:val="23"/>
+          <w:rFonts w:ascii="Courier New" w:cs="Courier New" w:eastAsia="Courier New" w:hAnsi="Courier New"/>
+        </w:rPr>
+        <w:t xml:space="preserve">:</w:t>
+      </w:r>
+      <w:r>
+        <w:rPr>
+          <w:color w:val="545664"/>
+          <w:sz w:val="23"/>
+          <w:szCs w:val="23"/>
+          <w:rFonts w:ascii="Courier New" w:cs="Courier New" w:eastAsia="Courier New" w:hAnsi="Courier New"/>
+        </w:rPr>
+        <w:t xml:space="preserve"> </w:t>
+      </w:r>
+      <w:r>
+        <w:rPr>
+          <w:color w:val="8f47e1"/>
+          <w:sz w:val="23"/>
+          <w:szCs w:val="23"/>
+          <w:rFonts w:ascii="Courier New" w:cs="Courier New" w:eastAsia="Courier New" w:hAnsi="Courier New"/>
+        </w:rPr>
+        <w:t xml:space="preserve">1</w:t>
+      </w:r>
+      <w:r>
+        <w:rPr>
+          <w:color w:val="545664"/>
+          <w:sz w:val="23"/>
+          <w:szCs w:val="23"/>
+          <w:rFonts w:ascii="Courier New" w:cs="Courier New" w:eastAsia="Courier New" w:hAnsi="Courier New"/>
+        </w:rPr>
+        <w:t xml:space="preserve">,</w:t>
+      </w:r>
+      <w:r>
+        <w:rPr>
+          <w:color w:val="545664"/>
+          <w:sz w:val="23"/>
+          <w:szCs w:val="23"/>
+          <w:rFonts w:ascii="Courier New" w:cs="Courier New" w:eastAsia="Courier New" w:hAnsi="Courier New"/>
+        </w:rPr>
+        <w:t xml:space="preserve"> </w:t>
+      </w:r>
+      <w:r>
+        <w:rPr>
+          <w:color w:val="16a6ab"/>
+          <w:sz w:val="23"/>
+          <w:szCs w:val="23"/>
+          <w:rFonts w:ascii="Courier New" w:cs="Courier New" w:eastAsia="Courier New" w:hAnsi="Courier New"/>
+        </w:rPr>
+        <w:t xml:space="preserve">"method"</w:t>
+      </w:r>
+      <w:r>
+        <w:rPr>
+          <w:color w:val="dd2c38"/>
+          <w:sz w:val="23"/>
+          <w:szCs w:val="23"/>
+          <w:rFonts w:ascii="Courier New" w:cs="Courier New" w:eastAsia="Courier New" w:hAnsi="Courier New"/>
+        </w:rPr>
+        <w:t xml:space="preserve">:</w:t>
+      </w:r>
+      <w:r>
+        <w:rPr>
+          <w:color w:val="545664"/>
+          <w:sz w:val="23"/>
+          <w:szCs w:val="23"/>
+          <w:rFonts w:ascii="Courier New" w:cs="Courier New" w:eastAsia="Courier New" w:hAnsi="Courier New"/>
+        </w:rPr>
+        <w:t xml:space="preserve"> </w:t>
+      </w:r>
+      <w:r>
+        <w:rPr>
+          <w:color w:val="1da51d"/>
+          <w:sz w:val="23"/>
+          <w:szCs w:val="23"/>
+          <w:rFonts w:ascii="Courier New" w:cs="Courier New" w:eastAsia="Courier New" w:hAnsi="Courier New"/>
+        </w:rPr>
+        <w:t xml:space="preserve">"rtu"</w:t>
+      </w:r>
+      <w:r>
+        <w:rPr>
+          <w:color w:val="545664"/>
+          <w:sz w:val="23"/>
+          <w:szCs w:val="23"/>
+          <w:rFonts w:ascii="Courier New" w:cs="Courier New" w:eastAsia="Courier New" w:hAnsi="Courier New"/>
+        </w:rPr>
+        <w:t xml:space="preserve">,</w:t>
+      </w:r>
+      <w:r>
+        <w:br/>
+      </w:r>
+      <w:r>
+        <w:rPr>
+          <w:color w:val="545664"/>
+          <w:sz w:val="23"/>
+          <w:szCs w:val="23"/>
+          <w:rFonts w:ascii="Courier New" w:cs="Courier New" w:eastAsia="Courier New" w:hAnsi="Courier New"/>
+        </w:rPr>
+        <w:t xml:space="preserve">        </w:t>
+      </w:r>
+      <w:r>
+        <w:rPr>
+          <w:color w:val="16a6ab"/>
+          <w:sz w:val="23"/>
+          <w:szCs w:val="23"/>
+          <w:rFonts w:ascii="Courier New" w:cs="Courier New" w:eastAsia="Courier New" w:hAnsi="Courier New"/>
+        </w:rPr>
+        <w:t xml:space="preserve">"timeout"</w:t>
+      </w:r>
+      <w:r>
+        <w:rPr>
+          <w:color w:val="dd2c38"/>
+          <w:sz w:val="23"/>
+          <w:szCs w:val="23"/>
+          <w:rFonts w:ascii="Courier New" w:cs="Courier New" w:eastAsia="Courier New" w:hAnsi="Courier New"/>
+        </w:rPr>
+        <w:t xml:space="preserve">:</w:t>
+      </w:r>
+      <w:r>
+        <w:rPr>
+          <w:color w:val="545664"/>
+          <w:sz w:val="23"/>
+          <w:szCs w:val="23"/>
+          <w:rFonts w:ascii="Courier New" w:cs="Courier New" w:eastAsia="Courier New" w:hAnsi="Courier New"/>
+        </w:rPr>
+        <w:t xml:space="preserve"> </w:t>
+      </w:r>
+      <w:r>
+        <w:rPr>
+          <w:color w:val="8f47e1"/>
+          <w:sz w:val="23"/>
+          <w:szCs w:val="23"/>
+          <w:rFonts w:ascii="Courier New" w:cs="Courier New" w:eastAsia="Courier New" w:hAnsi="Courier New"/>
+        </w:rPr>
+        <w:t xml:space="preserve">0.15</w:t>
+      </w:r>
+      <w:r>
+        <w:rPr>
+          <w:color w:val="545664"/>
+          <w:sz w:val="23"/>
+          <w:szCs w:val="23"/>
+          <w:rFonts w:ascii="Courier New" w:cs="Courier New" w:eastAsia="Courier New" w:hAnsi="Courier New"/>
+        </w:rPr>
+        <w:t xml:space="preserve">,</w:t>
+      </w:r>
+      <w:r>
+        <w:rPr>
+          <w:color w:val="545664"/>
+          <w:sz w:val="23"/>
+          <w:szCs w:val="23"/>
+          <w:rFonts w:ascii="Courier New" w:cs="Courier New" w:eastAsia="Courier New" w:hAnsi="Courier New"/>
+        </w:rPr>
+        <w:t xml:space="preserve"> </w:t>
+      </w:r>
+      <w:r>
+        <w:rPr>
+          <w:color w:val="16a6ab"/>
+          <w:sz w:val="23"/>
+          <w:szCs w:val="23"/>
+          <w:rFonts w:ascii="Courier New" w:cs="Courier New" w:eastAsia="Courier New" w:hAnsi="Courier New"/>
+        </w:rPr>
+        <w:t xml:space="preserve">"enabled"</w:t>
+      </w:r>
+      <w:r>
+        <w:rPr>
+          <w:color w:val="dd2c38"/>
+          <w:sz w:val="23"/>
+          <w:szCs w:val="23"/>
+          <w:rFonts w:ascii="Courier New" w:cs="Courier New" w:eastAsia="Courier New" w:hAnsi="Courier New"/>
+        </w:rPr>
+        <w:t xml:space="preserve">:</w:t>
+      </w:r>
+      <w:r>
+        <w:rPr>
+          <w:color w:val="545664"/>
+          <w:sz w:val="23"/>
+          <w:szCs w:val="23"/>
+          <w:rFonts w:ascii="Courier New" w:cs="Courier New" w:eastAsia="Courier New" w:hAnsi="Courier New"/>
+        </w:rPr>
+        <w:t xml:space="preserve"> </w:t>
+      </w:r>
+      <w:r>
+        <w:rPr>
+          <w:color w:val="8f47e1"/>
+          <w:sz w:val="23"/>
+          <w:szCs w:val="23"/>
+          <w:rFonts w:ascii="Courier New" w:cs="Courier New" w:eastAsia="Courier New" w:hAnsi="Courier New"/>
+        </w:rPr>
+        <w:t xml:space="preserve">false</w:t>
+      </w:r>
+      <w:r>
+        <w:br/>
+      </w:r>
+      <w:r>
+        <w:rPr>
+          <w:color w:val="545664"/>
+          <w:sz w:val="23"/>
+          <w:szCs w:val="23"/>
+          <w:rFonts w:ascii="Courier New" w:cs="Courier New" w:eastAsia="Courier New" w:hAnsi="Courier New"/>
+        </w:rPr>
+        <w:t xml:space="preserve">      </w:t>
+      </w:r>
+      <w:r>
+        <w:rPr>
+          <w:color w:val="545664"/>
+          <w:sz w:val="23"/>
+          <w:szCs w:val="23"/>
+          <w:rFonts w:ascii="Courier New" w:cs="Courier New" w:eastAsia="Courier New" w:hAnsi="Courier New"/>
+        </w:rPr>
+        <w:t xml:space="preserve">}</w:t>
+      </w:r>
+      <w:r>
+        <w:br/>
+      </w:r>
+      <w:r>
+        <w:rPr>
+          <w:color w:val="545664"/>
+          <w:sz w:val="23"/>
+          <w:szCs w:val="23"/>
+          <w:rFonts w:ascii="Courier New" w:cs="Courier New" w:eastAsia="Courier New" w:hAnsi="Courier New"/>
+        </w:rPr>
+        <w:t xml:space="preserve">    </w:t>
+      </w:r>
+      <w:r>
+        <w:rPr>
+          <w:color w:val="545664"/>
+          <w:sz w:val="23"/>
+          <w:szCs w:val="23"/>
+          <w:rFonts w:ascii="Courier New" w:cs="Courier New" w:eastAsia="Courier New" w:hAnsi="Courier New"/>
+        </w:rPr>
+        <w:t xml:space="preserve">]</w:t>
+      </w:r>
+      <w:r>
+        <w:rPr>
+          <w:color w:val="545664"/>
+          <w:sz w:val="23"/>
+          <w:szCs w:val="23"/>
+          <w:rFonts w:ascii="Courier New" w:cs="Courier New" w:eastAsia="Courier New" w:hAnsi="Courier New"/>
+        </w:rPr>
+        <w:t xml:space="preserve">,</w:t>
+      </w:r>
+      <w:r>
+        <w:br/>
+      </w:r>
+      <w:r>
+        <w:rPr>
+          <w:color w:val="545664"/>
+          <w:sz w:val="23"/>
+          <w:szCs w:val="23"/>
+          <w:rFonts w:ascii="Courier New" w:cs="Courier New" w:eastAsia="Courier New" w:hAnsi="Courier New"/>
+        </w:rPr>
+        <w:t xml:space="preserve">    </w:t>
+      </w:r>
+      <w:r>
+        <w:rPr>
+          <w:color w:val="16a6ab"/>
+          <w:sz w:val="23"/>
+          <w:szCs w:val="23"/>
+          <w:rFonts w:ascii="Courier New" w:cs="Courier New" w:eastAsia="Courier New" w:hAnsi="Courier New"/>
+        </w:rPr>
+        <w:t xml:space="preserve">"zmq_command_port"</w:t>
+      </w:r>
+      <w:r>
+        <w:rPr>
+          <w:color w:val="dd2c38"/>
+          <w:sz w:val="23"/>
+          <w:szCs w:val="23"/>
+          <w:rFonts w:ascii="Courier New" w:cs="Courier New" w:eastAsia="Courier New" w:hAnsi="Courier New"/>
+        </w:rPr>
+        <w:t xml:space="preserve">:</w:t>
+      </w:r>
+      <w:r>
+        <w:rPr>
+          <w:color w:val="545664"/>
+          <w:sz w:val="23"/>
+          <w:szCs w:val="23"/>
+          <w:rFonts w:ascii="Courier New" w:cs="Courier New" w:eastAsia="Courier New" w:hAnsi="Courier New"/>
+        </w:rPr>
+        <w:t xml:space="preserve"> </w:t>
+      </w:r>
+      <w:r>
+        <w:rPr>
+          <w:color w:val="8f47e1"/>
+          <w:sz w:val="23"/>
+          <w:szCs w:val="23"/>
+          <w:rFonts w:ascii="Courier New" w:cs="Courier New" w:eastAsia="Courier New" w:hAnsi="Courier New"/>
+        </w:rPr>
+        <w:t xml:space="preserve">5557</w:t>
+      </w:r>
+      <w:r>
+        <w:rPr>
+          <w:color w:val="545664"/>
+          <w:sz w:val="23"/>
+          <w:szCs w:val="23"/>
+          <w:rFonts w:ascii="Courier New" w:cs="Courier New" w:eastAsia="Courier New" w:hAnsi="Courier New"/>
+        </w:rPr>
+        <w:t xml:space="preserve">,</w:t>
+      </w:r>
+      <w:r>
+        <w:br/>
+      </w:r>
+      <w:r>
+        <w:rPr>
+          <w:color w:val="545664"/>
+          <w:sz w:val="23"/>
+          <w:szCs w:val="23"/>
+          <w:rFonts w:ascii="Courier New" w:cs="Courier New" w:eastAsia="Courier New" w:hAnsi="Courier New"/>
+        </w:rPr>
+        <w:t xml:space="preserve">    </w:t>
+      </w:r>
+      <w:r>
+        <w:rPr>
+          <w:color w:val="16a6ab"/>
+          <w:sz w:val="23"/>
+          <w:szCs w:val="23"/>
+          <w:rFonts w:ascii="Courier New" w:cs="Courier New" w:eastAsia="Courier New" w:hAnsi="Courier New"/>
+        </w:rPr>
+        <w:t xml:space="preserve">"zmq_data_port"</w:t>
+      </w:r>
+      <w:r>
+        <w:rPr>
+          <w:color w:val="dd2c38"/>
+          <w:sz w:val="23"/>
+          <w:szCs w:val="23"/>
+          <w:rFonts w:ascii="Courier New" w:cs="Courier New" w:eastAsia="Courier New" w:hAnsi="Courier New"/>
+        </w:rPr>
+        <w:t xml:space="preserve">:</w:t>
+      </w:r>
+      <w:r>
+        <w:rPr>
+          <w:color w:val="545664"/>
+          <w:sz w:val="23"/>
+          <w:szCs w:val="23"/>
+          <w:rFonts w:ascii="Courier New" w:cs="Courier New" w:eastAsia="Courier New" w:hAnsi="Courier New"/>
+        </w:rPr>
+        <w:t xml:space="preserve"> </w:t>
+      </w:r>
+      <w:r>
+        <w:rPr>
+          <w:color w:val="8f47e1"/>
+          <w:sz w:val="23"/>
+          <w:szCs w:val="23"/>
+          <w:rFonts w:ascii="Courier New" w:cs="Courier New" w:eastAsia="Courier New" w:hAnsi="Courier New"/>
+        </w:rPr>
+        <w:t xml:space="preserve">5556</w:t>
+      </w:r>
+      <w:r>
+        <w:rPr>
+          <w:color w:val="545664"/>
+          <w:sz w:val="23"/>
+          <w:szCs w:val="23"/>
+          <w:rFonts w:ascii="Courier New" w:cs="Courier New" w:eastAsia="Courier New" w:hAnsi="Courier New"/>
+        </w:rPr>
+        <w:t xml:space="preserve">,</w:t>
+      </w:r>
+      <w:r>
+        <w:br/>
+      </w:r>
+      <w:r>
+        <w:rPr>
+          <w:color w:val="545664"/>
+          <w:sz w:val="23"/>
+          <w:szCs w:val="23"/>
+          <w:rFonts w:ascii="Courier New" w:cs="Courier New" w:eastAsia="Courier New" w:hAnsi="Courier New"/>
+        </w:rPr>
+        <w:t xml:space="preserve">    </w:t>
+      </w:r>
+      <w:r>
+        <w:rPr>
+          <w:color w:val="16a6ab"/>
+          <w:sz w:val="23"/>
+          <w:szCs w:val="23"/>
+          <w:rFonts w:ascii="Courier New" w:cs="Courier New" w:eastAsia="Courier New" w:hAnsi="Courier New"/>
+        </w:rPr>
+        <w:t xml:space="preserve">"zmq_ip"</w:t>
+      </w:r>
+      <w:r>
+        <w:rPr>
+          <w:color w:val="dd2c38"/>
+          <w:sz w:val="23"/>
+          <w:szCs w:val="23"/>
+          <w:rFonts w:ascii="Courier New" w:cs="Courier New" w:eastAsia="Courier New" w:hAnsi="Courier New"/>
+        </w:rPr>
+        <w:t xml:space="preserve">:</w:t>
+      </w:r>
+      <w:r>
+        <w:rPr>
+          <w:color w:val="545664"/>
+          <w:sz w:val="23"/>
+          <w:szCs w:val="23"/>
+          <w:rFonts w:ascii="Courier New" w:cs="Courier New" w:eastAsia="Courier New" w:hAnsi="Courier New"/>
+        </w:rPr>
+        <w:t xml:space="preserve"> </w:t>
+      </w:r>
+      <w:r>
+        <w:rPr>
+          <w:color w:val="1da51d"/>
+          <w:sz w:val="23"/>
+          <w:szCs w:val="23"/>
+          <w:rFonts w:ascii="Courier New" w:cs="Courier New" w:eastAsia="Courier New" w:hAnsi="Courier New"/>
+        </w:rPr>
+        <w:t xml:space="preserve">"localhost"</w:t>
+      </w:r>
+      <w:r>
+        <w:br/>
+      </w:r>
+      <w:r>
+        <w:rPr>
+          <w:color w:val="545664"/>
+          <w:sz w:val="23"/>
+          <w:szCs w:val="23"/>
+          <w:rFonts w:ascii="Courier New" w:cs="Courier New" w:eastAsia="Courier New" w:hAnsi="Courier New"/>
+        </w:rPr>
+        <w:t xml:space="preserve">  </w:t>
+      </w:r>
+      <w:r>
+        <w:rPr>
+          <w:color w:val="545664"/>
+          <w:sz w:val="23"/>
+          <w:szCs w:val="23"/>
+          <w:rFonts w:ascii="Courier New" w:cs="Courier New" w:eastAsia="Courier New" w:hAnsi="Courier New"/>
+        </w:rPr>
+        <w:t xml:space="preserve">}</w:t>
+      </w:r>
+      <w:r>
+        <w:br/>
+      </w:r>
+      <w:r>
+        <w:rPr>
+          <w:color w:val="545664"/>
+          <w:sz w:val="23"/>
+          <w:szCs w:val="23"/>
+          <w:rFonts w:ascii="Courier New" w:cs="Courier New" w:eastAsia="Courier New" w:hAnsi="Courier New"/>
+        </w:rPr>
+        <w:t xml:space="preserve">}</w:t>
+      </w:r>
+      <w:r>
+        <w:br/>
       </w:r>
     </w:p>
     <w:p/>

</xml_diff>

<commit_message>
vault backup: 2026-06-18 10:01:35, Nombre de fichiers envoyés : 3, Fichiers envoyés : M .obsidian/workspace.json Projets/En cours/Apix Analytics/.~lock.Rapport de stage.docx# Projets/En cours/Apix Analytics/Rapport de stage.docx
</commit_message>
<xml_diff>
--- a/Projets/En cours/Apix Analytics/Rapport de stage.docx
+++ b/Projets/En cours/Apix Analytics/Rapport de stage.docx
@@ -1496,6 +1496,18 @@
       </w:pPr>
       <w:r>
         <w:rPr/>
+      </w:r>
+      <w:r>
+        <w:br w:type="page"/>
+      </w:r>
+    </w:p>
+    <w:p>
+      <w:pPr>
+        <w:pStyle w:val="Heading1"/>
+        <w:rPr/>
+      </w:pPr>
+      <w:r>
+        <w:rPr/>
         <w:t>I. Présentation de l'entreprise</w:t>
       </w:r>
     </w:p>
@@ -2773,28 +2785,12 @@
     </w:p>
     <w:p>
       <w:pPr>
-        <w:pStyle w:val="Normal"/>
-        <w:rPr>
-          <w:color w:val="000000"/>
-          <w:sz w:val="24"/>
-          <w:szCs w:val="24"/>
-        </w:rPr>
-      </w:pPr>
-      <w:r>
-        <w:rPr>
-          <w:color w:val="000000"/>
-          <w:sz w:val="24"/>
-          <w:szCs w:val="24"/>
-        </w:rPr>
-      </w:r>
-    </w:p>
-    <w:p>
-      <w:pPr>
         <w:pStyle w:val="Heading1"/>
         <w:rPr/>
       </w:pPr>
       <w:r>
         <w:rPr/>
+        <w:br/>
         <w:t>II. Contexte et enjeux du projet</w:t>
       </w:r>
     </w:p>
@@ -4271,6 +4267,18 @@
           <w:sz w:val="24"/>
           <w:szCs w:val="24"/>
         </w:rPr>
+      </w:r>
+    </w:p>
+    <w:p>
+      <w:pPr>
+        <w:pStyle w:val="Heading1"/>
+        <w:rPr/>
+      </w:pPr>
+      <w:r>
+        <w:rPr/>
+      </w:r>
+      <w:r>
+        <w:br w:type="page"/>
       </w:r>
     </w:p>
     <w:p>
@@ -13033,6 +13041,18 @@
       </w:pPr>
       <w:r>
         <w:rPr/>
+      </w:r>
+      <w:r>
+        <w:br w:type="page"/>
+      </w:r>
+    </w:p>
+    <w:p>
+      <w:pPr>
+        <w:pStyle w:val="Heading3"/>
+        <w:rPr/>
+      </w:pPr>
+      <w:r>
+        <w:rPr/>
         <w:t>a. L'environnement de production</w:t>
       </w:r>
     </w:p>
@@ -15767,6 +15787,18 @@
       </w:pPr>
       <w:r>
         <w:rPr/>
+      </w:r>
+      <w:r>
+        <w:br w:type="page"/>
+      </w:r>
+    </w:p>
+    <w:p>
+      <w:pPr>
+        <w:pStyle w:val="Heading1"/>
+        <w:rPr/>
+      </w:pPr>
+      <w:r>
+        <w:rPr/>
         <w:t>V. Impact environnemental et sociétal</w:t>
       </w:r>
     </w:p>
@@ -16423,6 +16455,18 @@
           <w:sz w:val="24"/>
           <w:szCs w:val="24"/>
         </w:rPr>
+      </w:r>
+    </w:p>
+    <w:p>
+      <w:pPr>
+        <w:pStyle w:val="Heading1"/>
+        <w:rPr/>
+      </w:pPr>
+      <w:r>
+        <w:rPr/>
+      </w:r>
+      <w:r>
+        <w:br w:type="page"/>
       </w:r>
     </w:p>
     <w:p>
@@ -20624,10 +20668,6 @@
       <w:jc w:val="center"/>
       <w:rPr/>
     </w:pPr>
-    <w:r>
-      <w:rPr/>
-      <w:t>36</w:t>
-    </w:r>
     <w:bookmarkStart w:id="0" w:name="PageNumWizard_FOOTER_Style_de_page_par_d"/>
     <w:r>
       <w:rPr/>
@@ -20643,7 +20683,7 @@
     </w:r>
     <w:r>
       <w:rPr/>
-      <w:t>36</w:t>
+      <w:t>38</w:t>
     </w:r>
     <w:r>
       <w:rPr/>
@@ -20671,7 +20711,7 @@
     </w:r>
     <w:r>
       <w:rPr/>
-      <w:t>36</w:t>
+      <w:t>38</w:t>
     </w:r>
     <w:r>
       <w:rPr/>

</xml_diff>